<commit_message>
Doc (rapport) : requêtes executées
Ajout des requêtes LOAD DATA exécutées dans le rapport.
4 requêtes pour les tables suivantes :
client, adresse, livreur, produit (ou article)
</commit_message>
<xml_diff>
--- a/R106-JonJunod-ThanosPizza.docx
+++ b/R106-JonJunod-ThanosPizza.docx
@@ -1,6 +1,6 @@
 
 <file path=word/document.xml><?xml version="1.0" encoding="utf-8"?>
-<w:document xmlns:wpc="http://schemas.microsoft.com/office/word/2010/wordprocessingCanvas" xmlns:cx="http://schemas.microsoft.com/office/drawing/2014/chartex" xmlns:cx1="http://schemas.microsoft.com/office/drawing/2015/9/8/chartex" xmlns:cx2="http://schemas.microsoft.com/office/drawing/2015/10/21/chartex" xmlns:cx3="http://schemas.microsoft.com/office/drawing/2016/5/9/chartex" xmlns:cx4="http://schemas.microsoft.com/office/drawing/2016/5/10/chartex" xmlns:cx5="http://schemas.microsoft.com/office/drawing/2016/5/11/chartex" xmlns:cx6="http://schemas.microsoft.com/office/drawing/2016/5/12/chartex" xmlns:cx7="http://schemas.microsoft.com/office/drawing/2016/5/13/chartex" xmlns:cx8="http://schemas.microsoft.com/office/drawing/2016/5/14/chartex" xmlns:mc="http://schemas.openxmlformats.org/markup-compatibility/2006" xmlns:aink="http://schemas.microsoft.com/office/drawing/2016/ink" xmlns:am3d="http://schemas.microsoft.com/office/drawing/2017/model3d" xmlns:o="urn:schemas-microsoft-com:office:office" xmlns:oel="http://schemas.microsoft.com/office/2019/extlst" xmlns:r="http://schemas.openxmlformats.org/officeDocument/2006/relationships" xmlns:m="http://schemas.openxmlformats.org/officeDocument/2006/math" xmlns:v="urn:schemas-microsoft-com:vml" xmlns:wp14="http://schemas.microsoft.com/office/word/2010/wordprocessingDrawing" xmlns:wp="http://schemas.openxmlformats.org/drawingml/2006/wordprocessingDrawing" xmlns:w10="urn:schemas-microsoft-com:office:word" xmlns:w="http://schemas.openxmlformats.org/wordprocessingml/2006/main" xmlns:w14="http://schemas.microsoft.com/office/word/2010/wordml" xmlns:w15="http://schemas.microsoft.com/office/word/2012/wordml" xmlns:w16cex="http://schemas.microsoft.com/office/word/2018/wordml/cex" xmlns:w16cid="http://schemas.microsoft.com/office/word/2016/wordml/cid" xmlns:w16="http://schemas.microsoft.com/office/word/2018/wordml" xmlns:w16sdtdh="http://schemas.microsoft.com/office/word/2020/wordml/sdtdatahash" xmlns:w16se="http://schemas.microsoft.com/office/word/2015/wordml/symex" xmlns:wpg="http://schemas.microsoft.com/office/word/2010/wordprocessingGroup" xmlns:wpi="http://schemas.microsoft.com/office/word/2010/wordprocessingInk" xmlns:wne="http://schemas.microsoft.com/office/word/2006/wordml" xmlns:wps="http://schemas.microsoft.com/office/word/2010/wordprocessingShape" mc:Ignorable="w14 w15 w16se w16cid w16 w16cex w16sdtdh wp14">
+<w:document xmlns:wpc="http://schemas.microsoft.com/office/word/2010/wordprocessingCanvas" xmlns:cx="http://schemas.microsoft.com/office/drawing/2014/chartex" xmlns:cx1="http://schemas.microsoft.com/office/drawing/2015/9/8/chartex" xmlns:cx2="http://schemas.microsoft.com/office/drawing/2015/10/21/chartex" xmlns:cx3="http://schemas.microsoft.com/office/drawing/2016/5/9/chartex" xmlns:cx4="http://schemas.microsoft.com/office/drawing/2016/5/10/chartex" xmlns:cx5="http://schemas.microsoft.com/office/drawing/2016/5/11/chartex" xmlns:cx6="http://schemas.microsoft.com/office/drawing/2016/5/12/chartex" xmlns:cx7="http://schemas.microsoft.com/office/drawing/2016/5/13/chartex" xmlns:cx8="http://schemas.microsoft.com/office/drawing/2016/5/14/chartex" xmlns:mc="http://schemas.openxmlformats.org/markup-compatibility/2006" xmlns:aink="http://schemas.microsoft.com/office/drawing/2016/ink" xmlns:am3d="http://schemas.microsoft.com/office/drawing/2017/model3d" xmlns:o="urn:schemas-microsoft-com:office:office" xmlns:oel="http://schemas.microsoft.com/office/2019/extlst" xmlns:r="http://schemas.openxmlformats.org/officeDocument/2006/relationships" xmlns:m="http://schemas.openxmlformats.org/officeDocument/2006/math" xmlns:v="urn:schemas-microsoft-com:vml" xmlns:wp14="http://schemas.microsoft.com/office/word/2010/wordprocessingDrawing" xmlns:wp="http://schemas.openxmlformats.org/drawingml/2006/wordprocessingDrawing" xmlns:w10="urn:schemas-microsoft-com:office:word" xmlns:w="http://schemas.openxmlformats.org/wordprocessingml/2006/main" xmlns:w14="http://schemas.microsoft.com/office/word/2010/wordml" xmlns:w15="http://schemas.microsoft.com/office/word/2012/wordml" xmlns:w16cex="http://schemas.microsoft.com/office/word/2018/wordml/cex" xmlns:w16cid="http://schemas.microsoft.com/office/word/2016/wordml/cid" xmlns:w16="http://schemas.microsoft.com/office/word/2018/wordml" xmlns:w16du="http://schemas.microsoft.com/office/word/2023/wordml/word16du" xmlns:w16sdtdh="http://schemas.microsoft.com/office/word/2020/wordml/sdtdatahash" xmlns:w16sdtfl="http://schemas.microsoft.com/office/word/2024/wordml/sdtformatlock" xmlns:w16se="http://schemas.microsoft.com/office/word/2015/wordml/symex" xmlns:wpg="http://schemas.microsoft.com/office/word/2010/wordprocessingGroup" xmlns:wpi="http://schemas.microsoft.com/office/word/2010/wordprocessingInk" xmlns:wne="http://schemas.microsoft.com/office/word/2006/wordml" xmlns:wps="http://schemas.microsoft.com/office/word/2010/wordprocessingShape" mc:Ignorable="w14 w15 w16se w16cid w16 w16cex w16sdtdh w16sdtfl w16du wp14">
   <w:body>
     <w:p>
       <w:pPr>
@@ -678,6 +678,15 @@
       <w:pPr>
         <w:pStyle w:val="Titre2"/>
       </w:pPr>
+      <w:r>
+        <w:t>Rappel sur la configuration de docker</w:t>
+      </w:r>
+    </w:p>
+    <w:p/>
+    <w:p>
+      <w:pPr>
+        <w:pStyle w:val="Titre2"/>
+      </w:pPr>
       <w:bookmarkStart w:id="1" w:name="_Toc210392958"/>
       <w:r>
         <w:t>Chargement des données</w:t>
@@ -698,7 +707,7 @@
         <w:t>s</w:t>
       </w:r>
       <w:r>
-        <w:t xml:space="preserve"> .tsv</w:t>
+        <w:t>.tsv</w:t>
       </w:r>
       <w:r>
         <w:t>,</w:t>
@@ -716,30 +725,30 @@
         <w:t>de</w:t>
       </w:r>
       <w:r>
-        <w:t xml:space="preserve"> ficher</w:t>
+        <w:t xml:space="preserve"> </w:t>
+      </w:r>
+      <w:r>
+        <w:t>fichiers</w:t>
+      </w:r>
+      <w:r>
+        <w:t xml:space="preserve"> .csv mais </w:t>
+      </w:r>
+      <w:r>
+        <w:t>utilisant</w:t>
+      </w:r>
+      <w:r>
+        <w:t xml:space="preserve"> des tabulations à la place des virgules afin de séparer les données. Ce</w:t>
       </w:r>
       <w:r>
         <w:t>s</w:t>
       </w:r>
       <w:r>
-        <w:t xml:space="preserve"> .csv mais </w:t>
-      </w:r>
-      <w:r>
-        <w:t>utilisant</w:t>
-      </w:r>
-      <w:r>
-        <w:t xml:space="preserve"> des tabulations à la place des virgules afin de séparer les données. Ce</w:t>
+        <w:t xml:space="preserve"> fichier</w:t>
       </w:r>
       <w:r>
         <w:t>s</w:t>
       </w:r>
       <w:r>
-        <w:t xml:space="preserve"> fichier</w:t>
-      </w:r>
-      <w:r>
-        <w:t>s</w:t>
-      </w:r>
-      <w:r>
         <w:t xml:space="preserve"> contien</w:t>
       </w:r>
       <w:r>
@@ -751,19 +760,431 @@
     </w:p>
     <w:p>
       <w:r>
-        <w:t xml:space="preserve">Premier pas : créer la structure de la base de données. Facile il suffit de copier-coller le script LDD de Looping, après avoir ajouté l’énoncé CREATE-USE database manuellement, vers un fichier texte. Il faut ensuite placer le fichier texte dans le </w:t>
-      </w:r>
-      <w:r>
         <w:lastRenderedPageBreak/>
-        <w:t>répertoire scripts de docker et l’importer à l’aide de la commande suivante à jouer dans la console “</w:t>
-      </w:r>
-      <w:r>
-        <w:t>mysql -u root -proot &lt; ./scripts/script_creation.sql</w:t>
+        <w:t>Premier pas : créer la structure de la base de données. Facile il suffit de copier-coller le script LDD de Looping, après avoir ajouté l’énoncé CREATE-USE database manuellement, vers un fichier texte. Il faut ensuite placer le fichier texte dans le répertoire scripts de docker et l’importer à l’aide de la commande suivante à jouer dans la console “</w:t>
+      </w:r>
+      <w:r>
+        <w:t xml:space="preserve">mysql -u root -proot &lt; </w:t>
+      </w:r>
+      <w:r>
+        <w:t>/var/lib/mysql-files</w:t>
+      </w:r>
+      <w:r>
+        <w:t>/script_creation.sql</w:t>
       </w:r>
       <w:r>
         <w:t xml:space="preserve">”. </w:t>
       </w:r>
     </w:p>
+    <w:p>
+      <w:r>
+        <w:t>Nous voilà à l’étape du chargement des données</w:t>
+      </w:r>
+    </w:p>
+    <w:p>
+      <w:pPr>
+        <w:rPr>
+          <w:lang w:val="en-US"/>
+        </w:rPr>
+      </w:pPr>
+      <w:r>
+        <w:rPr>
+          <w:lang w:val="en-US"/>
+        </w:rPr>
+        <w:t>LOAD DATA INFILE '</w:t>
+      </w:r>
+      <w:r>
+        <w:rPr>
+          <w:lang w:val="en-US"/>
+        </w:rPr>
+        <w:t>/var/lib/mysql-files/t_article.tsv</w:t>
+      </w:r>
+      <w:r>
+        <w:rPr>
+          <w:lang w:val="en-US"/>
+        </w:rPr>
+        <w:t xml:space="preserve">' </w:t>
+      </w:r>
+    </w:p>
+    <w:p>
+      <w:pPr>
+        <w:rPr>
+          <w:lang w:val="en-US"/>
+        </w:rPr>
+      </w:pPr>
+      <w:r>
+        <w:rPr>
+          <w:lang w:val="en-US"/>
+        </w:rPr>
+        <w:tab/>
+        <w:t>INTO TABLE t_</w:t>
+      </w:r>
+      <w:r>
+        <w:rPr>
+          <w:lang w:val="en-US"/>
+        </w:rPr>
+        <w:t>produit</w:t>
+      </w:r>
+    </w:p>
+    <w:p>
+      <w:pPr>
+        <w:rPr>
+          <w:lang w:val="en-US"/>
+        </w:rPr>
+      </w:pPr>
+      <w:r>
+        <w:rPr>
+          <w:lang w:val="en-US"/>
+        </w:rPr>
+        <w:tab/>
+        <w:t xml:space="preserve">CHARACTER SET </w:t>
+      </w:r>
+      <w:r>
+        <w:rPr>
+          <w:lang w:val="en-US"/>
+        </w:rPr>
+        <w:t>UTF8</w:t>
+      </w:r>
+    </w:p>
+    <w:p>
+      <w:pPr>
+        <w:rPr>
+          <w:lang w:val="en-US"/>
+        </w:rPr>
+      </w:pPr>
+      <w:r>
+        <w:rPr>
+          <w:lang w:val="en-US"/>
+        </w:rPr>
+        <w:tab/>
+        <w:t>COLUMNS TERMINATED BY '</w:t>
+      </w:r>
+      <w:r>
+        <w:rPr>
+          <w:lang w:val="en-US"/>
+        </w:rPr>
+        <w:tab/>
+      </w:r>
+      <w:r>
+        <w:rPr>
+          <w:lang w:val="en-US"/>
+        </w:rPr>
+        <w:t>'</w:t>
+      </w:r>
+    </w:p>
+    <w:p>
+      <w:r>
+        <w:rPr>
+          <w:lang w:val="en-US"/>
+        </w:rPr>
+        <w:tab/>
+      </w:r>
+      <w:r>
+        <w:t>IGNORE 1 LINES;</w:t>
+      </w:r>
+    </w:p>
+    <w:p/>
+    <w:p>
+      <w:r>
+        <w:t>LOAD DATA INFILE '/var/lib/mysql-files/t_</w:t>
+      </w:r>
+      <w:r>
+        <w:t>livreur</w:t>
+      </w:r>
+      <w:r>
+        <w:t xml:space="preserve">.tsv' </w:t>
+      </w:r>
+    </w:p>
+    <w:p>
+      <w:pPr>
+        <w:rPr>
+          <w:lang w:val="en-US"/>
+        </w:rPr>
+      </w:pPr>
+      <w:r>
+        <w:tab/>
+      </w:r>
+      <w:r>
+        <w:rPr>
+          <w:lang w:val="en-US"/>
+        </w:rPr>
+        <w:t>INTO TABLE t_</w:t>
+      </w:r>
+      <w:r>
+        <w:rPr>
+          <w:lang w:val="en-US"/>
+        </w:rPr>
+        <w:t>livreur</w:t>
+      </w:r>
+    </w:p>
+    <w:p>
+      <w:pPr>
+        <w:rPr>
+          <w:lang w:val="en-US"/>
+        </w:rPr>
+      </w:pPr>
+      <w:r>
+        <w:rPr>
+          <w:lang w:val="en-US"/>
+        </w:rPr>
+        <w:tab/>
+        <w:t xml:space="preserve">CHARACTER SET </w:t>
+      </w:r>
+      <w:r>
+        <w:rPr>
+          <w:lang w:val="en-US"/>
+        </w:rPr>
+        <w:t>UTF8</w:t>
+      </w:r>
+    </w:p>
+    <w:p>
+      <w:pPr>
+        <w:rPr>
+          <w:lang w:val="en-US"/>
+        </w:rPr>
+      </w:pPr>
+      <w:r>
+        <w:rPr>
+          <w:lang w:val="en-US"/>
+        </w:rPr>
+        <w:tab/>
+        <w:t>COLUMNS TERMINATED BY '</w:t>
+      </w:r>
+      <w:r>
+        <w:rPr>
+          <w:lang w:val="en-US"/>
+        </w:rPr>
+        <w:tab/>
+      </w:r>
+      <w:r>
+        <w:rPr>
+          <w:lang w:val="en-US"/>
+        </w:rPr>
+        <w:t>'</w:t>
+      </w:r>
+    </w:p>
+    <w:p>
+      <w:r>
+        <w:rPr>
+          <w:lang w:val="en-US"/>
+        </w:rPr>
+        <w:tab/>
+      </w:r>
+      <w:r>
+        <w:t>IGNORE 1 LINES;</w:t>
+      </w:r>
+    </w:p>
+    <w:p/>
+    <w:p>
+      <w:pPr>
+        <w:rPr>
+          <w:lang w:val="en-US"/>
+        </w:rPr>
+      </w:pPr>
+      <w:r>
+        <w:rPr>
+          <w:lang w:val="en-US"/>
+        </w:rPr>
+        <w:t>LOAD DATA INFILE '</w:t>
+      </w:r>
+      <w:r>
+        <w:rPr>
+          <w:lang w:val="en-US"/>
+        </w:rPr>
+        <w:t>/var/lib/mysql-files/t_</w:t>
+      </w:r>
+      <w:r>
+        <w:rPr>
+          <w:lang w:val="en-US"/>
+        </w:rPr>
+        <w:t>client</w:t>
+      </w:r>
+      <w:r>
+        <w:rPr>
+          <w:lang w:val="en-US"/>
+        </w:rPr>
+        <w:t>.tsv</w:t>
+      </w:r>
+      <w:r>
+        <w:rPr>
+          <w:lang w:val="en-US"/>
+        </w:rPr>
+        <w:t xml:space="preserve">' </w:t>
+      </w:r>
+    </w:p>
+    <w:p>
+      <w:pPr>
+        <w:rPr>
+          <w:lang w:val="en-US"/>
+        </w:rPr>
+      </w:pPr>
+      <w:r>
+        <w:rPr>
+          <w:lang w:val="en-US"/>
+        </w:rPr>
+        <w:tab/>
+        <w:t>INTO TABLE t_</w:t>
+      </w:r>
+      <w:r>
+        <w:rPr>
+          <w:lang w:val="en-US"/>
+        </w:rPr>
+        <w:t>client</w:t>
+      </w:r>
+    </w:p>
+    <w:p>
+      <w:pPr>
+        <w:rPr>
+          <w:lang w:val="en-US"/>
+        </w:rPr>
+      </w:pPr>
+      <w:r>
+        <w:rPr>
+          <w:lang w:val="en-US"/>
+        </w:rPr>
+        <w:tab/>
+        <w:t xml:space="preserve">CHARACTER SET </w:t>
+      </w:r>
+      <w:r>
+        <w:rPr>
+          <w:lang w:val="en-US"/>
+        </w:rPr>
+        <w:t>UTF8</w:t>
+      </w:r>
+    </w:p>
+    <w:p>
+      <w:pPr>
+        <w:rPr>
+          <w:lang w:val="en-US"/>
+        </w:rPr>
+      </w:pPr>
+      <w:r>
+        <w:rPr>
+          <w:lang w:val="en-US"/>
+        </w:rPr>
+        <w:tab/>
+        <w:t>COLUMNS TERMINATED BY '</w:t>
+      </w:r>
+      <w:r>
+        <w:rPr>
+          <w:lang w:val="en-US"/>
+        </w:rPr>
+        <w:tab/>
+      </w:r>
+      <w:r>
+        <w:rPr>
+          <w:lang w:val="en-US"/>
+        </w:rPr>
+        <w:t>'</w:t>
+      </w:r>
+    </w:p>
+    <w:p>
+      <w:r>
+        <w:rPr>
+          <w:lang w:val="en-US"/>
+        </w:rPr>
+        <w:tab/>
+      </w:r>
+      <w:r>
+        <w:t>IGNORE 1 LINES;</w:t>
+      </w:r>
+    </w:p>
+    <w:p/>
+    <w:p>
+      <w:pPr>
+        <w:keepNext/>
+        <w:rPr>
+          <w:lang w:val="en-US"/>
+        </w:rPr>
+      </w:pPr>
+      <w:r>
+        <w:rPr>
+          <w:lang w:val="en-US"/>
+        </w:rPr>
+        <w:lastRenderedPageBreak/>
+        <w:t xml:space="preserve">LOAD DATA INFILE '/var/lib/mysql-files/t_adresse.tsv' </w:t>
+      </w:r>
+    </w:p>
+    <w:p>
+      <w:pPr>
+        <w:keepNext/>
+        <w:rPr>
+          <w:lang w:val="en-US"/>
+        </w:rPr>
+      </w:pPr>
+      <w:r>
+        <w:rPr>
+          <w:lang w:val="en-US"/>
+        </w:rPr>
+        <w:tab/>
+        <w:t>INTO TABLE t_adresse</w:t>
+      </w:r>
+    </w:p>
+    <w:p>
+      <w:pPr>
+        <w:keepNext/>
+        <w:rPr>
+          <w:lang w:val="en-US"/>
+        </w:rPr>
+      </w:pPr>
+      <w:r>
+        <w:rPr>
+          <w:lang w:val="en-US"/>
+        </w:rPr>
+        <w:tab/>
+        <w:t>CHARACTER SET UTF8</w:t>
+      </w:r>
+    </w:p>
+    <w:p>
+      <w:pPr>
+        <w:keepNext/>
+        <w:rPr>
+          <w:lang w:val="en-US"/>
+        </w:rPr>
+      </w:pPr>
+      <w:r>
+        <w:rPr>
+          <w:lang w:val="en-US"/>
+        </w:rPr>
+        <w:tab/>
+        <w:t>COLUMNS TERMINATED BY '</w:t>
+      </w:r>
+      <w:r>
+        <w:rPr>
+          <w:lang w:val="en-US"/>
+        </w:rPr>
+        <w:t>\t</w:t>
+      </w:r>
+      <w:r>
+        <w:rPr>
+          <w:lang w:val="en-US"/>
+        </w:rPr>
+        <w:t>'</w:t>
+      </w:r>
+    </w:p>
+    <w:p>
+      <w:pPr>
+        <w:keepNext/>
+      </w:pPr>
+      <w:r>
+        <w:rPr>
+          <w:lang w:val="en-US"/>
+        </w:rPr>
+        <w:tab/>
+      </w:r>
+      <w:r>
+        <w:t>IGNORE 1 LINES</w:t>
+      </w:r>
+    </w:p>
+    <w:p>
+      <w:pPr>
+        <w:keepNext/>
+      </w:pPr>
+      <w:r>
+        <w:t xml:space="preserve">    (`adresse_id`, `client_fk`, `rue`, `npa`, `localite`, `latitude`, `longitude`);</w:t>
+      </w:r>
+    </w:p>
+    <w:p/>
     <w:p>
       <w:pPr>
         <w:pStyle w:val="Titre2"/>
@@ -827,7 +1248,7 @@
 </file>
 
 <file path=word/endnotes.xml><?xml version="1.0" encoding="utf-8"?>
-<w:endnotes xmlns:wpc="http://schemas.microsoft.com/office/word/2010/wordprocessingCanvas" xmlns:cx="http://schemas.microsoft.com/office/drawing/2014/chartex" xmlns:cx1="http://schemas.microsoft.com/office/drawing/2015/9/8/chartex" xmlns:cx2="http://schemas.microsoft.com/office/drawing/2015/10/21/chartex" xmlns:cx3="http://schemas.microsoft.com/office/drawing/2016/5/9/chartex" xmlns:cx4="http://schemas.microsoft.com/office/drawing/2016/5/10/chartex" xmlns:cx5="http://schemas.microsoft.com/office/drawing/2016/5/11/chartex" xmlns:cx6="http://schemas.microsoft.com/office/drawing/2016/5/12/chartex" xmlns:cx7="http://schemas.microsoft.com/office/drawing/2016/5/13/chartex" xmlns:cx8="http://schemas.microsoft.com/office/drawing/2016/5/14/chartex" xmlns:mc="http://schemas.openxmlformats.org/markup-compatibility/2006" xmlns:aink="http://schemas.microsoft.com/office/drawing/2016/ink" xmlns:am3d="http://schemas.microsoft.com/office/drawing/2017/model3d" xmlns:o="urn:schemas-microsoft-com:office:office" xmlns:oel="http://schemas.microsoft.com/office/2019/extlst" xmlns:r="http://schemas.openxmlformats.org/officeDocument/2006/relationships" xmlns:m="http://schemas.openxmlformats.org/officeDocument/2006/math" xmlns:v="urn:schemas-microsoft-com:vml" xmlns:wp14="http://schemas.microsoft.com/office/word/2010/wordprocessingDrawing" xmlns:wp="http://schemas.openxmlformats.org/drawingml/2006/wordprocessingDrawing" xmlns:w10="urn:schemas-microsoft-com:office:word" xmlns:w="http://schemas.openxmlformats.org/wordprocessingml/2006/main" xmlns:w14="http://schemas.microsoft.com/office/word/2010/wordml" xmlns:w15="http://schemas.microsoft.com/office/word/2012/wordml" xmlns:w16cex="http://schemas.microsoft.com/office/word/2018/wordml/cex" xmlns:w16cid="http://schemas.microsoft.com/office/word/2016/wordml/cid" xmlns:w16="http://schemas.microsoft.com/office/word/2018/wordml" xmlns:w16sdtdh="http://schemas.microsoft.com/office/word/2020/wordml/sdtdatahash" xmlns:w16se="http://schemas.microsoft.com/office/word/2015/wordml/symex" xmlns:wpg="http://schemas.microsoft.com/office/word/2010/wordprocessingGroup" xmlns:wpi="http://schemas.microsoft.com/office/word/2010/wordprocessingInk" xmlns:wne="http://schemas.microsoft.com/office/word/2006/wordml" xmlns:wps="http://schemas.microsoft.com/office/word/2010/wordprocessingShape" mc:Ignorable="w14 w15 w16se w16cid w16 w16cex w16sdtdh wp14">
+<w:endnotes xmlns:wpc="http://schemas.microsoft.com/office/word/2010/wordprocessingCanvas" xmlns:cx="http://schemas.microsoft.com/office/drawing/2014/chartex" xmlns:cx1="http://schemas.microsoft.com/office/drawing/2015/9/8/chartex" xmlns:cx2="http://schemas.microsoft.com/office/drawing/2015/10/21/chartex" xmlns:cx3="http://schemas.microsoft.com/office/drawing/2016/5/9/chartex" xmlns:cx4="http://schemas.microsoft.com/office/drawing/2016/5/10/chartex" xmlns:cx5="http://schemas.microsoft.com/office/drawing/2016/5/11/chartex" xmlns:cx6="http://schemas.microsoft.com/office/drawing/2016/5/12/chartex" xmlns:cx7="http://schemas.microsoft.com/office/drawing/2016/5/13/chartex" xmlns:cx8="http://schemas.microsoft.com/office/drawing/2016/5/14/chartex" xmlns:mc="http://schemas.openxmlformats.org/markup-compatibility/2006" xmlns:aink="http://schemas.microsoft.com/office/drawing/2016/ink" xmlns:am3d="http://schemas.microsoft.com/office/drawing/2017/model3d" xmlns:o="urn:schemas-microsoft-com:office:office" xmlns:oel="http://schemas.microsoft.com/office/2019/extlst" xmlns:r="http://schemas.openxmlformats.org/officeDocument/2006/relationships" xmlns:m="http://schemas.openxmlformats.org/officeDocument/2006/math" xmlns:v="urn:schemas-microsoft-com:vml" xmlns:wp14="http://schemas.microsoft.com/office/word/2010/wordprocessingDrawing" xmlns:wp="http://schemas.openxmlformats.org/drawingml/2006/wordprocessingDrawing" xmlns:w10="urn:schemas-microsoft-com:office:word" xmlns:w="http://schemas.openxmlformats.org/wordprocessingml/2006/main" xmlns:w14="http://schemas.microsoft.com/office/word/2010/wordml" xmlns:w15="http://schemas.microsoft.com/office/word/2012/wordml" xmlns:w16cex="http://schemas.microsoft.com/office/word/2018/wordml/cex" xmlns:w16cid="http://schemas.microsoft.com/office/word/2016/wordml/cid" xmlns:w16="http://schemas.microsoft.com/office/word/2018/wordml" xmlns:w16du="http://schemas.microsoft.com/office/word/2023/wordml/word16du" xmlns:w16sdtdh="http://schemas.microsoft.com/office/word/2020/wordml/sdtdatahash" xmlns:w16sdtfl="http://schemas.microsoft.com/office/word/2024/wordml/sdtformatlock" xmlns:w16se="http://schemas.microsoft.com/office/word/2015/wordml/symex" xmlns:wpg="http://schemas.microsoft.com/office/word/2010/wordprocessingGroup" xmlns:wpi="http://schemas.microsoft.com/office/word/2010/wordprocessingInk" xmlns:wne="http://schemas.microsoft.com/office/word/2006/wordml" xmlns:wps="http://schemas.microsoft.com/office/word/2010/wordprocessingShape" mc:Ignorable="w14 w15 w16se w16cid w16 w16cex w16sdtdh w16sdtfl w16du wp14">
   <w:endnote w:type="separator" w:id="-1">
     <w:p>
       <w:pPr>
@@ -852,7 +1273,7 @@
 </file>
 
 <file path=word/footer1.xml><?xml version="1.0" encoding="utf-8"?>
-<w:ftr xmlns:wpc="http://schemas.microsoft.com/office/word/2010/wordprocessingCanvas" xmlns:cx="http://schemas.microsoft.com/office/drawing/2014/chartex" xmlns:cx1="http://schemas.microsoft.com/office/drawing/2015/9/8/chartex" xmlns:cx2="http://schemas.microsoft.com/office/drawing/2015/10/21/chartex" xmlns:cx3="http://schemas.microsoft.com/office/drawing/2016/5/9/chartex" xmlns:cx4="http://schemas.microsoft.com/office/drawing/2016/5/10/chartex" xmlns:cx5="http://schemas.microsoft.com/office/drawing/2016/5/11/chartex" xmlns:cx6="http://schemas.microsoft.com/office/drawing/2016/5/12/chartex" xmlns:cx7="http://schemas.microsoft.com/office/drawing/2016/5/13/chartex" xmlns:cx8="http://schemas.microsoft.com/office/drawing/2016/5/14/chartex" xmlns:mc="http://schemas.openxmlformats.org/markup-compatibility/2006" xmlns:aink="http://schemas.microsoft.com/office/drawing/2016/ink" xmlns:am3d="http://schemas.microsoft.com/office/drawing/2017/model3d" xmlns:o="urn:schemas-microsoft-com:office:office" xmlns:oel="http://schemas.microsoft.com/office/2019/extlst" xmlns:r="http://schemas.openxmlformats.org/officeDocument/2006/relationships" xmlns:m="http://schemas.openxmlformats.org/officeDocument/2006/math" xmlns:v="urn:schemas-microsoft-com:vml" xmlns:wp14="http://schemas.microsoft.com/office/word/2010/wordprocessingDrawing" xmlns:wp="http://schemas.openxmlformats.org/drawingml/2006/wordprocessingDrawing" xmlns:w10="urn:schemas-microsoft-com:office:word" xmlns:w="http://schemas.openxmlformats.org/wordprocessingml/2006/main" xmlns:w14="http://schemas.microsoft.com/office/word/2010/wordml" xmlns:w15="http://schemas.microsoft.com/office/word/2012/wordml" xmlns:w16cex="http://schemas.microsoft.com/office/word/2018/wordml/cex" xmlns:w16cid="http://schemas.microsoft.com/office/word/2016/wordml/cid" xmlns:w16="http://schemas.microsoft.com/office/word/2018/wordml" xmlns:w16sdtdh="http://schemas.microsoft.com/office/word/2020/wordml/sdtdatahash" xmlns:w16se="http://schemas.microsoft.com/office/word/2015/wordml/symex" xmlns:wpg="http://schemas.microsoft.com/office/word/2010/wordprocessingGroup" xmlns:wpi="http://schemas.microsoft.com/office/word/2010/wordprocessingInk" xmlns:wne="http://schemas.microsoft.com/office/word/2006/wordml" xmlns:wps="http://schemas.microsoft.com/office/word/2010/wordprocessingShape" mc:Ignorable="w14 w15 w16se w16cid w16 w16cex w16sdtdh wp14">
+<w:ftr xmlns:wpc="http://schemas.microsoft.com/office/word/2010/wordprocessingCanvas" xmlns:cx="http://schemas.microsoft.com/office/drawing/2014/chartex" xmlns:cx1="http://schemas.microsoft.com/office/drawing/2015/9/8/chartex" xmlns:cx2="http://schemas.microsoft.com/office/drawing/2015/10/21/chartex" xmlns:cx3="http://schemas.microsoft.com/office/drawing/2016/5/9/chartex" xmlns:cx4="http://schemas.microsoft.com/office/drawing/2016/5/10/chartex" xmlns:cx5="http://schemas.microsoft.com/office/drawing/2016/5/11/chartex" xmlns:cx6="http://schemas.microsoft.com/office/drawing/2016/5/12/chartex" xmlns:cx7="http://schemas.microsoft.com/office/drawing/2016/5/13/chartex" xmlns:cx8="http://schemas.microsoft.com/office/drawing/2016/5/14/chartex" xmlns:mc="http://schemas.openxmlformats.org/markup-compatibility/2006" xmlns:aink="http://schemas.microsoft.com/office/drawing/2016/ink" xmlns:am3d="http://schemas.microsoft.com/office/drawing/2017/model3d" xmlns:o="urn:schemas-microsoft-com:office:office" xmlns:oel="http://schemas.microsoft.com/office/2019/extlst" xmlns:r="http://schemas.openxmlformats.org/officeDocument/2006/relationships" xmlns:m="http://schemas.openxmlformats.org/officeDocument/2006/math" xmlns:v="urn:schemas-microsoft-com:vml" xmlns:wp14="http://schemas.microsoft.com/office/word/2010/wordprocessingDrawing" xmlns:wp="http://schemas.openxmlformats.org/drawingml/2006/wordprocessingDrawing" xmlns:w10="urn:schemas-microsoft-com:office:word" xmlns:w="http://schemas.openxmlformats.org/wordprocessingml/2006/main" xmlns:w14="http://schemas.microsoft.com/office/word/2010/wordml" xmlns:w15="http://schemas.microsoft.com/office/word/2012/wordml" xmlns:w16cex="http://schemas.microsoft.com/office/word/2018/wordml/cex" xmlns:w16cid="http://schemas.microsoft.com/office/word/2016/wordml/cid" xmlns:w16="http://schemas.microsoft.com/office/word/2018/wordml" xmlns:w16du="http://schemas.microsoft.com/office/word/2023/wordml/word16du" xmlns:w16sdtdh="http://schemas.microsoft.com/office/word/2020/wordml/sdtdatahash" xmlns:w16sdtfl="http://schemas.microsoft.com/office/word/2024/wordml/sdtformatlock" xmlns:w16se="http://schemas.microsoft.com/office/word/2015/wordml/symex" xmlns:wpg="http://schemas.microsoft.com/office/word/2010/wordprocessingGroup" xmlns:wpi="http://schemas.microsoft.com/office/word/2010/wordprocessingInk" xmlns:wne="http://schemas.microsoft.com/office/word/2006/wordml" xmlns:wps="http://schemas.microsoft.com/office/word/2010/wordprocessingShape" mc:Ignorable="w14 w15 w16se w16cid w16 w16cex w16sdtdh w16sdtfl w16du wp14">
   <w:p>
     <w:pPr>
       <w:pStyle w:val="Pieddepage"/>
@@ -895,7 +1316,7 @@
 </file>
 
 <file path=word/footnotes.xml><?xml version="1.0" encoding="utf-8"?>
-<w:footnotes xmlns:wpc="http://schemas.microsoft.com/office/word/2010/wordprocessingCanvas" xmlns:cx="http://schemas.microsoft.com/office/drawing/2014/chartex" xmlns:cx1="http://schemas.microsoft.com/office/drawing/2015/9/8/chartex" xmlns:cx2="http://schemas.microsoft.com/office/drawing/2015/10/21/chartex" xmlns:cx3="http://schemas.microsoft.com/office/drawing/2016/5/9/chartex" xmlns:cx4="http://schemas.microsoft.com/office/drawing/2016/5/10/chartex" xmlns:cx5="http://schemas.microsoft.com/office/drawing/2016/5/11/chartex" xmlns:cx6="http://schemas.microsoft.com/office/drawing/2016/5/12/chartex" xmlns:cx7="http://schemas.microsoft.com/office/drawing/2016/5/13/chartex" xmlns:cx8="http://schemas.microsoft.com/office/drawing/2016/5/14/chartex" xmlns:mc="http://schemas.openxmlformats.org/markup-compatibility/2006" xmlns:aink="http://schemas.microsoft.com/office/drawing/2016/ink" xmlns:am3d="http://schemas.microsoft.com/office/drawing/2017/model3d" xmlns:o="urn:schemas-microsoft-com:office:office" xmlns:oel="http://schemas.microsoft.com/office/2019/extlst" xmlns:r="http://schemas.openxmlformats.org/officeDocument/2006/relationships" xmlns:m="http://schemas.openxmlformats.org/officeDocument/2006/math" xmlns:v="urn:schemas-microsoft-com:vml" xmlns:wp14="http://schemas.microsoft.com/office/word/2010/wordprocessingDrawing" xmlns:wp="http://schemas.openxmlformats.org/drawingml/2006/wordprocessingDrawing" xmlns:w10="urn:schemas-microsoft-com:office:word" xmlns:w="http://schemas.openxmlformats.org/wordprocessingml/2006/main" xmlns:w14="http://schemas.microsoft.com/office/word/2010/wordml" xmlns:w15="http://schemas.microsoft.com/office/word/2012/wordml" xmlns:w16cex="http://schemas.microsoft.com/office/word/2018/wordml/cex" xmlns:w16cid="http://schemas.microsoft.com/office/word/2016/wordml/cid" xmlns:w16="http://schemas.microsoft.com/office/word/2018/wordml" xmlns:w16sdtdh="http://schemas.microsoft.com/office/word/2020/wordml/sdtdatahash" xmlns:w16se="http://schemas.microsoft.com/office/word/2015/wordml/symex" xmlns:wpg="http://schemas.microsoft.com/office/word/2010/wordprocessingGroup" xmlns:wpi="http://schemas.microsoft.com/office/word/2010/wordprocessingInk" xmlns:wne="http://schemas.microsoft.com/office/word/2006/wordml" xmlns:wps="http://schemas.microsoft.com/office/word/2010/wordprocessingShape" mc:Ignorable="w14 w15 w16se w16cid w16 w16cex w16sdtdh wp14">
+<w:footnotes xmlns:wpc="http://schemas.microsoft.com/office/word/2010/wordprocessingCanvas" xmlns:cx="http://schemas.microsoft.com/office/drawing/2014/chartex" xmlns:cx1="http://schemas.microsoft.com/office/drawing/2015/9/8/chartex" xmlns:cx2="http://schemas.microsoft.com/office/drawing/2015/10/21/chartex" xmlns:cx3="http://schemas.microsoft.com/office/drawing/2016/5/9/chartex" xmlns:cx4="http://schemas.microsoft.com/office/drawing/2016/5/10/chartex" xmlns:cx5="http://schemas.microsoft.com/office/drawing/2016/5/11/chartex" xmlns:cx6="http://schemas.microsoft.com/office/drawing/2016/5/12/chartex" xmlns:cx7="http://schemas.microsoft.com/office/drawing/2016/5/13/chartex" xmlns:cx8="http://schemas.microsoft.com/office/drawing/2016/5/14/chartex" xmlns:mc="http://schemas.openxmlformats.org/markup-compatibility/2006" xmlns:aink="http://schemas.microsoft.com/office/drawing/2016/ink" xmlns:am3d="http://schemas.microsoft.com/office/drawing/2017/model3d" xmlns:o="urn:schemas-microsoft-com:office:office" xmlns:oel="http://schemas.microsoft.com/office/2019/extlst" xmlns:r="http://schemas.openxmlformats.org/officeDocument/2006/relationships" xmlns:m="http://schemas.openxmlformats.org/officeDocument/2006/math" xmlns:v="urn:schemas-microsoft-com:vml" xmlns:wp14="http://schemas.microsoft.com/office/word/2010/wordprocessingDrawing" xmlns:wp="http://schemas.openxmlformats.org/drawingml/2006/wordprocessingDrawing" xmlns:w10="urn:schemas-microsoft-com:office:word" xmlns:w="http://schemas.openxmlformats.org/wordprocessingml/2006/main" xmlns:w14="http://schemas.microsoft.com/office/word/2010/wordml" xmlns:w15="http://schemas.microsoft.com/office/word/2012/wordml" xmlns:w16cex="http://schemas.microsoft.com/office/word/2018/wordml/cex" xmlns:w16cid="http://schemas.microsoft.com/office/word/2016/wordml/cid" xmlns:w16="http://schemas.microsoft.com/office/word/2018/wordml" xmlns:w16du="http://schemas.microsoft.com/office/word/2023/wordml/word16du" xmlns:w16sdtdh="http://schemas.microsoft.com/office/word/2020/wordml/sdtdatahash" xmlns:w16sdtfl="http://schemas.microsoft.com/office/word/2024/wordml/sdtformatlock" xmlns:w16se="http://schemas.microsoft.com/office/word/2015/wordml/symex" xmlns:wpg="http://schemas.microsoft.com/office/word/2010/wordprocessingGroup" xmlns:wpi="http://schemas.microsoft.com/office/word/2010/wordprocessingInk" xmlns:wne="http://schemas.microsoft.com/office/word/2006/wordml" xmlns:wps="http://schemas.microsoft.com/office/word/2010/wordprocessingShape" mc:Ignorable="w14 w15 w16se w16cid w16 w16cex w16sdtdh w16sdtfl w16du wp14">
   <w:footnote w:type="separator" w:id="-1">
     <w:p>
       <w:pPr>
@@ -920,7 +1341,7 @@
 </file>
 
 <file path=word/header1.xml><?xml version="1.0" encoding="utf-8"?>
-<w:hdr xmlns:wpc="http://schemas.microsoft.com/office/word/2010/wordprocessingCanvas" xmlns:cx="http://schemas.microsoft.com/office/drawing/2014/chartex" xmlns:cx1="http://schemas.microsoft.com/office/drawing/2015/9/8/chartex" xmlns:cx2="http://schemas.microsoft.com/office/drawing/2015/10/21/chartex" xmlns:cx3="http://schemas.microsoft.com/office/drawing/2016/5/9/chartex" xmlns:cx4="http://schemas.microsoft.com/office/drawing/2016/5/10/chartex" xmlns:cx5="http://schemas.microsoft.com/office/drawing/2016/5/11/chartex" xmlns:cx6="http://schemas.microsoft.com/office/drawing/2016/5/12/chartex" xmlns:cx7="http://schemas.microsoft.com/office/drawing/2016/5/13/chartex" xmlns:cx8="http://schemas.microsoft.com/office/drawing/2016/5/14/chartex" xmlns:mc="http://schemas.openxmlformats.org/markup-compatibility/2006" xmlns:aink="http://schemas.microsoft.com/office/drawing/2016/ink" xmlns:am3d="http://schemas.microsoft.com/office/drawing/2017/model3d" xmlns:o="urn:schemas-microsoft-com:office:office" xmlns:oel="http://schemas.microsoft.com/office/2019/extlst" xmlns:r="http://schemas.openxmlformats.org/officeDocument/2006/relationships" xmlns:m="http://schemas.openxmlformats.org/officeDocument/2006/math" xmlns:v="urn:schemas-microsoft-com:vml" xmlns:wp14="http://schemas.microsoft.com/office/word/2010/wordprocessingDrawing" xmlns:wp="http://schemas.openxmlformats.org/drawingml/2006/wordprocessingDrawing" xmlns:w10="urn:schemas-microsoft-com:office:word" xmlns:w="http://schemas.openxmlformats.org/wordprocessingml/2006/main" xmlns:w14="http://schemas.microsoft.com/office/word/2010/wordml" xmlns:w15="http://schemas.microsoft.com/office/word/2012/wordml" xmlns:w16cex="http://schemas.microsoft.com/office/word/2018/wordml/cex" xmlns:w16cid="http://schemas.microsoft.com/office/word/2016/wordml/cid" xmlns:w16="http://schemas.microsoft.com/office/word/2018/wordml" xmlns:w16sdtdh="http://schemas.microsoft.com/office/word/2020/wordml/sdtdatahash" xmlns:w16se="http://schemas.microsoft.com/office/word/2015/wordml/symex" xmlns:wpg="http://schemas.microsoft.com/office/word/2010/wordprocessingGroup" xmlns:wpi="http://schemas.microsoft.com/office/word/2010/wordprocessingInk" xmlns:wne="http://schemas.microsoft.com/office/word/2006/wordml" xmlns:wps="http://schemas.microsoft.com/office/word/2010/wordprocessingShape" mc:Ignorable="w14 w15 w16se w16cid w16 w16cex w16sdtdh wp14">
+<w:hdr xmlns:wpc="http://schemas.microsoft.com/office/word/2010/wordprocessingCanvas" xmlns:cx="http://schemas.microsoft.com/office/drawing/2014/chartex" xmlns:cx1="http://schemas.microsoft.com/office/drawing/2015/9/8/chartex" xmlns:cx2="http://schemas.microsoft.com/office/drawing/2015/10/21/chartex" xmlns:cx3="http://schemas.microsoft.com/office/drawing/2016/5/9/chartex" xmlns:cx4="http://schemas.microsoft.com/office/drawing/2016/5/10/chartex" xmlns:cx5="http://schemas.microsoft.com/office/drawing/2016/5/11/chartex" xmlns:cx6="http://schemas.microsoft.com/office/drawing/2016/5/12/chartex" xmlns:cx7="http://schemas.microsoft.com/office/drawing/2016/5/13/chartex" xmlns:cx8="http://schemas.microsoft.com/office/drawing/2016/5/14/chartex" xmlns:mc="http://schemas.openxmlformats.org/markup-compatibility/2006" xmlns:aink="http://schemas.microsoft.com/office/drawing/2016/ink" xmlns:am3d="http://schemas.microsoft.com/office/drawing/2017/model3d" xmlns:o="urn:schemas-microsoft-com:office:office" xmlns:oel="http://schemas.microsoft.com/office/2019/extlst" xmlns:r="http://schemas.openxmlformats.org/officeDocument/2006/relationships" xmlns:m="http://schemas.openxmlformats.org/officeDocument/2006/math" xmlns:v="urn:schemas-microsoft-com:vml" xmlns:wp14="http://schemas.microsoft.com/office/word/2010/wordprocessingDrawing" xmlns:wp="http://schemas.openxmlformats.org/drawingml/2006/wordprocessingDrawing" xmlns:w10="urn:schemas-microsoft-com:office:word" xmlns:w="http://schemas.openxmlformats.org/wordprocessingml/2006/main" xmlns:w14="http://schemas.microsoft.com/office/word/2010/wordml" xmlns:w15="http://schemas.microsoft.com/office/word/2012/wordml" xmlns:w16cex="http://schemas.microsoft.com/office/word/2018/wordml/cex" xmlns:w16cid="http://schemas.microsoft.com/office/word/2016/wordml/cid" xmlns:w16="http://schemas.microsoft.com/office/word/2018/wordml" xmlns:w16du="http://schemas.microsoft.com/office/word/2023/wordml/word16du" xmlns:w16sdtdh="http://schemas.microsoft.com/office/word/2020/wordml/sdtdatahash" xmlns:w16sdtfl="http://schemas.microsoft.com/office/word/2024/wordml/sdtformatlock" xmlns:w16se="http://schemas.microsoft.com/office/word/2015/wordml/symex" xmlns:wpg="http://schemas.microsoft.com/office/word/2010/wordprocessingGroup" xmlns:wpi="http://schemas.microsoft.com/office/word/2010/wordprocessingInk" xmlns:wne="http://schemas.microsoft.com/office/word/2006/wordml" xmlns:wps="http://schemas.microsoft.com/office/word/2010/wordprocessingShape" mc:Ignorable="w14 w15 w16se w16cid w16 w16cex w16sdtdh w16sdtfl w16du wp14">
   <w:p>
     <w:pPr>
       <w:pStyle w:val="En-tte"/>
@@ -1182,7 +1603,7 @@
 </file>
 
 <file path=word/numbering.xml><?xml version="1.0" encoding="utf-8"?>
-<w:numbering xmlns:wpc="http://schemas.microsoft.com/office/word/2010/wordprocessingCanvas" xmlns:cx="http://schemas.microsoft.com/office/drawing/2014/chartex" xmlns:cx1="http://schemas.microsoft.com/office/drawing/2015/9/8/chartex" xmlns:cx2="http://schemas.microsoft.com/office/drawing/2015/10/21/chartex" xmlns:cx3="http://schemas.microsoft.com/office/drawing/2016/5/9/chartex" xmlns:cx4="http://schemas.microsoft.com/office/drawing/2016/5/10/chartex" xmlns:cx5="http://schemas.microsoft.com/office/drawing/2016/5/11/chartex" xmlns:cx6="http://schemas.microsoft.com/office/drawing/2016/5/12/chartex" xmlns:cx7="http://schemas.microsoft.com/office/drawing/2016/5/13/chartex" xmlns:cx8="http://schemas.microsoft.com/office/drawing/2016/5/14/chartex" xmlns:mc="http://schemas.openxmlformats.org/markup-compatibility/2006" xmlns:aink="http://schemas.microsoft.com/office/drawing/2016/ink" xmlns:am3d="http://schemas.microsoft.com/office/drawing/2017/model3d" xmlns:o="urn:schemas-microsoft-com:office:office" xmlns:oel="http://schemas.microsoft.com/office/2019/extlst" xmlns:r="http://schemas.openxmlformats.org/officeDocument/2006/relationships" xmlns:m="http://schemas.openxmlformats.org/officeDocument/2006/math" xmlns:v="urn:schemas-microsoft-com:vml" xmlns:wp14="http://schemas.microsoft.com/office/word/2010/wordprocessingDrawing" xmlns:wp="http://schemas.openxmlformats.org/drawingml/2006/wordprocessingDrawing" xmlns:w10="urn:schemas-microsoft-com:office:word" xmlns:w="http://schemas.openxmlformats.org/wordprocessingml/2006/main" xmlns:w14="http://schemas.microsoft.com/office/word/2010/wordml" xmlns:w15="http://schemas.microsoft.com/office/word/2012/wordml" xmlns:w16cex="http://schemas.microsoft.com/office/word/2018/wordml/cex" xmlns:w16cid="http://schemas.microsoft.com/office/word/2016/wordml/cid" xmlns:w16="http://schemas.microsoft.com/office/word/2018/wordml" xmlns:w16sdtdh="http://schemas.microsoft.com/office/word/2020/wordml/sdtdatahash" xmlns:w16se="http://schemas.microsoft.com/office/word/2015/wordml/symex" xmlns:wpg="http://schemas.microsoft.com/office/word/2010/wordprocessingGroup" xmlns:wpi="http://schemas.microsoft.com/office/word/2010/wordprocessingInk" xmlns:wne="http://schemas.microsoft.com/office/word/2006/wordml" xmlns:wps="http://schemas.microsoft.com/office/word/2010/wordprocessingShape" mc:Ignorable="w14 w15 w16se w16cid w16 w16cex w16sdtdh wp14">
+<w:numbering xmlns:wpc="http://schemas.microsoft.com/office/word/2010/wordprocessingCanvas" xmlns:cx="http://schemas.microsoft.com/office/drawing/2014/chartex" xmlns:cx1="http://schemas.microsoft.com/office/drawing/2015/9/8/chartex" xmlns:cx2="http://schemas.microsoft.com/office/drawing/2015/10/21/chartex" xmlns:cx3="http://schemas.microsoft.com/office/drawing/2016/5/9/chartex" xmlns:cx4="http://schemas.microsoft.com/office/drawing/2016/5/10/chartex" xmlns:cx5="http://schemas.microsoft.com/office/drawing/2016/5/11/chartex" xmlns:cx6="http://schemas.microsoft.com/office/drawing/2016/5/12/chartex" xmlns:cx7="http://schemas.microsoft.com/office/drawing/2016/5/13/chartex" xmlns:cx8="http://schemas.microsoft.com/office/drawing/2016/5/14/chartex" xmlns:mc="http://schemas.openxmlformats.org/markup-compatibility/2006" xmlns:aink="http://schemas.microsoft.com/office/drawing/2016/ink" xmlns:am3d="http://schemas.microsoft.com/office/drawing/2017/model3d" xmlns:o="urn:schemas-microsoft-com:office:office" xmlns:oel="http://schemas.microsoft.com/office/2019/extlst" xmlns:r="http://schemas.openxmlformats.org/officeDocument/2006/relationships" xmlns:m="http://schemas.openxmlformats.org/officeDocument/2006/math" xmlns:v="urn:schemas-microsoft-com:vml" xmlns:wp14="http://schemas.microsoft.com/office/word/2010/wordprocessingDrawing" xmlns:wp="http://schemas.openxmlformats.org/drawingml/2006/wordprocessingDrawing" xmlns:w10="urn:schemas-microsoft-com:office:word" xmlns:w="http://schemas.openxmlformats.org/wordprocessingml/2006/main" xmlns:w14="http://schemas.microsoft.com/office/word/2010/wordml" xmlns:w15="http://schemas.microsoft.com/office/word/2012/wordml" xmlns:w16cex="http://schemas.microsoft.com/office/word/2018/wordml/cex" xmlns:w16cid="http://schemas.microsoft.com/office/word/2016/wordml/cid" xmlns:w16="http://schemas.microsoft.com/office/word/2018/wordml" xmlns:w16du="http://schemas.microsoft.com/office/word/2023/wordml/word16du" xmlns:w16sdtdh="http://schemas.microsoft.com/office/word/2020/wordml/sdtdatahash" xmlns:w16sdtfl="http://schemas.microsoft.com/office/word/2024/wordml/sdtformatlock" xmlns:w16se="http://schemas.microsoft.com/office/word/2015/wordml/symex" xmlns:wpg="http://schemas.microsoft.com/office/word/2010/wordprocessingGroup" xmlns:wpi="http://schemas.microsoft.com/office/word/2010/wordprocessingInk" xmlns:wne="http://schemas.microsoft.com/office/word/2006/wordml" xmlns:wps="http://schemas.microsoft.com/office/word/2010/wordprocessingShape" mc:Ignorable="w14 w15 w16se w16cid w16 w16cex w16sdtdh w16sdtfl w16du wp14">
   <w:abstractNum w:abstractNumId="0" w15:restartNumberingAfterBreak="0">
     <w:nsid w:val="21B31103"/>
     <w:multiLevelType w:val="hybridMultilevel"/>
@@ -1463,7 +1884,7 @@
 </file>
 
 <file path=word/styles.xml><?xml version="1.0" encoding="utf-8"?>
-<w:styles xmlns:mc="http://schemas.openxmlformats.org/markup-compatibility/2006" xmlns:r="http://schemas.openxmlformats.org/officeDocument/2006/relationships" xmlns:w="http://schemas.openxmlformats.org/wordprocessingml/2006/main" xmlns:w14="http://schemas.microsoft.com/office/word/2010/wordml" xmlns:w15="http://schemas.microsoft.com/office/word/2012/wordml" xmlns:w16cex="http://schemas.microsoft.com/office/word/2018/wordml/cex" xmlns:w16cid="http://schemas.microsoft.com/office/word/2016/wordml/cid" xmlns:w16="http://schemas.microsoft.com/office/word/2018/wordml" xmlns:w16sdtdh="http://schemas.microsoft.com/office/word/2020/wordml/sdtdatahash" xmlns:w16se="http://schemas.microsoft.com/office/word/2015/wordml/symex" mc:Ignorable="w14 w15 w16se w16cid w16 w16cex w16sdtdh">
+<w:styles xmlns:mc="http://schemas.openxmlformats.org/markup-compatibility/2006" xmlns:r="http://schemas.openxmlformats.org/officeDocument/2006/relationships" xmlns:w="http://schemas.openxmlformats.org/wordprocessingml/2006/main" xmlns:w14="http://schemas.microsoft.com/office/word/2010/wordml" xmlns:w15="http://schemas.microsoft.com/office/word/2012/wordml" xmlns:w16cex="http://schemas.microsoft.com/office/word/2018/wordml/cex" xmlns:w16cid="http://schemas.microsoft.com/office/word/2016/wordml/cid" xmlns:w16="http://schemas.microsoft.com/office/word/2018/wordml" xmlns:w16du="http://schemas.microsoft.com/office/word/2023/wordml/word16du" xmlns:w16sdtdh="http://schemas.microsoft.com/office/word/2020/wordml/sdtdatahash" xmlns:w16sdtfl="http://schemas.microsoft.com/office/word/2024/wordml/sdtformatlock" xmlns:w16se="http://schemas.microsoft.com/office/word/2015/wordml/symex" mc:Ignorable="w14 w15 w16se w16cid w16 w16cex w16sdtdh w16sdtfl w16du">
   <w:docDefaults>
     <w:rPrDefault>
       <w:rPr>
@@ -1862,6 +2283,7 @@
   <w:style w:type="paragraph" w:default="1" w:styleId="Normal">
     <w:name w:val="Normal"/>
     <w:qFormat/>
+    <w:rsid w:val="00A3556E"/>
   </w:style>
   <w:style w:type="paragraph" w:styleId="Titre1">
     <w:name w:val="heading 1"/>

</xml_diff>

<commit_message>
Doc (rapport) : commandes LOAD DATA
Ajout des 8 commandes LOAD DATA au rapport, les commandes sont brutes, je les détaillerais plus tard
</commit_message>
<xml_diff>
--- a/R106-JonJunod-ThanosPizza.docx
+++ b/R106-JonJunod-ThanosPizza.docx
@@ -1,6 +1,6 @@
 
 <file path=word/document.xml><?xml version="1.0" encoding="utf-8"?>
-<w:document xmlns:wpc="http://schemas.microsoft.com/office/word/2010/wordprocessingCanvas" xmlns:cx="http://schemas.microsoft.com/office/drawing/2014/chartex" xmlns:cx1="http://schemas.microsoft.com/office/drawing/2015/9/8/chartex" xmlns:cx2="http://schemas.microsoft.com/office/drawing/2015/10/21/chartex" xmlns:cx3="http://schemas.microsoft.com/office/drawing/2016/5/9/chartex" xmlns:cx4="http://schemas.microsoft.com/office/drawing/2016/5/10/chartex" xmlns:cx5="http://schemas.microsoft.com/office/drawing/2016/5/11/chartex" xmlns:cx6="http://schemas.microsoft.com/office/drawing/2016/5/12/chartex" xmlns:cx7="http://schemas.microsoft.com/office/drawing/2016/5/13/chartex" xmlns:cx8="http://schemas.microsoft.com/office/drawing/2016/5/14/chartex" xmlns:mc="http://schemas.openxmlformats.org/markup-compatibility/2006" xmlns:aink="http://schemas.microsoft.com/office/drawing/2016/ink" xmlns:am3d="http://schemas.microsoft.com/office/drawing/2017/model3d" xmlns:o="urn:schemas-microsoft-com:office:office" xmlns:oel="http://schemas.microsoft.com/office/2019/extlst" xmlns:r="http://schemas.openxmlformats.org/officeDocument/2006/relationships" xmlns:m="http://schemas.openxmlformats.org/officeDocument/2006/math" xmlns:v="urn:schemas-microsoft-com:vml" xmlns:wp14="http://schemas.microsoft.com/office/word/2010/wordprocessingDrawing" xmlns:wp="http://schemas.openxmlformats.org/drawingml/2006/wordprocessingDrawing" xmlns:w10="urn:schemas-microsoft-com:office:word" xmlns:w="http://schemas.openxmlformats.org/wordprocessingml/2006/main" xmlns:w14="http://schemas.microsoft.com/office/word/2010/wordml" xmlns:w15="http://schemas.microsoft.com/office/word/2012/wordml" xmlns:w16cex="http://schemas.microsoft.com/office/word/2018/wordml/cex" xmlns:w16cid="http://schemas.microsoft.com/office/word/2016/wordml/cid" xmlns:w16="http://schemas.microsoft.com/office/word/2018/wordml" xmlns:w16du="http://schemas.microsoft.com/office/word/2023/wordml/word16du" xmlns:w16sdtdh="http://schemas.microsoft.com/office/word/2020/wordml/sdtdatahash" xmlns:w16sdtfl="http://schemas.microsoft.com/office/word/2024/wordml/sdtformatlock" xmlns:w16se="http://schemas.microsoft.com/office/word/2015/wordml/symex" xmlns:wpg="http://schemas.microsoft.com/office/word/2010/wordprocessingGroup" xmlns:wpi="http://schemas.microsoft.com/office/word/2010/wordprocessingInk" xmlns:wne="http://schemas.microsoft.com/office/word/2006/wordml" xmlns:wps="http://schemas.microsoft.com/office/word/2010/wordprocessingShape" mc:Ignorable="w14 w15 w16se w16cid w16 w16cex w16sdtdh w16sdtfl w16du wp14">
+<w:document xmlns:wpc="http://schemas.microsoft.com/office/word/2010/wordprocessingCanvas" xmlns:cx="http://schemas.microsoft.com/office/drawing/2014/chartex" xmlns:cx1="http://schemas.microsoft.com/office/drawing/2015/9/8/chartex" xmlns:cx2="http://schemas.microsoft.com/office/drawing/2015/10/21/chartex" xmlns:cx3="http://schemas.microsoft.com/office/drawing/2016/5/9/chartex" xmlns:cx4="http://schemas.microsoft.com/office/drawing/2016/5/10/chartex" xmlns:cx5="http://schemas.microsoft.com/office/drawing/2016/5/11/chartex" xmlns:cx6="http://schemas.microsoft.com/office/drawing/2016/5/12/chartex" xmlns:cx7="http://schemas.microsoft.com/office/drawing/2016/5/13/chartex" xmlns:cx8="http://schemas.microsoft.com/office/drawing/2016/5/14/chartex" xmlns:mc="http://schemas.openxmlformats.org/markup-compatibility/2006" xmlns:aink="http://schemas.microsoft.com/office/drawing/2016/ink" xmlns:am3d="http://schemas.microsoft.com/office/drawing/2017/model3d" xmlns:o="urn:schemas-microsoft-com:office:office" xmlns:oel="http://schemas.microsoft.com/office/2019/extlst" xmlns:r="http://schemas.openxmlformats.org/officeDocument/2006/relationships" xmlns:m="http://schemas.openxmlformats.org/officeDocument/2006/math" xmlns:v="urn:schemas-microsoft-com:vml" xmlns:wp14="http://schemas.microsoft.com/office/word/2010/wordprocessingDrawing" xmlns:wp="http://schemas.openxmlformats.org/drawingml/2006/wordprocessingDrawing" xmlns:w10="urn:schemas-microsoft-com:office:word" xmlns:w="http://schemas.openxmlformats.org/wordprocessingml/2006/main" xmlns:w14="http://schemas.microsoft.com/office/word/2010/wordml" xmlns:w15="http://schemas.microsoft.com/office/word/2012/wordml" xmlns:w16cex="http://schemas.microsoft.com/office/word/2018/wordml/cex" xmlns:w16cid="http://schemas.microsoft.com/office/word/2016/wordml/cid" xmlns:w16="http://schemas.microsoft.com/office/word/2018/wordml" xmlns:w16sdtdh="http://schemas.microsoft.com/office/word/2020/wordml/sdtdatahash" xmlns:w16se="http://schemas.microsoft.com/office/word/2015/wordml/symex" xmlns:wpg="http://schemas.microsoft.com/office/word/2010/wordprocessingGroup" xmlns:wpi="http://schemas.microsoft.com/office/word/2010/wordprocessingInk" xmlns:wne="http://schemas.microsoft.com/office/word/2006/wordml" xmlns:wps="http://schemas.microsoft.com/office/word/2010/wordprocessingShape" mc:Ignorable="w14 w15 w16se w16cid w16 w16cex w16sdtdh wp14">
   <w:body>
     <w:p>
       <w:pPr>
@@ -689,15 +689,7 @@
         <w:t>nen</w:t>
       </w:r>
       <w:r>
-        <w:t xml:space="preserve">t toutes les données à insérer et voici ce que j’ai fait pour </w:t>
-      </w:r>
-      <w:proofErr w:type="gramStart"/>
-      <w:r>
-        <w:t>les loader</w:t>
-      </w:r>
-      <w:proofErr w:type="gramEnd"/>
-      <w:r>
-        <w:t>.</w:t>
+        <w:t>t toutes les données à insérer et voici ce que j’ai fait pour les loader.</w:t>
       </w:r>
     </w:p>
     <w:p>
@@ -751,10 +743,12 @@
     </w:p>
     <w:p>
       <w:r>
-        <w:t>LOAD DATA INFILE '</w:t>
-      </w:r>
-      <w:r>
-        <w:t>/var/lib/</w:t>
+        <w:t>-- table 1</w:t>
+      </w:r>
+    </w:p>
+    <w:p>
+      <w:r>
+        <w:t>LOAD DATA INFILE '/var/lib/</w:t>
       </w:r>
       <w:proofErr w:type="spellStart"/>
       <w:r>
@@ -774,234 +768,1324 @@
       </w:r>
     </w:p>
     <w:p>
-      <w:r>
+      <w:pPr>
+        <w:rPr>
+          <w:lang w:val="en-US"/>
+        </w:rPr>
+      </w:pPr>
+      <w:r>
+        <w:tab/>
+      </w:r>
+      <w:r>
+        <w:rPr>
+          <w:lang w:val="en-US"/>
+        </w:rPr>
+        <w:t xml:space="preserve">INTO TABLE </w:t>
+      </w:r>
+      <w:proofErr w:type="spellStart"/>
+      <w:r>
+        <w:rPr>
+          <w:lang w:val="en-US"/>
+        </w:rPr>
+        <w:t>t_produit</w:t>
+      </w:r>
+      <w:proofErr w:type="spellEnd"/>
+    </w:p>
+    <w:p>
+      <w:pPr>
+        <w:rPr>
+          <w:lang w:val="en-US"/>
+        </w:rPr>
+      </w:pPr>
+      <w:r>
+        <w:rPr>
+          <w:lang w:val="en-US"/>
+        </w:rPr>
+        <w:tab/>
+        <w:t>CHARACTER SET UTF8</w:t>
+      </w:r>
+    </w:p>
+    <w:p>
+      <w:pPr>
+        <w:rPr>
+          <w:lang w:val="en-US"/>
+        </w:rPr>
+      </w:pPr>
+      <w:r>
+        <w:rPr>
+          <w:lang w:val="en-US"/>
+        </w:rPr>
+        <w:tab/>
+        <w:t>COLUMNS TERMINATED BY '</w:t>
+      </w:r>
+      <w:r>
+        <w:rPr>
+          <w:lang w:val="en-US"/>
+        </w:rPr>
+        <w:t>\t</w:t>
+      </w:r>
+      <w:r>
+        <w:rPr>
+          <w:lang w:val="en-US"/>
+        </w:rPr>
+        <w:t>'</w:t>
+      </w:r>
+    </w:p>
+    <w:p>
+      <w:pPr>
+        <w:rPr>
+          <w:lang w:val="en-US"/>
+        </w:rPr>
+      </w:pPr>
+      <w:r>
+        <w:rPr>
+          <w:lang w:val="en-US"/>
+        </w:rPr>
+        <w:tab/>
+        <w:t>IGNORE 1 LINES;</w:t>
+      </w:r>
+    </w:p>
+    <w:p>
+      <w:pPr>
+        <w:rPr>
+          <w:lang w:val="en-US"/>
+        </w:rPr>
+      </w:pPr>
+    </w:p>
+    <w:p>
+      <w:pPr>
+        <w:rPr>
+          <w:lang w:val="en-US"/>
+        </w:rPr>
+      </w:pPr>
+      <w:r>
+        <w:rPr>
+          <w:lang w:val="en-US"/>
+        </w:rPr>
+        <w:t>-- table 2</w:t>
+      </w:r>
+    </w:p>
+    <w:p>
+      <w:r>
+        <w:t>LOAD DATA INFILE '/var/lib/</w:t>
+      </w:r>
+      <w:proofErr w:type="spellStart"/>
+      <w:r>
+        <w:t>mysql</w:t>
+      </w:r>
+      <w:proofErr w:type="spellEnd"/>
+      <w:r>
+        <w:t>-files/</w:t>
+      </w:r>
+      <w:proofErr w:type="spellStart"/>
+      <w:r>
+        <w:t>t_livreur.tsv</w:t>
+      </w:r>
+      <w:proofErr w:type="spellEnd"/>
+      <w:r>
+        <w:t xml:space="preserve">' </w:t>
+      </w:r>
+    </w:p>
+    <w:p>
+      <w:pPr>
+        <w:rPr>
+          <w:lang w:val="en-US"/>
+        </w:rPr>
+      </w:pPr>
+      <w:r>
+        <w:tab/>
+      </w:r>
+      <w:r>
+        <w:rPr>
+          <w:lang w:val="en-US"/>
+        </w:rPr>
+        <w:t xml:space="preserve">INTO TABLE </w:t>
+      </w:r>
+      <w:proofErr w:type="spellStart"/>
+      <w:r>
+        <w:rPr>
+          <w:lang w:val="en-US"/>
+        </w:rPr>
+        <w:t>t_livreur</w:t>
+      </w:r>
+      <w:proofErr w:type="spellEnd"/>
+    </w:p>
+    <w:p>
+      <w:pPr>
+        <w:rPr>
+          <w:lang w:val="en-US"/>
+        </w:rPr>
+      </w:pPr>
+      <w:r>
+        <w:rPr>
+          <w:lang w:val="en-US"/>
+        </w:rPr>
+        <w:tab/>
+        <w:t>CHARACTER SET UTF8</w:t>
+      </w:r>
+    </w:p>
+    <w:p>
+      <w:pPr>
+        <w:rPr>
+          <w:lang w:val="en-US"/>
+        </w:rPr>
+      </w:pPr>
+      <w:r>
+        <w:rPr>
+          <w:lang w:val="en-US"/>
+        </w:rPr>
+        <w:tab/>
+        <w:t>COLUMNS TERMINATED BY '</w:t>
+      </w:r>
+      <w:r>
+        <w:rPr>
+          <w:lang w:val="en-US"/>
+        </w:rPr>
+        <w:t>\t</w:t>
+      </w:r>
+      <w:r>
+        <w:rPr>
+          <w:lang w:val="en-US"/>
+        </w:rPr>
+        <w:t>'</w:t>
+      </w:r>
+    </w:p>
+    <w:p>
+      <w:pPr>
+        <w:rPr>
+          <w:lang w:val="en-US"/>
+        </w:rPr>
+      </w:pPr>
+      <w:r>
+        <w:rPr>
+          <w:lang w:val="en-US"/>
+        </w:rPr>
+        <w:tab/>
+        <w:t>IGNORE 1 LINES;</w:t>
+      </w:r>
+    </w:p>
+    <w:p>
+      <w:pPr>
+        <w:rPr>
+          <w:lang w:val="en-US"/>
+        </w:rPr>
+      </w:pPr>
+    </w:p>
+    <w:p>
+      <w:r>
+        <w:t>-- t</w:t>
+      </w:r>
+      <w:r>
+        <w:t>able 3</w:t>
+      </w:r>
+    </w:p>
+    <w:p>
+      <w:r>
+        <w:t>LOAD DATA INFILE '/var/lib/</w:t>
+      </w:r>
+      <w:proofErr w:type="spellStart"/>
+      <w:r>
+        <w:t>mysql</w:t>
+      </w:r>
+      <w:proofErr w:type="spellEnd"/>
+      <w:r>
+        <w:t>-files/</w:t>
+      </w:r>
+      <w:proofErr w:type="spellStart"/>
+      <w:r>
+        <w:t>t_client.tsv</w:t>
+      </w:r>
+      <w:proofErr w:type="spellEnd"/>
+      <w:r>
+        <w:t xml:space="preserve">' </w:t>
+      </w:r>
+    </w:p>
+    <w:p>
+      <w:pPr>
+        <w:rPr>
+          <w:lang w:val="en-US"/>
+        </w:rPr>
+      </w:pPr>
+      <w:r>
+        <w:tab/>
+      </w:r>
+      <w:r>
+        <w:rPr>
+          <w:lang w:val="en-US"/>
+        </w:rPr>
+        <w:t xml:space="preserve">INTO TABLE </w:t>
+      </w:r>
+      <w:proofErr w:type="spellStart"/>
+      <w:r>
+        <w:rPr>
+          <w:lang w:val="en-US"/>
+        </w:rPr>
+        <w:t>t_client</w:t>
+      </w:r>
+      <w:proofErr w:type="spellEnd"/>
+    </w:p>
+    <w:p>
+      <w:pPr>
+        <w:rPr>
+          <w:lang w:val="en-US"/>
+        </w:rPr>
+      </w:pPr>
+      <w:r>
+        <w:rPr>
+          <w:lang w:val="en-US"/>
+        </w:rPr>
+        <w:tab/>
+        <w:t>CHARACTER SET UTF8</w:t>
+      </w:r>
+    </w:p>
+    <w:p>
+      <w:pPr>
+        <w:rPr>
+          <w:lang w:val="en-US"/>
+        </w:rPr>
+      </w:pPr>
+      <w:r>
+        <w:rPr>
+          <w:lang w:val="en-US"/>
+        </w:rPr>
+        <w:tab/>
+        <w:t>COLUMNS TERMINATED BY '</w:t>
+      </w:r>
+      <w:r>
+        <w:rPr>
+          <w:lang w:val="en-US"/>
+        </w:rPr>
+        <w:t>\t</w:t>
+      </w:r>
+      <w:r>
+        <w:rPr>
+          <w:lang w:val="en-US"/>
+        </w:rPr>
+        <w:t>'</w:t>
+      </w:r>
+    </w:p>
+    <w:p>
+      <w:pPr>
+        <w:rPr>
+          <w:lang w:val="en-US"/>
+        </w:rPr>
+      </w:pPr>
+      <w:r>
+        <w:rPr>
+          <w:lang w:val="en-US"/>
+        </w:rPr>
+        <w:tab/>
+        <w:t>IGNORE 1 LINES;</w:t>
+      </w:r>
+    </w:p>
+    <w:p>
+      <w:pPr>
+        <w:rPr>
+          <w:lang w:val="en-US"/>
+        </w:rPr>
+      </w:pPr>
+    </w:p>
+    <w:p>
+      <w:pPr>
+        <w:keepNext/>
+        <w:rPr>
+          <w:lang w:val="en-US"/>
+        </w:rPr>
+      </w:pPr>
+      <w:r>
+        <w:rPr>
+          <w:lang w:val="en-US"/>
+        </w:rPr>
+        <w:lastRenderedPageBreak/>
+        <w:t>-</w:t>
+      </w:r>
+      <w:r>
+        <w:rPr>
+          <w:lang w:val="en-US"/>
+        </w:rPr>
+        <w:t xml:space="preserve">- </w:t>
+      </w:r>
+      <w:r>
+        <w:rPr>
+          <w:lang w:val="en-US"/>
+        </w:rPr>
+        <w:t>table</w:t>
+      </w:r>
+      <w:r>
+        <w:rPr>
+          <w:lang w:val="en-US"/>
+        </w:rPr>
+        <w:t xml:space="preserve"> 4</w:t>
+      </w:r>
+    </w:p>
+    <w:p>
+      <w:pPr>
+        <w:keepNext/>
+        <w:rPr>
+          <w:lang w:val="en-US"/>
+        </w:rPr>
+      </w:pPr>
+      <w:r>
+        <w:rPr>
+          <w:lang w:val="en-US"/>
+        </w:rPr>
+        <w:t>LOAD DATA INFILE '/var/lib/</w:t>
+      </w:r>
+      <w:proofErr w:type="spellStart"/>
+      <w:r>
+        <w:rPr>
+          <w:lang w:val="en-US"/>
+        </w:rPr>
+        <w:t>mysql</w:t>
+      </w:r>
+      <w:proofErr w:type="spellEnd"/>
+      <w:r>
+        <w:rPr>
+          <w:lang w:val="en-US"/>
+        </w:rPr>
+        <w:t>-files/</w:t>
+      </w:r>
+      <w:proofErr w:type="spellStart"/>
+      <w:r>
+        <w:rPr>
+          <w:lang w:val="en-US"/>
+        </w:rPr>
+        <w:t>t_adresse.tsv</w:t>
+      </w:r>
+      <w:proofErr w:type="spellEnd"/>
+      <w:r>
+        <w:rPr>
+          <w:lang w:val="en-US"/>
+        </w:rPr>
+        <w:t xml:space="preserve">' </w:t>
+      </w:r>
+    </w:p>
+    <w:p>
+      <w:pPr>
+        <w:keepNext/>
+        <w:rPr>
+          <w:lang w:val="en-US"/>
+        </w:rPr>
+      </w:pPr>
+      <w:r>
+        <w:rPr>
+          <w:lang w:val="en-US"/>
+        </w:rPr>
         <w:tab/>
         <w:t xml:space="preserve">INTO TABLE </w:t>
       </w:r>
       <w:proofErr w:type="spellStart"/>
       <w:r>
-        <w:t>t_</w:t>
-      </w:r>
-      <w:r>
-        <w:t>produit</w:t>
-      </w:r>
-      <w:proofErr w:type="spellEnd"/>
-    </w:p>
-    <w:p>
-      <w:r>
+        <w:rPr>
+          <w:lang w:val="en-US"/>
+        </w:rPr>
+        <w:t>t_adresse</w:t>
+      </w:r>
+      <w:proofErr w:type="spellEnd"/>
+    </w:p>
+    <w:p>
+      <w:pPr>
+        <w:keepNext/>
+        <w:rPr>
+          <w:lang w:val="en-US"/>
+        </w:rPr>
+      </w:pPr>
+      <w:r>
+        <w:rPr>
+          <w:lang w:val="en-US"/>
+        </w:rPr>
         <w:tab/>
-        <w:t xml:space="preserve">CHARACTER SET </w:t>
-      </w:r>
-      <w:r>
-        <w:t>UTF8</w:t>
-      </w:r>
-    </w:p>
-    <w:p>
-      <w:r>
+        <w:t>CHARACTER SET UTF8</w:t>
+      </w:r>
+    </w:p>
+    <w:p>
+      <w:pPr>
+        <w:keepNext/>
+        <w:rPr>
+          <w:lang w:val="en-US"/>
+        </w:rPr>
+      </w:pPr>
+      <w:r>
+        <w:rPr>
+          <w:lang w:val="en-US"/>
+        </w:rPr>
         <w:tab/>
         <w:t>COLUMNS TERMINATED BY '</w:t>
       </w:r>
       <w:r>
+        <w:rPr>
+          <w:lang w:val="en-US"/>
+        </w:rPr>
+        <w:t>\t</w:t>
+      </w:r>
+      <w:r>
+        <w:rPr>
+          <w:lang w:val="en-US"/>
+        </w:rPr>
+        <w:t>'</w:t>
+      </w:r>
+    </w:p>
+    <w:p>
+      <w:pPr>
+        <w:keepNext/>
+      </w:pPr>
+      <w:r>
+        <w:rPr>
+          <w:lang w:val="en-US"/>
+        </w:rPr>
         <w:tab/>
       </w:r>
       <w:r>
-        <w:t>'</w:t>
-      </w:r>
-    </w:p>
-    <w:p>
-      <w:r>
-        <w:tab/>
-        <w:t xml:space="preserve">IGNORE 1 </w:t>
-      </w:r>
-      <w:proofErr w:type="gramStart"/>
-      <w:r>
-        <w:t>LINES;</w:t>
-      </w:r>
-      <w:proofErr w:type="gramEnd"/>
-    </w:p>
-    <w:p/>
-    <w:p>
-      <w:r>
+        <w:t>IGNORE 1 LINES</w:t>
+      </w:r>
+    </w:p>
+    <w:p>
+      <w:pPr>
+        <w:keepNext/>
+      </w:pPr>
+      <w:r>
+        <w:t xml:space="preserve">    (`</w:t>
+      </w:r>
+      <w:proofErr w:type="spellStart"/>
+      <w:r>
+        <w:t>adresse_id</w:t>
+      </w:r>
+      <w:proofErr w:type="spellEnd"/>
+      <w:r>
+        <w:t>`, `</w:t>
+      </w:r>
+      <w:proofErr w:type="spellStart"/>
+      <w:r>
+        <w:t>client_fk</w:t>
+      </w:r>
+      <w:proofErr w:type="spellEnd"/>
+      <w:r>
+        <w:t>`, `rue`, `</w:t>
+      </w:r>
+      <w:proofErr w:type="spellStart"/>
+      <w:r>
+        <w:t>npa</w:t>
+      </w:r>
+      <w:proofErr w:type="spellEnd"/>
+      <w:r>
+        <w:t>`, `</w:t>
+      </w:r>
+      <w:proofErr w:type="spellStart"/>
+      <w:r>
+        <w:t>localite</w:t>
+      </w:r>
+      <w:proofErr w:type="spellEnd"/>
+      <w:r>
+        <w:t>`, `latitude`, `longitude`);</w:t>
+      </w:r>
+    </w:p>
+    <w:p>
+      <w:pPr>
+        <w:keepNext/>
+      </w:pPr>
+    </w:p>
+    <w:p>
+      <w:pPr>
+        <w:keepNext/>
+        <w:rPr>
+          <w:lang w:val="en-US"/>
+        </w:rPr>
+      </w:pPr>
+      <w:r>
+        <w:rPr>
+          <w:lang w:val="en-US"/>
+        </w:rPr>
+        <w:t>-- table 5</w:t>
+      </w:r>
+    </w:p>
+    <w:p>
+      <w:pPr>
+        <w:rPr>
+          <w:lang w:val="en-US"/>
+        </w:rPr>
+      </w:pPr>
+      <w:r>
+        <w:rPr>
+          <w:lang w:val="en-US"/>
+        </w:rPr>
         <w:t>LOAD DATA INFILE '/var/lib/</w:t>
       </w:r>
       <w:proofErr w:type="spellStart"/>
       <w:r>
+        <w:rPr>
+          <w:lang w:val="en-US"/>
+        </w:rPr>
         <w:t>mysql</w:t>
       </w:r>
       <w:proofErr w:type="spellEnd"/>
       <w:r>
+        <w:rPr>
+          <w:lang w:val="en-US"/>
+        </w:rPr>
         <w:t>-files/</w:t>
       </w:r>
       <w:proofErr w:type="spellStart"/>
       <w:r>
-        <w:t>t_</w:t>
-      </w:r>
-      <w:r>
-        <w:t>livreur</w:t>
-      </w:r>
-      <w:r>
-        <w:t>.tsv</w:t>
-      </w:r>
-      <w:proofErr w:type="spellEnd"/>
-      <w:r>
+        <w:rPr>
+          <w:lang w:val="en-US"/>
+        </w:rPr>
+        <w:t>t_commande.tsv</w:t>
+      </w:r>
+      <w:proofErr w:type="spellEnd"/>
+      <w:r>
+        <w:rPr>
+          <w:lang w:val="en-US"/>
+        </w:rPr>
         <w:t xml:space="preserve">' </w:t>
       </w:r>
     </w:p>
     <w:p>
-      <w:r>
+      <w:pPr>
+        <w:rPr>
+          <w:lang w:val="en-US"/>
+        </w:rPr>
+      </w:pPr>
+      <w:r>
+        <w:rPr>
+          <w:lang w:val="en-US"/>
+        </w:rPr>
         <w:tab/>
         <w:t xml:space="preserve">INTO TABLE </w:t>
       </w:r>
       <w:proofErr w:type="spellStart"/>
       <w:r>
-        <w:t>t_</w:t>
-      </w:r>
-      <w:r>
-        <w:t>livreur</w:t>
-      </w:r>
-      <w:proofErr w:type="spellEnd"/>
-    </w:p>
-    <w:p>
-      <w:r>
+        <w:rPr>
+          <w:lang w:val="en-US"/>
+        </w:rPr>
+        <w:t>t_commande</w:t>
+      </w:r>
+      <w:proofErr w:type="spellEnd"/>
+    </w:p>
+    <w:p>
+      <w:pPr>
+        <w:rPr>
+          <w:lang w:val="en-US"/>
+        </w:rPr>
+      </w:pPr>
+      <w:r>
+        <w:rPr>
+          <w:lang w:val="en-US"/>
+        </w:rPr>
         <w:tab/>
         <w:t>CHARACTER SET UTF8</w:t>
       </w:r>
     </w:p>
     <w:p>
-      <w:r>
+      <w:pPr>
+        <w:rPr>
+          <w:lang w:val="en-US"/>
+        </w:rPr>
+      </w:pPr>
+      <w:r>
+        <w:rPr>
+          <w:lang w:val="en-US"/>
+        </w:rPr>
         <w:tab/>
-        <w:t>COLUMNS TERMINATED BY '</w:t>
-      </w:r>
-      <w:r>
+        <w:t>COLUMNS TERMINATED BY '\t'</w:t>
+      </w:r>
+    </w:p>
+    <w:p>
+      <w:pPr>
+        <w:rPr>
+          <w:lang w:val="en-US"/>
+        </w:rPr>
+      </w:pPr>
+      <w:r>
+        <w:rPr>
+          <w:lang w:val="en-US"/>
+        </w:rPr>
         <w:tab/>
-        <w:t>'</w:t>
-      </w:r>
-    </w:p>
-    <w:p>
-      <w:r>
-        <w:tab/>
-        <w:t xml:space="preserve">IGNORE 1 </w:t>
-      </w:r>
-      <w:proofErr w:type="gramStart"/>
-      <w:r>
-        <w:t>LINES;</w:t>
-      </w:r>
-      <w:proofErr w:type="gramEnd"/>
-    </w:p>
-    <w:p/>
-    <w:p>
-      <w:r>
+        <w:t>IGNORE 1 LINES</w:t>
+      </w:r>
+    </w:p>
+    <w:p>
+      <w:pPr>
+        <w:rPr>
+          <w:lang w:val="en-US"/>
+        </w:rPr>
+      </w:pPr>
+      <w:r>
+        <w:rPr>
+          <w:lang w:val="en-US"/>
+        </w:rPr>
+        <w:t xml:space="preserve">    (</w:t>
+      </w:r>
+      <w:proofErr w:type="spellStart"/>
+      <w:r>
+        <w:rPr>
+          <w:lang w:val="en-US"/>
+        </w:rPr>
+        <w:t>commande_id</w:t>
+      </w:r>
+      <w:proofErr w:type="spellEnd"/>
+      <w:r>
+        <w:rPr>
+          <w:lang w:val="en-US"/>
+        </w:rPr>
+        <w:t xml:space="preserve">, </w:t>
+      </w:r>
+      <w:proofErr w:type="spellStart"/>
+      <w:r>
+        <w:rPr>
+          <w:lang w:val="en-US"/>
+        </w:rPr>
+        <w:t>client_fk</w:t>
+      </w:r>
+      <w:proofErr w:type="spellEnd"/>
+      <w:r>
+        <w:rPr>
+          <w:lang w:val="en-US"/>
+        </w:rPr>
+        <w:t xml:space="preserve">, type, @vAdresse, @mytimestamp, </w:t>
+      </w:r>
+      <w:proofErr w:type="spellStart"/>
+      <w:r>
+        <w:rPr>
+          <w:lang w:val="en-US"/>
+        </w:rPr>
+        <w:t>statut</w:t>
+      </w:r>
+      <w:proofErr w:type="spellEnd"/>
+      <w:r>
+        <w:rPr>
+          <w:lang w:val="en-US"/>
+        </w:rPr>
+        <w:t>)</w:t>
+      </w:r>
+    </w:p>
+    <w:p>
+      <w:pPr>
+        <w:rPr>
+          <w:lang w:val="en-US"/>
+        </w:rPr>
+      </w:pPr>
+      <w:r>
+        <w:rPr>
+          <w:lang w:val="en-US"/>
+        </w:rPr>
+        <w:t xml:space="preserve">    SET </w:t>
+      </w:r>
+      <w:proofErr w:type="spellStart"/>
+      <w:r>
+        <w:rPr>
+          <w:lang w:val="en-US"/>
+        </w:rPr>
+        <w:t>adresse_fk</w:t>
+      </w:r>
+      <w:proofErr w:type="spellEnd"/>
+      <w:r>
+        <w:rPr>
+          <w:lang w:val="en-US"/>
+        </w:rPr>
+        <w:t xml:space="preserve"> = NULLIF(@vAdresse,''), </w:t>
+      </w:r>
+    </w:p>
+    <w:p>
+      <w:r>
+        <w:rPr>
+          <w:lang w:val="en-US"/>
+        </w:rPr>
+        <w:t xml:space="preserve">    </w:t>
+      </w:r>
+      <w:proofErr w:type="spellStart"/>
+      <w:r>
+        <w:t>date_et_heure</w:t>
+      </w:r>
+      <w:proofErr w:type="spellEnd"/>
+      <w:r>
+        <w:t xml:space="preserve"> =STR_TO_DATE(@mytimestamp, '%</w:t>
+      </w:r>
+      <w:proofErr w:type="spellStart"/>
+      <w:r>
+        <w:t>d.%m.%Y</w:t>
+      </w:r>
+      <w:proofErr w:type="spellEnd"/>
+      <w:r>
+        <w:t xml:space="preserve"> %H:%i');</w:t>
+      </w:r>
+      <w:bookmarkStart w:id="2" w:name="_Toc210392959"/>
+    </w:p>
+    <w:p>
+      <w:pPr>
+        <w:keepNext/>
+      </w:pPr>
+      <w:r>
+        <w:t>-- table 6</w:t>
+      </w:r>
+    </w:p>
+    <w:p>
+      <w:pPr>
+        <w:pStyle w:val="Titre2"/>
+        <w:rPr>
+          <w:rFonts w:asciiTheme="minorHAnsi" w:eastAsiaTheme="minorHAnsi" w:hAnsiTheme="minorHAnsi" w:cstheme="minorBidi"/>
+          <w:color w:val="auto"/>
+          <w:sz w:val="24"/>
+          <w:szCs w:val="24"/>
+        </w:rPr>
+      </w:pPr>
+      <w:r>
+        <w:rPr>
+          <w:rFonts w:asciiTheme="minorHAnsi" w:eastAsiaTheme="minorHAnsi" w:hAnsiTheme="minorHAnsi" w:cstheme="minorBidi"/>
+          <w:color w:val="auto"/>
+          <w:sz w:val="24"/>
+          <w:szCs w:val="24"/>
+        </w:rPr>
         <w:t>LOAD DATA INFILE '/var/lib/</w:t>
       </w:r>
       <w:proofErr w:type="spellStart"/>
       <w:r>
+        <w:rPr>
+          <w:rFonts w:asciiTheme="minorHAnsi" w:eastAsiaTheme="minorHAnsi" w:hAnsiTheme="minorHAnsi" w:cstheme="minorBidi"/>
+          <w:color w:val="auto"/>
+          <w:sz w:val="24"/>
+          <w:szCs w:val="24"/>
+        </w:rPr>
         <w:t>mysql</w:t>
       </w:r>
       <w:proofErr w:type="spellEnd"/>
       <w:r>
+        <w:rPr>
+          <w:rFonts w:asciiTheme="minorHAnsi" w:eastAsiaTheme="minorHAnsi" w:hAnsiTheme="minorHAnsi" w:cstheme="minorBidi"/>
+          <w:color w:val="auto"/>
+          <w:sz w:val="24"/>
+          <w:szCs w:val="24"/>
+        </w:rPr>
         <w:t>-files/</w:t>
       </w:r>
       <w:proofErr w:type="spellStart"/>
       <w:r>
-        <w:t>t_</w:t>
-      </w:r>
-      <w:r>
-        <w:t>client</w:t>
-      </w:r>
-      <w:r>
-        <w:t>.tsv</w:t>
-      </w:r>
-      <w:proofErr w:type="spellEnd"/>
-      <w:r>
+        <w:rPr>
+          <w:rFonts w:asciiTheme="minorHAnsi" w:eastAsiaTheme="minorHAnsi" w:hAnsiTheme="minorHAnsi" w:cstheme="minorBidi"/>
+          <w:color w:val="auto"/>
+          <w:sz w:val="24"/>
+          <w:szCs w:val="24"/>
+        </w:rPr>
+        <w:t>t_ligne_commande.tsv</w:t>
+      </w:r>
+      <w:proofErr w:type="spellEnd"/>
+      <w:r>
+        <w:rPr>
+          <w:rFonts w:asciiTheme="minorHAnsi" w:eastAsiaTheme="minorHAnsi" w:hAnsiTheme="minorHAnsi" w:cstheme="minorBidi"/>
+          <w:color w:val="auto"/>
+          <w:sz w:val="24"/>
+          <w:szCs w:val="24"/>
+        </w:rPr>
         <w:t xml:space="preserve">' </w:t>
       </w:r>
     </w:p>
     <w:p>
-      <w:r>
+      <w:pPr>
+        <w:pStyle w:val="Titre2"/>
+        <w:rPr>
+          <w:rFonts w:asciiTheme="minorHAnsi" w:eastAsiaTheme="minorHAnsi" w:hAnsiTheme="minorHAnsi" w:cstheme="minorBidi"/>
+          <w:color w:val="auto"/>
+          <w:sz w:val="24"/>
+          <w:szCs w:val="24"/>
+        </w:rPr>
+      </w:pPr>
+      <w:r>
+        <w:rPr>
+          <w:rFonts w:asciiTheme="minorHAnsi" w:eastAsiaTheme="minorHAnsi" w:hAnsiTheme="minorHAnsi" w:cstheme="minorBidi"/>
+          <w:color w:val="auto"/>
+          <w:sz w:val="24"/>
+          <w:szCs w:val="24"/>
+        </w:rPr>
         <w:tab/>
         <w:t xml:space="preserve">INTO TABLE </w:t>
       </w:r>
       <w:proofErr w:type="spellStart"/>
       <w:r>
-        <w:t>t_</w:t>
-      </w:r>
-      <w:r>
-        <w:t>client</w:t>
-      </w:r>
-      <w:proofErr w:type="spellEnd"/>
-    </w:p>
-    <w:p>
-      <w:r>
+        <w:rPr>
+          <w:rFonts w:asciiTheme="minorHAnsi" w:eastAsiaTheme="minorHAnsi" w:hAnsiTheme="minorHAnsi" w:cstheme="minorBidi"/>
+          <w:color w:val="auto"/>
+          <w:sz w:val="24"/>
+          <w:szCs w:val="24"/>
+        </w:rPr>
+        <w:t>t_ligne_de_commande</w:t>
+      </w:r>
+      <w:proofErr w:type="spellEnd"/>
+    </w:p>
+    <w:p>
+      <w:pPr>
+        <w:pStyle w:val="Titre2"/>
+        <w:rPr>
+          <w:rFonts w:asciiTheme="minorHAnsi" w:eastAsiaTheme="minorHAnsi" w:hAnsiTheme="minorHAnsi" w:cstheme="minorBidi"/>
+          <w:color w:val="auto"/>
+          <w:sz w:val="24"/>
+          <w:szCs w:val="24"/>
+          <w:lang w:val="en-US"/>
+        </w:rPr>
+      </w:pPr>
+      <w:r>
+        <w:rPr>
+          <w:rFonts w:asciiTheme="minorHAnsi" w:eastAsiaTheme="minorHAnsi" w:hAnsiTheme="minorHAnsi" w:cstheme="minorBidi"/>
+          <w:color w:val="auto"/>
+          <w:sz w:val="24"/>
+          <w:szCs w:val="24"/>
+        </w:rPr>
+        <w:tab/>
+      </w:r>
+      <w:r>
+        <w:rPr>
+          <w:rFonts w:asciiTheme="minorHAnsi" w:eastAsiaTheme="minorHAnsi" w:hAnsiTheme="minorHAnsi" w:cstheme="minorBidi"/>
+          <w:color w:val="auto"/>
+          <w:sz w:val="24"/>
+          <w:szCs w:val="24"/>
+          <w:lang w:val="en-US"/>
+        </w:rPr>
+        <w:t>CHARACTER SET UTF8</w:t>
+      </w:r>
+    </w:p>
+    <w:p>
+      <w:pPr>
+        <w:pStyle w:val="Titre2"/>
+        <w:rPr>
+          <w:rFonts w:asciiTheme="minorHAnsi" w:eastAsiaTheme="minorHAnsi" w:hAnsiTheme="minorHAnsi" w:cstheme="minorBidi"/>
+          <w:color w:val="auto"/>
+          <w:sz w:val="24"/>
+          <w:szCs w:val="24"/>
+          <w:lang w:val="en-US"/>
+        </w:rPr>
+      </w:pPr>
+      <w:r>
+        <w:rPr>
+          <w:rFonts w:asciiTheme="minorHAnsi" w:eastAsiaTheme="minorHAnsi" w:hAnsiTheme="minorHAnsi" w:cstheme="minorBidi"/>
+          <w:color w:val="auto"/>
+          <w:sz w:val="24"/>
+          <w:szCs w:val="24"/>
+          <w:lang w:val="en-US"/>
+        </w:rPr>
+        <w:tab/>
+        <w:t>COLUMNS TERMINATED BY '\t'</w:t>
+      </w:r>
+    </w:p>
+    <w:p>
+      <w:pPr>
+        <w:pStyle w:val="Titre2"/>
+        <w:rPr>
+          <w:rFonts w:asciiTheme="minorHAnsi" w:eastAsiaTheme="minorHAnsi" w:hAnsiTheme="minorHAnsi" w:cstheme="minorBidi"/>
+          <w:color w:val="auto"/>
+          <w:sz w:val="24"/>
+          <w:szCs w:val="24"/>
+        </w:rPr>
+      </w:pPr>
+      <w:r>
+        <w:rPr>
+          <w:rFonts w:asciiTheme="minorHAnsi" w:eastAsiaTheme="minorHAnsi" w:hAnsiTheme="minorHAnsi" w:cstheme="minorBidi"/>
+          <w:color w:val="auto"/>
+          <w:sz w:val="24"/>
+          <w:szCs w:val="24"/>
+          <w:lang w:val="en-US"/>
+        </w:rPr>
+        <w:tab/>
+      </w:r>
+      <w:r>
+        <w:rPr>
+          <w:rFonts w:asciiTheme="minorHAnsi" w:eastAsiaTheme="minorHAnsi" w:hAnsiTheme="minorHAnsi" w:cstheme="minorBidi"/>
+          <w:color w:val="auto"/>
+          <w:sz w:val="24"/>
+          <w:szCs w:val="24"/>
+        </w:rPr>
+        <w:t>IGNORE 1 LINES</w:t>
+      </w:r>
+    </w:p>
+    <w:p>
+      <w:pPr>
+        <w:pStyle w:val="Titre2"/>
+        <w:rPr>
+          <w:rFonts w:asciiTheme="minorHAnsi" w:eastAsiaTheme="minorHAnsi" w:hAnsiTheme="minorHAnsi" w:cstheme="minorBidi"/>
+          <w:color w:val="auto"/>
+          <w:sz w:val="24"/>
+          <w:szCs w:val="24"/>
+        </w:rPr>
+      </w:pPr>
+      <w:r>
+        <w:rPr>
+          <w:rFonts w:asciiTheme="minorHAnsi" w:eastAsiaTheme="minorHAnsi" w:hAnsiTheme="minorHAnsi" w:cstheme="minorBidi"/>
+          <w:color w:val="auto"/>
+          <w:sz w:val="24"/>
+          <w:szCs w:val="24"/>
+        </w:rPr>
+        <w:t xml:space="preserve">    (`</w:t>
+      </w:r>
+      <w:proofErr w:type="spellStart"/>
+      <w:r>
+        <w:rPr>
+          <w:rFonts w:asciiTheme="minorHAnsi" w:eastAsiaTheme="minorHAnsi" w:hAnsiTheme="minorHAnsi" w:cstheme="minorBidi"/>
+          <w:color w:val="auto"/>
+          <w:sz w:val="24"/>
+          <w:szCs w:val="24"/>
+        </w:rPr>
+        <w:t>ligne_de_commande_id</w:t>
+      </w:r>
+      <w:proofErr w:type="spellEnd"/>
+      <w:r>
+        <w:rPr>
+          <w:rFonts w:asciiTheme="minorHAnsi" w:eastAsiaTheme="minorHAnsi" w:hAnsiTheme="minorHAnsi" w:cstheme="minorBidi"/>
+          <w:color w:val="auto"/>
+          <w:sz w:val="24"/>
+          <w:szCs w:val="24"/>
+        </w:rPr>
+        <w:t>`, `</w:t>
+      </w:r>
+      <w:proofErr w:type="spellStart"/>
+      <w:r>
+        <w:rPr>
+          <w:rFonts w:asciiTheme="minorHAnsi" w:eastAsiaTheme="minorHAnsi" w:hAnsiTheme="minorHAnsi" w:cstheme="minorBidi"/>
+          <w:color w:val="auto"/>
+          <w:sz w:val="24"/>
+          <w:szCs w:val="24"/>
+        </w:rPr>
+        <w:t>commande_fk</w:t>
+      </w:r>
+      <w:proofErr w:type="spellEnd"/>
+      <w:r>
+        <w:rPr>
+          <w:rFonts w:asciiTheme="minorHAnsi" w:eastAsiaTheme="minorHAnsi" w:hAnsiTheme="minorHAnsi" w:cstheme="minorBidi"/>
+          <w:color w:val="auto"/>
+          <w:sz w:val="24"/>
+          <w:szCs w:val="24"/>
+        </w:rPr>
+        <w:t>`, `</w:t>
+      </w:r>
+      <w:proofErr w:type="spellStart"/>
+      <w:r>
+        <w:rPr>
+          <w:rFonts w:asciiTheme="minorHAnsi" w:eastAsiaTheme="minorHAnsi" w:hAnsiTheme="minorHAnsi" w:cstheme="minorBidi"/>
+          <w:color w:val="auto"/>
+          <w:sz w:val="24"/>
+          <w:szCs w:val="24"/>
+        </w:rPr>
+        <w:t>produit_fk</w:t>
+      </w:r>
+      <w:proofErr w:type="spellEnd"/>
+      <w:r>
+        <w:rPr>
+          <w:rFonts w:asciiTheme="minorHAnsi" w:eastAsiaTheme="minorHAnsi" w:hAnsiTheme="minorHAnsi" w:cstheme="minorBidi"/>
+          <w:color w:val="auto"/>
+          <w:sz w:val="24"/>
+          <w:szCs w:val="24"/>
+        </w:rPr>
+        <w:t>`, `</w:t>
+      </w:r>
+      <w:proofErr w:type="spellStart"/>
+      <w:r>
+        <w:rPr>
+          <w:rFonts w:asciiTheme="minorHAnsi" w:eastAsiaTheme="minorHAnsi" w:hAnsiTheme="minorHAnsi" w:cstheme="minorBidi"/>
+          <w:color w:val="auto"/>
+          <w:sz w:val="24"/>
+          <w:szCs w:val="24"/>
+        </w:rPr>
+        <w:t>quantite</w:t>
+      </w:r>
+      <w:proofErr w:type="spellEnd"/>
+      <w:r>
+        <w:rPr>
+          <w:rFonts w:asciiTheme="minorHAnsi" w:eastAsiaTheme="minorHAnsi" w:hAnsiTheme="minorHAnsi" w:cstheme="minorBidi"/>
+          <w:color w:val="auto"/>
+          <w:sz w:val="24"/>
+          <w:szCs w:val="24"/>
+        </w:rPr>
+        <w:t>`, `</w:t>
+      </w:r>
+      <w:proofErr w:type="spellStart"/>
+      <w:r>
+        <w:rPr>
+          <w:rFonts w:asciiTheme="minorHAnsi" w:eastAsiaTheme="minorHAnsi" w:hAnsiTheme="minorHAnsi" w:cstheme="minorBidi"/>
+          <w:color w:val="auto"/>
+          <w:sz w:val="24"/>
+          <w:szCs w:val="24"/>
+        </w:rPr>
+        <w:t>prix_unitaire</w:t>
+      </w:r>
+      <w:proofErr w:type="spellEnd"/>
+      <w:r>
+        <w:rPr>
+          <w:rFonts w:asciiTheme="minorHAnsi" w:eastAsiaTheme="minorHAnsi" w:hAnsiTheme="minorHAnsi" w:cstheme="minorBidi"/>
+          <w:color w:val="auto"/>
+          <w:sz w:val="24"/>
+          <w:szCs w:val="24"/>
+        </w:rPr>
+        <w:t>`, @extra)</w:t>
+      </w:r>
+    </w:p>
+    <w:p>
+      <w:pPr>
+        <w:pStyle w:val="Titre2"/>
+        <w:rPr>
+          <w:rFonts w:asciiTheme="minorHAnsi" w:eastAsiaTheme="minorHAnsi" w:hAnsiTheme="minorHAnsi" w:cstheme="minorBidi"/>
+          <w:color w:val="auto"/>
+          <w:sz w:val="24"/>
+          <w:szCs w:val="24"/>
+        </w:rPr>
+      </w:pPr>
+      <w:r>
+        <w:rPr>
+          <w:rFonts w:asciiTheme="minorHAnsi" w:eastAsiaTheme="minorHAnsi" w:hAnsiTheme="minorHAnsi" w:cstheme="minorBidi"/>
+          <w:color w:val="auto"/>
+          <w:sz w:val="24"/>
+          <w:szCs w:val="24"/>
+        </w:rPr>
+        <w:t xml:space="preserve">    SET </w:t>
+      </w:r>
+      <w:proofErr w:type="spellStart"/>
+      <w:r>
+        <w:rPr>
+          <w:rFonts w:asciiTheme="minorHAnsi" w:eastAsiaTheme="minorHAnsi" w:hAnsiTheme="minorHAnsi" w:cstheme="minorBidi"/>
+          <w:color w:val="auto"/>
+          <w:sz w:val="24"/>
+          <w:szCs w:val="24"/>
+        </w:rPr>
+        <w:t>produit_enfant_fk</w:t>
+      </w:r>
+      <w:proofErr w:type="spellEnd"/>
+      <w:r>
+        <w:rPr>
+          <w:rFonts w:asciiTheme="minorHAnsi" w:eastAsiaTheme="minorHAnsi" w:hAnsiTheme="minorHAnsi" w:cstheme="minorBidi"/>
+          <w:color w:val="auto"/>
+          <w:sz w:val="24"/>
+          <w:szCs w:val="24"/>
+        </w:rPr>
+        <w:t xml:space="preserve"> = NULLIF(@extra, '')</w:t>
+      </w:r>
+      <w:r>
+        <w:rPr>
+          <w:rFonts w:asciiTheme="minorHAnsi" w:eastAsiaTheme="minorHAnsi" w:hAnsiTheme="minorHAnsi" w:cstheme="minorBidi"/>
+          <w:color w:val="auto"/>
+          <w:sz w:val="24"/>
+          <w:szCs w:val="24"/>
+        </w:rPr>
+        <w:t> ;</w:t>
+      </w:r>
+    </w:p>
+    <w:p/>
+    <w:p>
+      <w:pPr>
+        <w:keepNext/>
+      </w:pPr>
+      <w:r>
+        <w:lastRenderedPageBreak/>
+        <w:t>--table 7</w:t>
+      </w:r>
+    </w:p>
+    <w:p>
+      <w:pPr>
+        <w:keepNext/>
+      </w:pPr>
+      <w:r>
+        <w:t>LOAD DATA INFILE '/var/lib/</w:t>
+      </w:r>
+      <w:proofErr w:type="spellStart"/>
+      <w:r>
+        <w:t>mysql</w:t>
+      </w:r>
+      <w:proofErr w:type="spellEnd"/>
+      <w:r>
+        <w:t>-files/</w:t>
+      </w:r>
+      <w:proofErr w:type="spellStart"/>
+      <w:r>
+        <w:t>t_paiement.tsv</w:t>
+      </w:r>
+      <w:proofErr w:type="spellEnd"/>
+      <w:r>
+        <w:t xml:space="preserve">' </w:t>
+      </w:r>
+    </w:p>
+    <w:p>
+      <w:pPr>
+        <w:keepNext/>
+        <w:rPr>
+          <w:lang w:val="en-US"/>
+        </w:rPr>
+      </w:pPr>
+      <w:r>
+        <w:tab/>
+      </w:r>
+      <w:r>
+        <w:rPr>
+          <w:lang w:val="en-US"/>
+        </w:rPr>
+        <w:t xml:space="preserve">INTO TABLE </w:t>
+      </w:r>
+      <w:proofErr w:type="spellStart"/>
+      <w:r>
+        <w:rPr>
+          <w:lang w:val="en-US"/>
+        </w:rPr>
+        <w:t>t_paiement</w:t>
+      </w:r>
+      <w:proofErr w:type="spellEnd"/>
+    </w:p>
+    <w:p>
+      <w:pPr>
+        <w:keepNext/>
+        <w:rPr>
+          <w:lang w:val="en-US"/>
+        </w:rPr>
+      </w:pPr>
+      <w:r>
+        <w:rPr>
+          <w:lang w:val="en-US"/>
+        </w:rPr>
         <w:tab/>
         <w:t>CHARACTER SET UTF8</w:t>
       </w:r>
     </w:p>
     <w:p>
-      <w:r>
+      <w:pPr>
+        <w:keepNext/>
+        <w:rPr>
+          <w:lang w:val="en-US"/>
+        </w:rPr>
+      </w:pPr>
+      <w:r>
+        <w:rPr>
+          <w:lang w:val="en-US"/>
+        </w:rPr>
         <w:tab/>
-        <w:t>COLUMNS TERMINATED BY '</w:t>
-      </w:r>
-      <w:r>
+        <w:t>COLUMNS TERMINATED BY '\t'</w:t>
+      </w:r>
+    </w:p>
+    <w:p>
+      <w:pPr>
+        <w:keepNext/>
+        <w:rPr>
+          <w:lang w:val="en-US"/>
+        </w:rPr>
+      </w:pPr>
+      <w:r>
+        <w:rPr>
+          <w:lang w:val="en-US"/>
+        </w:rPr>
         <w:tab/>
-        <w:t>'</w:t>
-      </w:r>
-    </w:p>
-    <w:p>
+        <w:t>IGNORE 1 LINES</w:t>
+      </w:r>
+    </w:p>
+    <w:p>
+      <w:pPr>
+        <w:keepNext/>
+      </w:pPr>
+      <w:r>
+        <w:rPr>
+          <w:lang w:val="en-US"/>
+        </w:rPr>
+        <w:t xml:space="preserve">    </w:t>
+      </w:r>
+      <w:r>
+        <w:t>(`</w:t>
+      </w:r>
+      <w:proofErr w:type="spellStart"/>
+      <w:r>
+        <w:t>paiement_id</w:t>
+      </w:r>
+      <w:proofErr w:type="spellEnd"/>
+      <w:r>
+        <w:t>`, `</w:t>
+      </w:r>
+      <w:proofErr w:type="spellStart"/>
+      <w:r>
+        <w:t>commande_fk</w:t>
+      </w:r>
+      <w:proofErr w:type="spellEnd"/>
+      <w:r>
+        <w:t>`, `mode`, `montant`, @mytimestamp)</w:t>
+      </w:r>
+    </w:p>
+    <w:p>
+      <w:pPr>
+        <w:keepNext/>
+      </w:pPr>
+      <w:r>
+        <w:t xml:space="preserve">    SET </w:t>
+      </w:r>
+      <w:proofErr w:type="spellStart"/>
+      <w:r>
+        <w:t>date_paiement</w:t>
+      </w:r>
+      <w:proofErr w:type="spellEnd"/>
+      <w:r>
+        <w:t xml:space="preserve"> =STR_TO_DATE(@mytimestamp, '%</w:t>
+      </w:r>
+      <w:proofErr w:type="spellStart"/>
+      <w:r>
+        <w:t>d.%m.%Y</w:t>
+      </w:r>
+      <w:proofErr w:type="spellEnd"/>
+      <w:r>
+        <w:t xml:space="preserve"> %H:%i');</w:t>
+      </w:r>
+    </w:p>
+    <w:p>
+      <w:pPr>
+        <w:keepNext/>
+      </w:pPr>
+    </w:p>
+    <w:p>
+      <w:pPr>
+        <w:keepNext/>
+      </w:pPr>
+      <w:r>
+        <w:t>--table 8</w:t>
+      </w:r>
+    </w:p>
+    <w:p>
+      <w:pPr>
+        <w:keepNext/>
+      </w:pPr>
+      <w:r>
+        <w:t>LOAD DATA INFILE '/var/lib/</w:t>
+      </w:r>
+      <w:proofErr w:type="spellStart"/>
+      <w:r>
+        <w:t>mysql</w:t>
+      </w:r>
+      <w:proofErr w:type="spellEnd"/>
+      <w:r>
+        <w:t>-files/</w:t>
+      </w:r>
+      <w:proofErr w:type="spellStart"/>
+      <w:r>
+        <w:t>t_livraison.tsv</w:t>
+      </w:r>
+      <w:proofErr w:type="spellEnd"/>
+      <w:r>
+        <w:t xml:space="preserve">' </w:t>
+      </w:r>
+    </w:p>
+    <w:p>
+      <w:pPr>
+        <w:keepNext/>
+        <w:rPr>
+          <w:lang w:val="en-US"/>
+        </w:rPr>
+      </w:pPr>
       <w:r>
         <w:tab/>
-        <w:t xml:space="preserve">IGNORE 1 </w:t>
-      </w:r>
-      <w:proofErr w:type="gramStart"/>
-      <w:r>
-        <w:t>LINES;</w:t>
-      </w:r>
-      <w:proofErr w:type="gramEnd"/>
-    </w:p>
-    <w:p/>
+      </w:r>
+      <w:r>
+        <w:rPr>
+          <w:lang w:val="en-US"/>
+        </w:rPr>
+        <w:t>INTO TABLE t_livraison</w:t>
+      </w:r>
+    </w:p>
     <w:p>
       <w:pPr>
         <w:keepNext/>
-      </w:pPr>
-      <w:r>
-        <w:lastRenderedPageBreak/>
-        <w:t>LOAD DATA INFILE '/var/lib/</w:t>
-      </w:r>
-      <w:proofErr w:type="spellStart"/>
-      <w:r>
-        <w:t>mysql</w:t>
-      </w:r>
-      <w:proofErr w:type="spellEnd"/>
-      <w:r>
-        <w:t>-files/</w:t>
-      </w:r>
-      <w:proofErr w:type="spellStart"/>
-      <w:r>
-        <w:t>t_adresse.tsv</w:t>
-      </w:r>
-      <w:proofErr w:type="spellEnd"/>
-      <w:r>
-        <w:t xml:space="preserve">' </w:t>
-      </w:r>
-    </w:p>
-    <w:p>
-      <w:pPr>
-        <w:keepNext/>
-      </w:pPr>
-      <w:r>
-        <w:tab/>
-        <w:t xml:space="preserve">INTO TABLE </w:t>
-      </w:r>
-      <w:proofErr w:type="spellStart"/>
-      <w:r>
-        <w:t>t_adresse</w:t>
-      </w:r>
-      <w:proofErr w:type="spellEnd"/>
-    </w:p>
-    <w:p>
-      <w:pPr>
-        <w:keepNext/>
-      </w:pPr>
-      <w:r>
+        <w:rPr>
+          <w:lang w:val="en-US"/>
+        </w:rPr>
+      </w:pPr>
+      <w:r>
+        <w:rPr>
+          <w:lang w:val="en-US"/>
+        </w:rPr>
         <w:tab/>
         <w:t>CHARACTER SET UTF8</w:t>
       </w:r>
@@ -1009,16 +2093,16 @@
     <w:p>
       <w:pPr>
         <w:keepNext/>
-      </w:pPr>
-      <w:r>
+        <w:rPr>
+          <w:lang w:val="en-US"/>
+        </w:rPr>
+      </w:pPr>
+      <w:r>
+        <w:rPr>
+          <w:lang w:val="en-US"/>
+        </w:rPr>
         <w:tab/>
-        <w:t>COLUMNS TERMINATED BY '</w:t>
-      </w:r>
-      <w:r>
-        <w:t>\t</w:t>
-      </w:r>
-      <w:r>
-        <w:t>'</w:t>
+        <w:t>COLUMNS TERMINATED BY '\t'</w:t>
       </w:r>
     </w:p>
     <w:p>
@@ -1026,7 +2110,12 @@
         <w:keepNext/>
       </w:pPr>
       <w:r>
+        <w:rPr>
+          <w:lang w:val="en-US"/>
+        </w:rPr>
         <w:tab/>
+      </w:r>
+      <w:r>
         <w:t>IGNORE 1 LINES</w:t>
       </w:r>
     </w:p>
@@ -1039,7 +2128,7 @@
       </w:r>
       <w:proofErr w:type="spellStart"/>
       <w:r>
-        <w:t>adresse_id</w:t>
+        <w:t>livraison_id</w:t>
       </w:r>
       <w:proofErr w:type="spellEnd"/>
       <w:r>
@@ -1047,15 +2136,7 @@
       </w:r>
       <w:proofErr w:type="spellStart"/>
       <w:r>
-        <w:t>client_fk</w:t>
-      </w:r>
-      <w:proofErr w:type="spellEnd"/>
-      <w:r>
-        <w:t>`, `rue`, `</w:t>
-      </w:r>
-      <w:proofErr w:type="spellStart"/>
-      <w:r>
-        <w:t>npa</w:t>
+        <w:t>commande_fk</w:t>
       </w:r>
       <w:proofErr w:type="spellEnd"/>
       <w:r>
@@ -1063,24 +2144,66 @@
       </w:r>
       <w:proofErr w:type="spellStart"/>
       <w:r>
-        <w:t>localite</w:t>
-      </w:r>
-      <w:proofErr w:type="spellEnd"/>
-      <w:r>
-        <w:t>`, `latitude`, `longitude`</w:t>
-      </w:r>
-      <w:proofErr w:type="gramStart"/>
-      <w:r>
-        <w:t>);</w:t>
-      </w:r>
-      <w:proofErr w:type="gramEnd"/>
+        <w:t>livreur_fk</w:t>
+      </w:r>
+      <w:proofErr w:type="spellEnd"/>
+      <w:r>
+        <w:t>`, `statut`, @depart, @arrivee)</w:t>
+      </w:r>
+    </w:p>
+    <w:p>
+      <w:pPr>
+        <w:keepNext/>
+      </w:pPr>
+      <w:r>
+        <w:t xml:space="preserve">    SET </w:t>
+      </w:r>
+      <w:proofErr w:type="spellStart"/>
+      <w:r>
+        <w:t>heure_depart</w:t>
+      </w:r>
+      <w:proofErr w:type="spellEnd"/>
+      <w:r>
+        <w:t xml:space="preserve"> =STR_TO_DATE(@depart, '%</w:t>
+      </w:r>
+      <w:proofErr w:type="spellStart"/>
+      <w:r>
+        <w:t>d.%m.%Y</w:t>
+      </w:r>
+      <w:proofErr w:type="spellEnd"/>
+      <w:r>
+        <w:t xml:space="preserve"> %H:%i'),</w:t>
+      </w:r>
+    </w:p>
+    <w:p>
+      <w:pPr>
+        <w:keepNext/>
+      </w:pPr>
+      <w:r>
+        <w:t xml:space="preserve">    </w:t>
+      </w:r>
+      <w:proofErr w:type="spellStart"/>
+      <w:r>
+        <w:t>heure_arrivee</w:t>
+      </w:r>
+      <w:proofErr w:type="spellEnd"/>
+      <w:r>
+        <w:t xml:space="preserve"> =STR_TO_DATE(@arrivee, '%</w:t>
+      </w:r>
+      <w:proofErr w:type="spellStart"/>
+      <w:r>
+        <w:t>d.%m.%Y</w:t>
+      </w:r>
+      <w:proofErr w:type="spellEnd"/>
+      <w:r>
+        <w:t xml:space="preserve"> %H:%i');</w:t>
+      </w:r>
     </w:p>
     <w:p/>
     <w:p>
       <w:pPr>
         <w:pStyle w:val="Titre2"/>
       </w:pPr>
-      <w:bookmarkStart w:id="2" w:name="_Toc210392959"/>
       <w:r>
         <w:t>Sauvegarde de la base de données</w:t>
       </w:r>
@@ -1139,7 +2262,7 @@
 </file>
 
 <file path=word/endnotes.xml><?xml version="1.0" encoding="utf-8"?>
-<w:endnotes xmlns:wpc="http://schemas.microsoft.com/office/word/2010/wordprocessingCanvas" xmlns:cx="http://schemas.microsoft.com/office/drawing/2014/chartex" xmlns:cx1="http://schemas.microsoft.com/office/drawing/2015/9/8/chartex" xmlns:cx2="http://schemas.microsoft.com/office/drawing/2015/10/21/chartex" xmlns:cx3="http://schemas.microsoft.com/office/drawing/2016/5/9/chartex" xmlns:cx4="http://schemas.microsoft.com/office/drawing/2016/5/10/chartex" xmlns:cx5="http://schemas.microsoft.com/office/drawing/2016/5/11/chartex" xmlns:cx6="http://schemas.microsoft.com/office/drawing/2016/5/12/chartex" xmlns:cx7="http://schemas.microsoft.com/office/drawing/2016/5/13/chartex" xmlns:cx8="http://schemas.microsoft.com/office/drawing/2016/5/14/chartex" xmlns:mc="http://schemas.openxmlformats.org/markup-compatibility/2006" xmlns:aink="http://schemas.microsoft.com/office/drawing/2016/ink" xmlns:am3d="http://schemas.microsoft.com/office/drawing/2017/model3d" xmlns:o="urn:schemas-microsoft-com:office:office" xmlns:oel="http://schemas.microsoft.com/office/2019/extlst" xmlns:r="http://schemas.openxmlformats.org/officeDocument/2006/relationships" xmlns:m="http://schemas.openxmlformats.org/officeDocument/2006/math" xmlns:v="urn:schemas-microsoft-com:vml" xmlns:wp14="http://schemas.microsoft.com/office/word/2010/wordprocessingDrawing" xmlns:wp="http://schemas.openxmlformats.org/drawingml/2006/wordprocessingDrawing" xmlns:w10="urn:schemas-microsoft-com:office:word" xmlns:w="http://schemas.openxmlformats.org/wordprocessingml/2006/main" xmlns:w14="http://schemas.microsoft.com/office/word/2010/wordml" xmlns:w15="http://schemas.microsoft.com/office/word/2012/wordml" xmlns:w16cex="http://schemas.microsoft.com/office/word/2018/wordml/cex" xmlns:w16cid="http://schemas.microsoft.com/office/word/2016/wordml/cid" xmlns:w16="http://schemas.microsoft.com/office/word/2018/wordml" xmlns:w16du="http://schemas.microsoft.com/office/word/2023/wordml/word16du" xmlns:w16sdtdh="http://schemas.microsoft.com/office/word/2020/wordml/sdtdatahash" xmlns:w16sdtfl="http://schemas.microsoft.com/office/word/2024/wordml/sdtformatlock" xmlns:w16se="http://schemas.microsoft.com/office/word/2015/wordml/symex" xmlns:wpg="http://schemas.microsoft.com/office/word/2010/wordprocessingGroup" xmlns:wpi="http://schemas.microsoft.com/office/word/2010/wordprocessingInk" xmlns:wne="http://schemas.microsoft.com/office/word/2006/wordml" xmlns:wps="http://schemas.microsoft.com/office/word/2010/wordprocessingShape" mc:Ignorable="w14 w15 w16se w16cid w16 w16cex w16sdtdh w16sdtfl w16du wp14">
+<w:endnotes xmlns:wpc="http://schemas.microsoft.com/office/word/2010/wordprocessingCanvas" xmlns:cx="http://schemas.microsoft.com/office/drawing/2014/chartex" xmlns:cx1="http://schemas.microsoft.com/office/drawing/2015/9/8/chartex" xmlns:cx2="http://schemas.microsoft.com/office/drawing/2015/10/21/chartex" xmlns:cx3="http://schemas.microsoft.com/office/drawing/2016/5/9/chartex" xmlns:cx4="http://schemas.microsoft.com/office/drawing/2016/5/10/chartex" xmlns:cx5="http://schemas.microsoft.com/office/drawing/2016/5/11/chartex" xmlns:cx6="http://schemas.microsoft.com/office/drawing/2016/5/12/chartex" xmlns:cx7="http://schemas.microsoft.com/office/drawing/2016/5/13/chartex" xmlns:cx8="http://schemas.microsoft.com/office/drawing/2016/5/14/chartex" xmlns:mc="http://schemas.openxmlformats.org/markup-compatibility/2006" xmlns:aink="http://schemas.microsoft.com/office/drawing/2016/ink" xmlns:am3d="http://schemas.microsoft.com/office/drawing/2017/model3d" xmlns:o="urn:schemas-microsoft-com:office:office" xmlns:oel="http://schemas.microsoft.com/office/2019/extlst" xmlns:r="http://schemas.openxmlformats.org/officeDocument/2006/relationships" xmlns:m="http://schemas.openxmlformats.org/officeDocument/2006/math" xmlns:v="urn:schemas-microsoft-com:vml" xmlns:wp14="http://schemas.microsoft.com/office/word/2010/wordprocessingDrawing" xmlns:wp="http://schemas.openxmlformats.org/drawingml/2006/wordprocessingDrawing" xmlns:w10="urn:schemas-microsoft-com:office:word" xmlns:w="http://schemas.openxmlformats.org/wordprocessingml/2006/main" xmlns:w14="http://schemas.microsoft.com/office/word/2010/wordml" xmlns:w15="http://schemas.microsoft.com/office/word/2012/wordml" xmlns:w16cex="http://schemas.microsoft.com/office/word/2018/wordml/cex" xmlns:w16cid="http://schemas.microsoft.com/office/word/2016/wordml/cid" xmlns:w16="http://schemas.microsoft.com/office/word/2018/wordml" xmlns:w16sdtdh="http://schemas.microsoft.com/office/word/2020/wordml/sdtdatahash" xmlns:w16se="http://schemas.microsoft.com/office/word/2015/wordml/symex" xmlns:wpg="http://schemas.microsoft.com/office/word/2010/wordprocessingGroup" xmlns:wpi="http://schemas.microsoft.com/office/word/2010/wordprocessingInk" xmlns:wne="http://schemas.microsoft.com/office/word/2006/wordml" xmlns:wps="http://schemas.microsoft.com/office/word/2010/wordprocessingShape" mc:Ignorable="w14 w15 w16se w16cid w16 w16cex w16sdtdh wp14">
   <w:endnote w:type="separator" w:id="-1">
     <w:p>
       <w:pPr>
@@ -1164,7 +2287,7 @@
 </file>
 
 <file path=word/footer1.xml><?xml version="1.0" encoding="utf-8"?>
-<w:ftr xmlns:wpc="http://schemas.microsoft.com/office/word/2010/wordprocessingCanvas" xmlns:cx="http://schemas.microsoft.com/office/drawing/2014/chartex" xmlns:cx1="http://schemas.microsoft.com/office/drawing/2015/9/8/chartex" xmlns:cx2="http://schemas.microsoft.com/office/drawing/2015/10/21/chartex" xmlns:cx3="http://schemas.microsoft.com/office/drawing/2016/5/9/chartex" xmlns:cx4="http://schemas.microsoft.com/office/drawing/2016/5/10/chartex" xmlns:cx5="http://schemas.microsoft.com/office/drawing/2016/5/11/chartex" xmlns:cx6="http://schemas.microsoft.com/office/drawing/2016/5/12/chartex" xmlns:cx7="http://schemas.microsoft.com/office/drawing/2016/5/13/chartex" xmlns:cx8="http://schemas.microsoft.com/office/drawing/2016/5/14/chartex" xmlns:mc="http://schemas.openxmlformats.org/markup-compatibility/2006" xmlns:aink="http://schemas.microsoft.com/office/drawing/2016/ink" xmlns:am3d="http://schemas.microsoft.com/office/drawing/2017/model3d" xmlns:o="urn:schemas-microsoft-com:office:office" xmlns:oel="http://schemas.microsoft.com/office/2019/extlst" xmlns:r="http://schemas.openxmlformats.org/officeDocument/2006/relationships" xmlns:m="http://schemas.openxmlformats.org/officeDocument/2006/math" xmlns:v="urn:schemas-microsoft-com:vml" xmlns:wp14="http://schemas.microsoft.com/office/word/2010/wordprocessingDrawing" xmlns:wp="http://schemas.openxmlformats.org/drawingml/2006/wordprocessingDrawing" xmlns:w10="urn:schemas-microsoft-com:office:word" xmlns:w="http://schemas.openxmlformats.org/wordprocessingml/2006/main" xmlns:w14="http://schemas.microsoft.com/office/word/2010/wordml" xmlns:w15="http://schemas.microsoft.com/office/word/2012/wordml" xmlns:w16cex="http://schemas.microsoft.com/office/word/2018/wordml/cex" xmlns:w16cid="http://schemas.microsoft.com/office/word/2016/wordml/cid" xmlns:w16="http://schemas.microsoft.com/office/word/2018/wordml" xmlns:w16du="http://schemas.microsoft.com/office/word/2023/wordml/word16du" xmlns:w16sdtdh="http://schemas.microsoft.com/office/word/2020/wordml/sdtdatahash" xmlns:w16sdtfl="http://schemas.microsoft.com/office/word/2024/wordml/sdtformatlock" xmlns:w16se="http://schemas.microsoft.com/office/word/2015/wordml/symex" xmlns:wpg="http://schemas.microsoft.com/office/word/2010/wordprocessingGroup" xmlns:wpi="http://schemas.microsoft.com/office/word/2010/wordprocessingInk" xmlns:wne="http://schemas.microsoft.com/office/word/2006/wordml" xmlns:wps="http://schemas.microsoft.com/office/word/2010/wordprocessingShape" mc:Ignorable="w14 w15 w16se w16cid w16 w16cex w16sdtdh w16sdtfl w16du wp14">
+<w:ftr xmlns:wpc="http://schemas.microsoft.com/office/word/2010/wordprocessingCanvas" xmlns:cx="http://schemas.microsoft.com/office/drawing/2014/chartex" xmlns:cx1="http://schemas.microsoft.com/office/drawing/2015/9/8/chartex" xmlns:cx2="http://schemas.microsoft.com/office/drawing/2015/10/21/chartex" xmlns:cx3="http://schemas.microsoft.com/office/drawing/2016/5/9/chartex" xmlns:cx4="http://schemas.microsoft.com/office/drawing/2016/5/10/chartex" xmlns:cx5="http://schemas.microsoft.com/office/drawing/2016/5/11/chartex" xmlns:cx6="http://schemas.microsoft.com/office/drawing/2016/5/12/chartex" xmlns:cx7="http://schemas.microsoft.com/office/drawing/2016/5/13/chartex" xmlns:cx8="http://schemas.microsoft.com/office/drawing/2016/5/14/chartex" xmlns:mc="http://schemas.openxmlformats.org/markup-compatibility/2006" xmlns:aink="http://schemas.microsoft.com/office/drawing/2016/ink" xmlns:am3d="http://schemas.microsoft.com/office/drawing/2017/model3d" xmlns:o="urn:schemas-microsoft-com:office:office" xmlns:oel="http://schemas.microsoft.com/office/2019/extlst" xmlns:r="http://schemas.openxmlformats.org/officeDocument/2006/relationships" xmlns:m="http://schemas.openxmlformats.org/officeDocument/2006/math" xmlns:v="urn:schemas-microsoft-com:vml" xmlns:wp14="http://schemas.microsoft.com/office/word/2010/wordprocessingDrawing" xmlns:wp="http://schemas.openxmlformats.org/drawingml/2006/wordprocessingDrawing" xmlns:w10="urn:schemas-microsoft-com:office:word" xmlns:w="http://schemas.openxmlformats.org/wordprocessingml/2006/main" xmlns:w14="http://schemas.microsoft.com/office/word/2010/wordml" xmlns:w15="http://schemas.microsoft.com/office/word/2012/wordml" xmlns:w16cex="http://schemas.microsoft.com/office/word/2018/wordml/cex" xmlns:w16cid="http://schemas.microsoft.com/office/word/2016/wordml/cid" xmlns:w16="http://schemas.microsoft.com/office/word/2018/wordml" xmlns:w16sdtdh="http://schemas.microsoft.com/office/word/2020/wordml/sdtdatahash" xmlns:w16se="http://schemas.microsoft.com/office/word/2015/wordml/symex" xmlns:wpg="http://schemas.microsoft.com/office/word/2010/wordprocessingGroup" xmlns:wpi="http://schemas.microsoft.com/office/word/2010/wordprocessingInk" xmlns:wne="http://schemas.microsoft.com/office/word/2006/wordml" xmlns:wps="http://schemas.microsoft.com/office/word/2010/wordprocessingShape" mc:Ignorable="w14 w15 w16se w16cid w16 w16cex w16sdtdh wp14">
   <w:p>
     <w:pPr>
       <w:pStyle w:val="Pieddepage"/>
@@ -1204,7 +2327,7 @@
 </file>
 
 <file path=word/footnotes.xml><?xml version="1.0" encoding="utf-8"?>
-<w:footnotes xmlns:wpc="http://schemas.microsoft.com/office/word/2010/wordprocessingCanvas" xmlns:cx="http://schemas.microsoft.com/office/drawing/2014/chartex" xmlns:cx1="http://schemas.microsoft.com/office/drawing/2015/9/8/chartex" xmlns:cx2="http://schemas.microsoft.com/office/drawing/2015/10/21/chartex" xmlns:cx3="http://schemas.microsoft.com/office/drawing/2016/5/9/chartex" xmlns:cx4="http://schemas.microsoft.com/office/drawing/2016/5/10/chartex" xmlns:cx5="http://schemas.microsoft.com/office/drawing/2016/5/11/chartex" xmlns:cx6="http://schemas.microsoft.com/office/drawing/2016/5/12/chartex" xmlns:cx7="http://schemas.microsoft.com/office/drawing/2016/5/13/chartex" xmlns:cx8="http://schemas.microsoft.com/office/drawing/2016/5/14/chartex" xmlns:mc="http://schemas.openxmlformats.org/markup-compatibility/2006" xmlns:aink="http://schemas.microsoft.com/office/drawing/2016/ink" xmlns:am3d="http://schemas.microsoft.com/office/drawing/2017/model3d" xmlns:o="urn:schemas-microsoft-com:office:office" xmlns:oel="http://schemas.microsoft.com/office/2019/extlst" xmlns:r="http://schemas.openxmlformats.org/officeDocument/2006/relationships" xmlns:m="http://schemas.openxmlformats.org/officeDocument/2006/math" xmlns:v="urn:schemas-microsoft-com:vml" xmlns:wp14="http://schemas.microsoft.com/office/word/2010/wordprocessingDrawing" xmlns:wp="http://schemas.openxmlformats.org/drawingml/2006/wordprocessingDrawing" xmlns:w10="urn:schemas-microsoft-com:office:word" xmlns:w="http://schemas.openxmlformats.org/wordprocessingml/2006/main" xmlns:w14="http://schemas.microsoft.com/office/word/2010/wordml" xmlns:w15="http://schemas.microsoft.com/office/word/2012/wordml" xmlns:w16cex="http://schemas.microsoft.com/office/word/2018/wordml/cex" xmlns:w16cid="http://schemas.microsoft.com/office/word/2016/wordml/cid" xmlns:w16="http://schemas.microsoft.com/office/word/2018/wordml" xmlns:w16du="http://schemas.microsoft.com/office/word/2023/wordml/word16du" xmlns:w16sdtdh="http://schemas.microsoft.com/office/word/2020/wordml/sdtdatahash" xmlns:w16sdtfl="http://schemas.microsoft.com/office/word/2024/wordml/sdtformatlock" xmlns:w16se="http://schemas.microsoft.com/office/word/2015/wordml/symex" xmlns:wpg="http://schemas.microsoft.com/office/word/2010/wordprocessingGroup" xmlns:wpi="http://schemas.microsoft.com/office/word/2010/wordprocessingInk" xmlns:wne="http://schemas.microsoft.com/office/word/2006/wordml" xmlns:wps="http://schemas.microsoft.com/office/word/2010/wordprocessingShape" mc:Ignorable="w14 w15 w16se w16cid w16 w16cex w16sdtdh w16sdtfl w16du wp14">
+<w:footnotes xmlns:wpc="http://schemas.microsoft.com/office/word/2010/wordprocessingCanvas" xmlns:cx="http://schemas.microsoft.com/office/drawing/2014/chartex" xmlns:cx1="http://schemas.microsoft.com/office/drawing/2015/9/8/chartex" xmlns:cx2="http://schemas.microsoft.com/office/drawing/2015/10/21/chartex" xmlns:cx3="http://schemas.microsoft.com/office/drawing/2016/5/9/chartex" xmlns:cx4="http://schemas.microsoft.com/office/drawing/2016/5/10/chartex" xmlns:cx5="http://schemas.microsoft.com/office/drawing/2016/5/11/chartex" xmlns:cx6="http://schemas.microsoft.com/office/drawing/2016/5/12/chartex" xmlns:cx7="http://schemas.microsoft.com/office/drawing/2016/5/13/chartex" xmlns:cx8="http://schemas.microsoft.com/office/drawing/2016/5/14/chartex" xmlns:mc="http://schemas.openxmlformats.org/markup-compatibility/2006" xmlns:aink="http://schemas.microsoft.com/office/drawing/2016/ink" xmlns:am3d="http://schemas.microsoft.com/office/drawing/2017/model3d" xmlns:o="urn:schemas-microsoft-com:office:office" xmlns:oel="http://schemas.microsoft.com/office/2019/extlst" xmlns:r="http://schemas.openxmlformats.org/officeDocument/2006/relationships" xmlns:m="http://schemas.openxmlformats.org/officeDocument/2006/math" xmlns:v="urn:schemas-microsoft-com:vml" xmlns:wp14="http://schemas.microsoft.com/office/word/2010/wordprocessingDrawing" xmlns:wp="http://schemas.openxmlformats.org/drawingml/2006/wordprocessingDrawing" xmlns:w10="urn:schemas-microsoft-com:office:word" xmlns:w="http://schemas.openxmlformats.org/wordprocessingml/2006/main" xmlns:w14="http://schemas.microsoft.com/office/word/2010/wordml" xmlns:w15="http://schemas.microsoft.com/office/word/2012/wordml" xmlns:w16cex="http://schemas.microsoft.com/office/word/2018/wordml/cex" xmlns:w16cid="http://schemas.microsoft.com/office/word/2016/wordml/cid" xmlns:w16="http://schemas.microsoft.com/office/word/2018/wordml" xmlns:w16sdtdh="http://schemas.microsoft.com/office/word/2020/wordml/sdtdatahash" xmlns:w16se="http://schemas.microsoft.com/office/word/2015/wordml/symex" xmlns:wpg="http://schemas.microsoft.com/office/word/2010/wordprocessingGroup" xmlns:wpi="http://schemas.microsoft.com/office/word/2010/wordprocessingInk" xmlns:wne="http://schemas.microsoft.com/office/word/2006/wordml" xmlns:wps="http://schemas.microsoft.com/office/word/2010/wordprocessingShape" mc:Ignorable="w14 w15 w16se w16cid w16 w16cex w16sdtdh wp14">
   <w:footnote w:type="separator" w:id="-1">
     <w:p>
       <w:pPr>
@@ -1229,12 +2352,15 @@
 </file>
 
 <file path=word/header1.xml><?xml version="1.0" encoding="utf-8"?>
-<w:hdr xmlns:wpc="http://schemas.microsoft.com/office/word/2010/wordprocessingCanvas" xmlns:cx="http://schemas.microsoft.com/office/drawing/2014/chartex" xmlns:cx1="http://schemas.microsoft.com/office/drawing/2015/9/8/chartex" xmlns:cx2="http://schemas.microsoft.com/office/drawing/2015/10/21/chartex" xmlns:cx3="http://schemas.microsoft.com/office/drawing/2016/5/9/chartex" xmlns:cx4="http://schemas.microsoft.com/office/drawing/2016/5/10/chartex" xmlns:cx5="http://schemas.microsoft.com/office/drawing/2016/5/11/chartex" xmlns:cx6="http://schemas.microsoft.com/office/drawing/2016/5/12/chartex" xmlns:cx7="http://schemas.microsoft.com/office/drawing/2016/5/13/chartex" xmlns:cx8="http://schemas.microsoft.com/office/drawing/2016/5/14/chartex" xmlns:mc="http://schemas.openxmlformats.org/markup-compatibility/2006" xmlns:aink="http://schemas.microsoft.com/office/drawing/2016/ink" xmlns:am3d="http://schemas.microsoft.com/office/drawing/2017/model3d" xmlns:o="urn:schemas-microsoft-com:office:office" xmlns:oel="http://schemas.microsoft.com/office/2019/extlst" xmlns:r="http://schemas.openxmlformats.org/officeDocument/2006/relationships" xmlns:m="http://schemas.openxmlformats.org/officeDocument/2006/math" xmlns:v="urn:schemas-microsoft-com:vml" xmlns:wp14="http://schemas.microsoft.com/office/word/2010/wordprocessingDrawing" xmlns:wp="http://schemas.openxmlformats.org/drawingml/2006/wordprocessingDrawing" xmlns:w10="urn:schemas-microsoft-com:office:word" xmlns:w="http://schemas.openxmlformats.org/wordprocessingml/2006/main" xmlns:w14="http://schemas.microsoft.com/office/word/2010/wordml" xmlns:w15="http://schemas.microsoft.com/office/word/2012/wordml" xmlns:w16cex="http://schemas.microsoft.com/office/word/2018/wordml/cex" xmlns:w16cid="http://schemas.microsoft.com/office/word/2016/wordml/cid" xmlns:w16="http://schemas.microsoft.com/office/word/2018/wordml" xmlns:w16du="http://schemas.microsoft.com/office/word/2023/wordml/word16du" xmlns:w16sdtdh="http://schemas.microsoft.com/office/word/2020/wordml/sdtdatahash" xmlns:w16sdtfl="http://schemas.microsoft.com/office/word/2024/wordml/sdtformatlock" xmlns:w16se="http://schemas.microsoft.com/office/word/2015/wordml/symex" xmlns:wpg="http://schemas.microsoft.com/office/word/2010/wordprocessingGroup" xmlns:wpi="http://schemas.microsoft.com/office/word/2010/wordprocessingInk" xmlns:wne="http://schemas.microsoft.com/office/word/2006/wordml" xmlns:wps="http://schemas.microsoft.com/office/word/2010/wordprocessingShape" mc:Ignorable="w14 w15 w16se w16cid w16 w16cex w16sdtdh w16sdtfl w16du wp14">
+<w:hdr xmlns:wpc="http://schemas.microsoft.com/office/word/2010/wordprocessingCanvas" xmlns:cx="http://schemas.microsoft.com/office/drawing/2014/chartex" xmlns:cx1="http://schemas.microsoft.com/office/drawing/2015/9/8/chartex" xmlns:cx2="http://schemas.microsoft.com/office/drawing/2015/10/21/chartex" xmlns:cx3="http://schemas.microsoft.com/office/drawing/2016/5/9/chartex" xmlns:cx4="http://schemas.microsoft.com/office/drawing/2016/5/10/chartex" xmlns:cx5="http://schemas.microsoft.com/office/drawing/2016/5/11/chartex" xmlns:cx6="http://schemas.microsoft.com/office/drawing/2016/5/12/chartex" xmlns:cx7="http://schemas.microsoft.com/office/drawing/2016/5/13/chartex" xmlns:cx8="http://schemas.microsoft.com/office/drawing/2016/5/14/chartex" xmlns:mc="http://schemas.openxmlformats.org/markup-compatibility/2006" xmlns:aink="http://schemas.microsoft.com/office/drawing/2016/ink" xmlns:am3d="http://schemas.microsoft.com/office/drawing/2017/model3d" xmlns:o="urn:schemas-microsoft-com:office:office" xmlns:oel="http://schemas.microsoft.com/office/2019/extlst" xmlns:r="http://schemas.openxmlformats.org/officeDocument/2006/relationships" xmlns:m="http://schemas.openxmlformats.org/officeDocument/2006/math" xmlns:v="urn:schemas-microsoft-com:vml" xmlns:wp14="http://schemas.microsoft.com/office/word/2010/wordprocessingDrawing" xmlns:wp="http://schemas.openxmlformats.org/drawingml/2006/wordprocessingDrawing" xmlns:w10="urn:schemas-microsoft-com:office:word" xmlns:w="http://schemas.openxmlformats.org/wordprocessingml/2006/main" xmlns:w14="http://schemas.microsoft.com/office/word/2010/wordml" xmlns:w15="http://schemas.microsoft.com/office/word/2012/wordml" xmlns:w16cex="http://schemas.microsoft.com/office/word/2018/wordml/cex" xmlns:w16cid="http://schemas.microsoft.com/office/word/2016/wordml/cid" xmlns:w16="http://schemas.microsoft.com/office/word/2018/wordml" xmlns:w16sdtdh="http://schemas.microsoft.com/office/word/2020/wordml/sdtdatahash" xmlns:w16se="http://schemas.microsoft.com/office/word/2015/wordml/symex" xmlns:wpg="http://schemas.microsoft.com/office/word/2010/wordprocessingGroup" xmlns:wpi="http://schemas.microsoft.com/office/word/2010/wordprocessingInk" xmlns:wne="http://schemas.microsoft.com/office/word/2006/wordml" xmlns:wps="http://schemas.microsoft.com/office/word/2010/wordprocessingShape" mc:Ignorable="w14 w15 w16se w16cid w16 w16cex w16sdtdh wp14">
   <w:p>
     <w:pPr>
       <w:pStyle w:val="En-tte"/>
     </w:pPr>
     <w:r>
+      <w:rPr>
+        <w:noProof/>
+      </w:rPr>
       <mc:AlternateContent>
         <mc:Choice Requires="wps">
           <w:drawing>
@@ -1346,6 +2472,9 @@
       </mc:AlternateContent>
     </w:r>
     <w:r>
+      <w:rPr>
+        <w:noProof/>
+      </w:rPr>
       <mc:AlternateContent>
         <mc:Choice Requires="wps">
           <w:drawing>
@@ -1483,7 +2612,7 @@
 </file>
 
 <file path=word/numbering.xml><?xml version="1.0" encoding="utf-8"?>
-<w:numbering xmlns:wpc="http://schemas.microsoft.com/office/word/2010/wordprocessingCanvas" xmlns:cx="http://schemas.microsoft.com/office/drawing/2014/chartex" xmlns:cx1="http://schemas.microsoft.com/office/drawing/2015/9/8/chartex" xmlns:cx2="http://schemas.microsoft.com/office/drawing/2015/10/21/chartex" xmlns:cx3="http://schemas.microsoft.com/office/drawing/2016/5/9/chartex" xmlns:cx4="http://schemas.microsoft.com/office/drawing/2016/5/10/chartex" xmlns:cx5="http://schemas.microsoft.com/office/drawing/2016/5/11/chartex" xmlns:cx6="http://schemas.microsoft.com/office/drawing/2016/5/12/chartex" xmlns:cx7="http://schemas.microsoft.com/office/drawing/2016/5/13/chartex" xmlns:cx8="http://schemas.microsoft.com/office/drawing/2016/5/14/chartex" xmlns:mc="http://schemas.openxmlformats.org/markup-compatibility/2006" xmlns:aink="http://schemas.microsoft.com/office/drawing/2016/ink" xmlns:am3d="http://schemas.microsoft.com/office/drawing/2017/model3d" xmlns:o="urn:schemas-microsoft-com:office:office" xmlns:oel="http://schemas.microsoft.com/office/2019/extlst" xmlns:r="http://schemas.openxmlformats.org/officeDocument/2006/relationships" xmlns:m="http://schemas.openxmlformats.org/officeDocument/2006/math" xmlns:v="urn:schemas-microsoft-com:vml" xmlns:wp14="http://schemas.microsoft.com/office/word/2010/wordprocessingDrawing" xmlns:wp="http://schemas.openxmlformats.org/drawingml/2006/wordprocessingDrawing" xmlns:w10="urn:schemas-microsoft-com:office:word" xmlns:w="http://schemas.openxmlformats.org/wordprocessingml/2006/main" xmlns:w14="http://schemas.microsoft.com/office/word/2010/wordml" xmlns:w15="http://schemas.microsoft.com/office/word/2012/wordml" xmlns:w16cex="http://schemas.microsoft.com/office/word/2018/wordml/cex" xmlns:w16cid="http://schemas.microsoft.com/office/word/2016/wordml/cid" xmlns:w16="http://schemas.microsoft.com/office/word/2018/wordml" xmlns:w16du="http://schemas.microsoft.com/office/word/2023/wordml/word16du" xmlns:w16sdtdh="http://schemas.microsoft.com/office/word/2020/wordml/sdtdatahash" xmlns:w16sdtfl="http://schemas.microsoft.com/office/word/2024/wordml/sdtformatlock" xmlns:w16se="http://schemas.microsoft.com/office/word/2015/wordml/symex" xmlns:wpg="http://schemas.microsoft.com/office/word/2010/wordprocessingGroup" xmlns:wpi="http://schemas.microsoft.com/office/word/2010/wordprocessingInk" xmlns:wne="http://schemas.microsoft.com/office/word/2006/wordml" xmlns:wps="http://schemas.microsoft.com/office/word/2010/wordprocessingShape" mc:Ignorable="w14 w15 w16se w16cid w16 w16cex w16sdtdh w16sdtfl w16du wp14">
+<w:numbering xmlns:wpc="http://schemas.microsoft.com/office/word/2010/wordprocessingCanvas" xmlns:cx="http://schemas.microsoft.com/office/drawing/2014/chartex" xmlns:cx1="http://schemas.microsoft.com/office/drawing/2015/9/8/chartex" xmlns:cx2="http://schemas.microsoft.com/office/drawing/2015/10/21/chartex" xmlns:cx3="http://schemas.microsoft.com/office/drawing/2016/5/9/chartex" xmlns:cx4="http://schemas.microsoft.com/office/drawing/2016/5/10/chartex" xmlns:cx5="http://schemas.microsoft.com/office/drawing/2016/5/11/chartex" xmlns:cx6="http://schemas.microsoft.com/office/drawing/2016/5/12/chartex" xmlns:cx7="http://schemas.microsoft.com/office/drawing/2016/5/13/chartex" xmlns:cx8="http://schemas.microsoft.com/office/drawing/2016/5/14/chartex" xmlns:mc="http://schemas.openxmlformats.org/markup-compatibility/2006" xmlns:aink="http://schemas.microsoft.com/office/drawing/2016/ink" xmlns:am3d="http://schemas.microsoft.com/office/drawing/2017/model3d" xmlns:o="urn:schemas-microsoft-com:office:office" xmlns:oel="http://schemas.microsoft.com/office/2019/extlst" xmlns:r="http://schemas.openxmlformats.org/officeDocument/2006/relationships" xmlns:m="http://schemas.openxmlformats.org/officeDocument/2006/math" xmlns:v="urn:schemas-microsoft-com:vml" xmlns:wp14="http://schemas.microsoft.com/office/word/2010/wordprocessingDrawing" xmlns:wp="http://schemas.openxmlformats.org/drawingml/2006/wordprocessingDrawing" xmlns:w10="urn:schemas-microsoft-com:office:word" xmlns:w="http://schemas.openxmlformats.org/wordprocessingml/2006/main" xmlns:w14="http://schemas.microsoft.com/office/word/2010/wordml" xmlns:w15="http://schemas.microsoft.com/office/word/2012/wordml" xmlns:w16cex="http://schemas.microsoft.com/office/word/2018/wordml/cex" xmlns:w16cid="http://schemas.microsoft.com/office/word/2016/wordml/cid" xmlns:w16="http://schemas.microsoft.com/office/word/2018/wordml" xmlns:w16sdtdh="http://schemas.microsoft.com/office/word/2020/wordml/sdtdatahash" xmlns:w16se="http://schemas.microsoft.com/office/word/2015/wordml/symex" xmlns:wpg="http://schemas.microsoft.com/office/word/2010/wordprocessingGroup" xmlns:wpi="http://schemas.microsoft.com/office/word/2010/wordprocessingInk" xmlns:wne="http://schemas.microsoft.com/office/word/2006/wordml" xmlns:wps="http://schemas.microsoft.com/office/word/2010/wordprocessingShape" mc:Ignorable="w14 w15 w16se w16cid w16 w16cex w16sdtdh wp14">
   <w:abstractNum w:abstractNumId="0" w15:restartNumberingAfterBreak="0">
     <w:nsid w:val="21B31103"/>
     <w:multiLevelType w:val="hybridMultilevel"/>
@@ -1574,6 +2703,345 @@
     </w:lvl>
   </w:abstractNum>
   <w:abstractNum w:abstractNumId="1" w15:restartNumberingAfterBreak="0">
+    <w:nsid w:val="55894058"/>
+    <w:multiLevelType w:val="hybridMultilevel"/>
+    <w:tmpl w:val="BED6D18E"/>
+    <w:lvl w:ilvl="0" w:tplc="5E2C1242">
+      <w:start w:val="5"/>
+      <w:numFmt w:val="bullet"/>
+      <w:lvlText w:val=""/>
+      <w:lvlJc w:val="left"/>
+      <w:pPr>
+        <w:ind w:left="720" w:hanging="360"/>
+      </w:pPr>
+      <w:rPr>
+        <w:rFonts w:ascii="Wingdings" w:eastAsiaTheme="minorHAnsi" w:hAnsi="Wingdings" w:cstheme="minorBidi" w:hint="default"/>
+      </w:rPr>
+    </w:lvl>
+    <w:lvl w:ilvl="1" w:tplc="100C0003" w:tentative="1">
+      <w:start w:val="1"/>
+      <w:numFmt w:val="bullet"/>
+      <w:lvlText w:val="o"/>
+      <w:lvlJc w:val="left"/>
+      <w:pPr>
+        <w:ind w:left="1440" w:hanging="360"/>
+      </w:pPr>
+      <w:rPr>
+        <w:rFonts w:ascii="Courier New" w:hAnsi="Courier New" w:cs="Courier New" w:hint="default"/>
+      </w:rPr>
+    </w:lvl>
+    <w:lvl w:ilvl="2" w:tplc="100C0005" w:tentative="1">
+      <w:start w:val="1"/>
+      <w:numFmt w:val="bullet"/>
+      <w:lvlText w:val=""/>
+      <w:lvlJc w:val="left"/>
+      <w:pPr>
+        <w:ind w:left="2160" w:hanging="360"/>
+      </w:pPr>
+      <w:rPr>
+        <w:rFonts w:ascii="Wingdings" w:hAnsi="Wingdings" w:hint="default"/>
+      </w:rPr>
+    </w:lvl>
+    <w:lvl w:ilvl="3" w:tplc="100C0001" w:tentative="1">
+      <w:start w:val="1"/>
+      <w:numFmt w:val="bullet"/>
+      <w:lvlText w:val=""/>
+      <w:lvlJc w:val="left"/>
+      <w:pPr>
+        <w:ind w:left="2880" w:hanging="360"/>
+      </w:pPr>
+      <w:rPr>
+        <w:rFonts w:ascii="Symbol" w:hAnsi="Symbol" w:hint="default"/>
+      </w:rPr>
+    </w:lvl>
+    <w:lvl w:ilvl="4" w:tplc="100C0003" w:tentative="1">
+      <w:start w:val="1"/>
+      <w:numFmt w:val="bullet"/>
+      <w:lvlText w:val="o"/>
+      <w:lvlJc w:val="left"/>
+      <w:pPr>
+        <w:ind w:left="3600" w:hanging="360"/>
+      </w:pPr>
+      <w:rPr>
+        <w:rFonts w:ascii="Courier New" w:hAnsi="Courier New" w:cs="Courier New" w:hint="default"/>
+      </w:rPr>
+    </w:lvl>
+    <w:lvl w:ilvl="5" w:tplc="100C0005" w:tentative="1">
+      <w:start w:val="1"/>
+      <w:numFmt w:val="bullet"/>
+      <w:lvlText w:val=""/>
+      <w:lvlJc w:val="left"/>
+      <w:pPr>
+        <w:ind w:left="4320" w:hanging="360"/>
+      </w:pPr>
+      <w:rPr>
+        <w:rFonts w:ascii="Wingdings" w:hAnsi="Wingdings" w:hint="default"/>
+      </w:rPr>
+    </w:lvl>
+    <w:lvl w:ilvl="6" w:tplc="100C0001" w:tentative="1">
+      <w:start w:val="1"/>
+      <w:numFmt w:val="bullet"/>
+      <w:lvlText w:val=""/>
+      <w:lvlJc w:val="left"/>
+      <w:pPr>
+        <w:ind w:left="5040" w:hanging="360"/>
+      </w:pPr>
+      <w:rPr>
+        <w:rFonts w:ascii="Symbol" w:hAnsi="Symbol" w:hint="default"/>
+      </w:rPr>
+    </w:lvl>
+    <w:lvl w:ilvl="7" w:tplc="100C0003" w:tentative="1">
+      <w:start w:val="1"/>
+      <w:numFmt w:val="bullet"/>
+      <w:lvlText w:val="o"/>
+      <w:lvlJc w:val="left"/>
+      <w:pPr>
+        <w:ind w:left="5760" w:hanging="360"/>
+      </w:pPr>
+      <w:rPr>
+        <w:rFonts w:ascii="Courier New" w:hAnsi="Courier New" w:cs="Courier New" w:hint="default"/>
+      </w:rPr>
+    </w:lvl>
+    <w:lvl w:ilvl="8" w:tplc="100C0005" w:tentative="1">
+      <w:start w:val="1"/>
+      <w:numFmt w:val="bullet"/>
+      <w:lvlText w:val=""/>
+      <w:lvlJc w:val="left"/>
+      <w:pPr>
+        <w:ind w:left="6480" w:hanging="360"/>
+      </w:pPr>
+      <w:rPr>
+        <w:rFonts w:ascii="Wingdings" w:hAnsi="Wingdings" w:hint="default"/>
+      </w:rPr>
+    </w:lvl>
+  </w:abstractNum>
+  <w:abstractNum w:abstractNumId="2" w15:restartNumberingAfterBreak="0">
+    <w:nsid w:val="5CA43A5A"/>
+    <w:multiLevelType w:val="hybridMultilevel"/>
+    <w:tmpl w:val="C924F67C"/>
+    <w:lvl w:ilvl="0" w:tplc="ED964232">
+      <w:start w:val="5"/>
+      <w:numFmt w:val="bullet"/>
+      <w:lvlText w:val=""/>
+      <w:lvlJc w:val="left"/>
+      <w:pPr>
+        <w:ind w:left="720" w:hanging="360"/>
+      </w:pPr>
+      <w:rPr>
+        <w:rFonts w:ascii="Wingdings" w:eastAsiaTheme="minorHAnsi" w:hAnsi="Wingdings" w:cstheme="minorBidi" w:hint="default"/>
+      </w:rPr>
+    </w:lvl>
+    <w:lvl w:ilvl="1" w:tplc="100C0003" w:tentative="1">
+      <w:start w:val="1"/>
+      <w:numFmt w:val="bullet"/>
+      <w:lvlText w:val="o"/>
+      <w:lvlJc w:val="left"/>
+      <w:pPr>
+        <w:ind w:left="1440" w:hanging="360"/>
+      </w:pPr>
+      <w:rPr>
+        <w:rFonts w:ascii="Courier New" w:hAnsi="Courier New" w:cs="Courier New" w:hint="default"/>
+      </w:rPr>
+    </w:lvl>
+    <w:lvl w:ilvl="2" w:tplc="100C0005" w:tentative="1">
+      <w:start w:val="1"/>
+      <w:numFmt w:val="bullet"/>
+      <w:lvlText w:val=""/>
+      <w:lvlJc w:val="left"/>
+      <w:pPr>
+        <w:ind w:left="2160" w:hanging="360"/>
+      </w:pPr>
+      <w:rPr>
+        <w:rFonts w:ascii="Wingdings" w:hAnsi="Wingdings" w:hint="default"/>
+      </w:rPr>
+    </w:lvl>
+    <w:lvl w:ilvl="3" w:tplc="100C0001" w:tentative="1">
+      <w:start w:val="1"/>
+      <w:numFmt w:val="bullet"/>
+      <w:lvlText w:val=""/>
+      <w:lvlJc w:val="left"/>
+      <w:pPr>
+        <w:ind w:left="2880" w:hanging="360"/>
+      </w:pPr>
+      <w:rPr>
+        <w:rFonts w:ascii="Symbol" w:hAnsi="Symbol" w:hint="default"/>
+      </w:rPr>
+    </w:lvl>
+    <w:lvl w:ilvl="4" w:tplc="100C0003" w:tentative="1">
+      <w:start w:val="1"/>
+      <w:numFmt w:val="bullet"/>
+      <w:lvlText w:val="o"/>
+      <w:lvlJc w:val="left"/>
+      <w:pPr>
+        <w:ind w:left="3600" w:hanging="360"/>
+      </w:pPr>
+      <w:rPr>
+        <w:rFonts w:ascii="Courier New" w:hAnsi="Courier New" w:cs="Courier New" w:hint="default"/>
+      </w:rPr>
+    </w:lvl>
+    <w:lvl w:ilvl="5" w:tplc="100C0005" w:tentative="1">
+      <w:start w:val="1"/>
+      <w:numFmt w:val="bullet"/>
+      <w:lvlText w:val=""/>
+      <w:lvlJc w:val="left"/>
+      <w:pPr>
+        <w:ind w:left="4320" w:hanging="360"/>
+      </w:pPr>
+      <w:rPr>
+        <w:rFonts w:ascii="Wingdings" w:hAnsi="Wingdings" w:hint="default"/>
+      </w:rPr>
+    </w:lvl>
+    <w:lvl w:ilvl="6" w:tplc="100C0001" w:tentative="1">
+      <w:start w:val="1"/>
+      <w:numFmt w:val="bullet"/>
+      <w:lvlText w:val=""/>
+      <w:lvlJc w:val="left"/>
+      <w:pPr>
+        <w:ind w:left="5040" w:hanging="360"/>
+      </w:pPr>
+      <w:rPr>
+        <w:rFonts w:ascii="Symbol" w:hAnsi="Symbol" w:hint="default"/>
+      </w:rPr>
+    </w:lvl>
+    <w:lvl w:ilvl="7" w:tplc="100C0003" w:tentative="1">
+      <w:start w:val="1"/>
+      <w:numFmt w:val="bullet"/>
+      <w:lvlText w:val="o"/>
+      <w:lvlJc w:val="left"/>
+      <w:pPr>
+        <w:ind w:left="5760" w:hanging="360"/>
+      </w:pPr>
+      <w:rPr>
+        <w:rFonts w:ascii="Courier New" w:hAnsi="Courier New" w:cs="Courier New" w:hint="default"/>
+      </w:rPr>
+    </w:lvl>
+    <w:lvl w:ilvl="8" w:tplc="100C0005" w:tentative="1">
+      <w:start w:val="1"/>
+      <w:numFmt w:val="bullet"/>
+      <w:lvlText w:val=""/>
+      <w:lvlJc w:val="left"/>
+      <w:pPr>
+        <w:ind w:left="6480" w:hanging="360"/>
+      </w:pPr>
+      <w:rPr>
+        <w:rFonts w:ascii="Wingdings" w:hAnsi="Wingdings" w:hint="default"/>
+      </w:rPr>
+    </w:lvl>
+  </w:abstractNum>
+  <w:abstractNum w:abstractNumId="3" w15:restartNumberingAfterBreak="0">
+    <w:nsid w:val="68217A16"/>
+    <w:multiLevelType w:val="hybridMultilevel"/>
+    <w:tmpl w:val="D8F00BE8"/>
+    <w:lvl w:ilvl="0" w:tplc="B0A88CD8">
+      <w:start w:val="5"/>
+      <w:numFmt w:val="bullet"/>
+      <w:lvlText w:val=""/>
+      <w:lvlJc w:val="left"/>
+      <w:pPr>
+        <w:ind w:left="720" w:hanging="360"/>
+      </w:pPr>
+      <w:rPr>
+        <w:rFonts w:ascii="Wingdings" w:eastAsiaTheme="minorHAnsi" w:hAnsi="Wingdings" w:cstheme="minorBidi" w:hint="default"/>
+      </w:rPr>
+    </w:lvl>
+    <w:lvl w:ilvl="1" w:tplc="100C0003" w:tentative="1">
+      <w:start w:val="1"/>
+      <w:numFmt w:val="bullet"/>
+      <w:lvlText w:val="o"/>
+      <w:lvlJc w:val="left"/>
+      <w:pPr>
+        <w:ind w:left="1440" w:hanging="360"/>
+      </w:pPr>
+      <w:rPr>
+        <w:rFonts w:ascii="Courier New" w:hAnsi="Courier New" w:cs="Courier New" w:hint="default"/>
+      </w:rPr>
+    </w:lvl>
+    <w:lvl w:ilvl="2" w:tplc="100C0005" w:tentative="1">
+      <w:start w:val="1"/>
+      <w:numFmt w:val="bullet"/>
+      <w:lvlText w:val=""/>
+      <w:lvlJc w:val="left"/>
+      <w:pPr>
+        <w:ind w:left="2160" w:hanging="360"/>
+      </w:pPr>
+      <w:rPr>
+        <w:rFonts w:ascii="Wingdings" w:hAnsi="Wingdings" w:hint="default"/>
+      </w:rPr>
+    </w:lvl>
+    <w:lvl w:ilvl="3" w:tplc="100C0001" w:tentative="1">
+      <w:start w:val="1"/>
+      <w:numFmt w:val="bullet"/>
+      <w:lvlText w:val=""/>
+      <w:lvlJc w:val="left"/>
+      <w:pPr>
+        <w:ind w:left="2880" w:hanging="360"/>
+      </w:pPr>
+      <w:rPr>
+        <w:rFonts w:ascii="Symbol" w:hAnsi="Symbol" w:hint="default"/>
+      </w:rPr>
+    </w:lvl>
+    <w:lvl w:ilvl="4" w:tplc="100C0003" w:tentative="1">
+      <w:start w:val="1"/>
+      <w:numFmt w:val="bullet"/>
+      <w:lvlText w:val="o"/>
+      <w:lvlJc w:val="left"/>
+      <w:pPr>
+        <w:ind w:left="3600" w:hanging="360"/>
+      </w:pPr>
+      <w:rPr>
+        <w:rFonts w:ascii="Courier New" w:hAnsi="Courier New" w:cs="Courier New" w:hint="default"/>
+      </w:rPr>
+    </w:lvl>
+    <w:lvl w:ilvl="5" w:tplc="100C0005" w:tentative="1">
+      <w:start w:val="1"/>
+      <w:numFmt w:val="bullet"/>
+      <w:lvlText w:val=""/>
+      <w:lvlJc w:val="left"/>
+      <w:pPr>
+        <w:ind w:left="4320" w:hanging="360"/>
+      </w:pPr>
+      <w:rPr>
+        <w:rFonts w:ascii="Wingdings" w:hAnsi="Wingdings" w:hint="default"/>
+      </w:rPr>
+    </w:lvl>
+    <w:lvl w:ilvl="6" w:tplc="100C0001" w:tentative="1">
+      <w:start w:val="1"/>
+      <w:numFmt w:val="bullet"/>
+      <w:lvlText w:val=""/>
+      <w:lvlJc w:val="left"/>
+      <w:pPr>
+        <w:ind w:left="5040" w:hanging="360"/>
+      </w:pPr>
+      <w:rPr>
+        <w:rFonts w:ascii="Symbol" w:hAnsi="Symbol" w:hint="default"/>
+      </w:rPr>
+    </w:lvl>
+    <w:lvl w:ilvl="7" w:tplc="100C0003" w:tentative="1">
+      <w:start w:val="1"/>
+      <w:numFmt w:val="bullet"/>
+      <w:lvlText w:val="o"/>
+      <w:lvlJc w:val="left"/>
+      <w:pPr>
+        <w:ind w:left="5760" w:hanging="360"/>
+      </w:pPr>
+      <w:rPr>
+        <w:rFonts w:ascii="Courier New" w:hAnsi="Courier New" w:cs="Courier New" w:hint="default"/>
+      </w:rPr>
+    </w:lvl>
+    <w:lvl w:ilvl="8" w:tplc="100C0005" w:tentative="1">
+      <w:start w:val="1"/>
+      <w:numFmt w:val="bullet"/>
+      <w:lvlText w:val=""/>
+      <w:lvlJc w:val="left"/>
+      <w:pPr>
+        <w:ind w:left="6480" w:hanging="360"/>
+      </w:pPr>
+      <w:rPr>
+        <w:rFonts w:ascii="Wingdings" w:hAnsi="Wingdings" w:hint="default"/>
+      </w:rPr>
+    </w:lvl>
+  </w:abstractNum>
+  <w:abstractNum w:abstractNumId="4" w15:restartNumberingAfterBreak="0">
     <w:nsid w:val="70AC432E"/>
     <w:multiLevelType w:val="hybridMultilevel"/>
     <w:tmpl w:val="88AE25EE"/>
@@ -1662,7 +3130,7 @@
       </w:pPr>
     </w:lvl>
   </w:abstractNum>
-  <w:abstractNum w:abstractNumId="2" w15:restartNumberingAfterBreak="0">
+  <w:abstractNum w:abstractNumId="5" w15:restartNumberingAfterBreak="0">
     <w:nsid w:val="799C30BC"/>
     <w:multiLevelType w:val="hybridMultilevel"/>
     <w:tmpl w:val="8D80DFB0"/>
@@ -1752,19 +3220,28 @@
     </w:lvl>
   </w:abstractNum>
   <w:num w:numId="1" w16cid:durableId="1932200371">
-    <w:abstractNumId w:val="2"/>
+    <w:abstractNumId w:val="5"/>
   </w:num>
   <w:num w:numId="2" w16cid:durableId="1384259163">
-    <w:abstractNumId w:val="1"/>
+    <w:abstractNumId w:val="4"/>
   </w:num>
   <w:num w:numId="3" w16cid:durableId="309990493">
     <w:abstractNumId w:val="0"/>
+  </w:num>
+  <w:num w:numId="4" w16cid:durableId="817889362">
+    <w:abstractNumId w:val="2"/>
+  </w:num>
+  <w:num w:numId="5" w16cid:durableId="306323428">
+    <w:abstractNumId w:val="1"/>
+  </w:num>
+  <w:num w:numId="6" w16cid:durableId="1381517572">
+    <w:abstractNumId w:val="3"/>
   </w:num>
 </w:numbering>
 </file>
 
 <file path=word/styles.xml><?xml version="1.0" encoding="utf-8"?>
-<w:styles xmlns:mc="http://schemas.openxmlformats.org/markup-compatibility/2006" xmlns:r="http://schemas.openxmlformats.org/officeDocument/2006/relationships" xmlns:w="http://schemas.openxmlformats.org/wordprocessingml/2006/main" xmlns:w14="http://schemas.microsoft.com/office/word/2010/wordml" xmlns:w15="http://schemas.microsoft.com/office/word/2012/wordml" xmlns:w16cex="http://schemas.microsoft.com/office/word/2018/wordml/cex" xmlns:w16cid="http://schemas.microsoft.com/office/word/2016/wordml/cid" xmlns:w16="http://schemas.microsoft.com/office/word/2018/wordml" xmlns:w16du="http://schemas.microsoft.com/office/word/2023/wordml/word16du" xmlns:w16sdtdh="http://schemas.microsoft.com/office/word/2020/wordml/sdtdatahash" xmlns:w16sdtfl="http://schemas.microsoft.com/office/word/2024/wordml/sdtformatlock" xmlns:w16se="http://schemas.microsoft.com/office/word/2015/wordml/symex" mc:Ignorable="w14 w15 w16se w16cid w16 w16cex w16sdtdh w16sdtfl w16du">
+<w:styles xmlns:mc="http://schemas.openxmlformats.org/markup-compatibility/2006" xmlns:r="http://schemas.openxmlformats.org/officeDocument/2006/relationships" xmlns:w="http://schemas.openxmlformats.org/wordprocessingml/2006/main" xmlns:w14="http://schemas.microsoft.com/office/word/2010/wordml" xmlns:w15="http://schemas.microsoft.com/office/word/2012/wordml" xmlns:w16cex="http://schemas.microsoft.com/office/word/2018/wordml/cex" xmlns:w16cid="http://schemas.microsoft.com/office/word/2016/wordml/cid" xmlns:w16="http://schemas.microsoft.com/office/word/2018/wordml" xmlns:w16sdtdh="http://schemas.microsoft.com/office/word/2020/wordml/sdtdatahash" xmlns:w16se="http://schemas.microsoft.com/office/word/2015/wordml/symex" mc:Ignorable="w14 w15 w16se w16cid w16 w16cex w16sdtdh">
   <w:docDefaults>
     <w:rPrDefault>
       <w:rPr>
@@ -2163,7 +3640,7 @@
   <w:style w:type="paragraph" w:default="1" w:styleId="Normal">
     <w:name w:val="Normal"/>
     <w:qFormat/>
-    <w:rsid w:val="00A3556E"/>
+    <w:rsid w:val="00A275D4"/>
   </w:style>
   <w:style w:type="paragraph" w:styleId="Titre1">
     <w:name w:val="heading 1"/>
@@ -2365,7 +3842,6 @@
   <w:style w:type="character" w:default="1" w:styleId="Policepardfaut">
     <w:name w:val="Default Paragraph Font"/>
     <w:uiPriority w:val="1"/>
-    <w:semiHidden/>
     <w:unhideWhenUsed/>
   </w:style>
   <w:style w:type="table" w:default="1" w:styleId="TableauNormal">
@@ -2792,6 +4268,18 @@
       <w:u w:val="single"/>
     </w:rPr>
   </w:style>
+  <w:style w:type="character" w:styleId="Mentionnonrsolue">
+    <w:name w:val="Unresolved Mention"/>
+    <w:basedOn w:val="Policepardfaut"/>
+    <w:uiPriority w:val="99"/>
+    <w:semiHidden/>
+    <w:unhideWhenUsed/>
+    <w:rsid w:val="00C75755"/>
+    <w:rPr>
+      <w:color w:val="605E5C"/>
+      <w:shd w:val="clear" w:color="auto" w:fill="E1DFDD"/>
+    </w:rPr>
+  </w:style>
 </w:styles>
 </file>
 

</xml_diff>

<commit_message>
Doc (rapport) : LOAD DATA
Mise à jour des requêtes du rapport
</commit_message>
<xml_diff>
--- a/R106-JonJunod-ThanosPizza.docx
+++ b/R106-JonJunod-ThanosPizza.docx
@@ -689,7 +689,15 @@
         <w:t>nen</w:t>
       </w:r>
       <w:r>
-        <w:t>t toutes les données à insérer et voici ce que j’ai fait pour les loader.</w:t>
+        <w:t xml:space="preserve">t toutes les données à insérer et voici ce que j’ai fait pour </w:t>
+      </w:r>
+      <w:proofErr w:type="gramStart"/>
+      <w:r>
+        <w:t>les loader</w:t>
+      </w:r>
+      <w:proofErr w:type="gramEnd"/>
+      <w:r>
+        <w:t>.</w:t>
       </w:r>
     </w:p>
     <w:p>
@@ -842,8 +850,16 @@
           <w:lang w:val="en-US"/>
         </w:rPr>
         <w:tab/>
-        <w:t>IGNORE 1 LINES;</w:t>
-      </w:r>
+        <w:t xml:space="preserve">IGNORE 1 </w:t>
+      </w:r>
+      <w:proofErr w:type="gramStart"/>
+      <w:r>
+        <w:rPr>
+          <w:lang w:val="en-US"/>
+        </w:rPr>
+        <w:t>LINES;</w:t>
+      </w:r>
+      <w:proofErr w:type="gramEnd"/>
     </w:p>
     <w:p>
       <w:pPr>
@@ -961,8 +977,16 @@
           <w:lang w:val="en-US"/>
         </w:rPr>
         <w:tab/>
-        <w:t>IGNORE 1 LINES;</w:t>
-      </w:r>
+        <w:t xml:space="preserve">IGNORE 1 </w:t>
+      </w:r>
+      <w:proofErr w:type="gramStart"/>
+      <w:r>
+        <w:rPr>
+          <w:lang w:val="en-US"/>
+        </w:rPr>
+        <w:t>LINES;</w:t>
+      </w:r>
+      <w:proofErr w:type="gramEnd"/>
     </w:p>
     <w:p>
       <w:pPr>
@@ -1075,8 +1099,16 @@
           <w:lang w:val="en-US"/>
         </w:rPr>
         <w:tab/>
-        <w:t>IGNORE 1 LINES;</w:t>
-      </w:r>
+        <w:t xml:space="preserve">IGNORE 1 </w:t>
+      </w:r>
+      <w:proofErr w:type="gramStart"/>
+      <w:r>
+        <w:rPr>
+          <w:lang w:val="en-US"/>
+        </w:rPr>
+        <w:t>LINES;</w:t>
+      </w:r>
+      <w:proofErr w:type="gramEnd"/>
     </w:p>
     <w:p>
       <w:pPr>
@@ -1493,8 +1525,13 @@
         <w:t xml:space="preserve">    </w:t>
       </w:r>
       <w:proofErr w:type="spellStart"/>
-      <w:r>
-        <w:t>date_et_heure</w:t>
+      <w:proofErr w:type="gramStart"/>
+      <w:r>
+        <w:t>date</w:t>
+      </w:r>
+      <w:proofErr w:type="gramEnd"/>
+      <w:r>
+        <w:t>_et_heure</w:t>
       </w:r>
       <w:proofErr w:type="spellEnd"/>
       <w:r>
@@ -1870,7 +1907,13 @@
       </w:pPr>
       <w:r>
         <w:lastRenderedPageBreak/>
-        <w:t>--table 7</w:t>
+        <w:t>--</w:t>
+      </w:r>
+      <w:r>
+        <w:t xml:space="preserve"> </w:t>
+      </w:r>
+      <w:r>
+        <w:t>table 7</w:t>
       </w:r>
     </w:p>
     <w:p>
@@ -2031,7 +2074,13 @@
         <w:keepNext/>
       </w:pPr>
       <w:r>
-        <w:t>--table 8</w:t>
+        <w:t>--</w:t>
+      </w:r>
+      <w:r>
+        <w:t xml:space="preserve"> </w:t>
+      </w:r>
+      <w:r>
+        <w:t>table 8</w:t>
       </w:r>
     </w:p>
     <w:p>
@@ -2072,8 +2121,16 @@
         <w:rPr>
           <w:lang w:val="en-US"/>
         </w:rPr>
-        <w:t>INTO TABLE t_livraison</w:t>
-      </w:r>
+        <w:t xml:space="preserve">INTO TABLE </w:t>
+      </w:r>
+      <w:proofErr w:type="spellStart"/>
+      <w:r>
+        <w:rPr>
+          <w:lang w:val="en-US"/>
+        </w:rPr>
+        <w:t>t_livraison</w:t>
+      </w:r>
+      <w:proofErr w:type="spellEnd"/>
     </w:p>
     <w:p>
       <w:pPr>
@@ -2183,8 +2240,13 @@
         <w:t xml:space="preserve">    </w:t>
       </w:r>
       <w:proofErr w:type="spellStart"/>
-      <w:r>
-        <w:t>heure_arrivee</w:t>
+      <w:proofErr w:type="gramStart"/>
+      <w:r>
+        <w:t>heure</w:t>
+      </w:r>
+      <w:proofErr w:type="gramEnd"/>
+      <w:r>
+        <w:t>_arrivee</w:t>
       </w:r>
       <w:proofErr w:type="spellEnd"/>
       <w:r>

</xml_diff>

<commit_message>
doc(rapport partie users et rôles) : ajout des roles
Rédaction de la partie rôles, avec les informations du rapport, nous pouvons créer les rôles demandés.
</commit_message>
<xml_diff>
--- a/R106-JonJunod-ThanosPizza.docx
+++ b/R106-JonJunod-ThanosPizza.docx
@@ -611,13 +611,84 @@
         <w:t>Rappel sur la configuration de docker</w:t>
       </w:r>
     </w:p>
-    <w:p/>
+    <w:p>
+      <w:r>
+        <w:t>Le docker-compose est trouvable dans …\</w:t>
+      </w:r>
+      <w:r>
+        <w:t>106-P_DB-ThanosPizza\</w:t>
+      </w:r>
+      <w:proofErr w:type="spellStart"/>
+      <w:r>
+        <w:t>Docker_MySQL</w:t>
+      </w:r>
+      <w:proofErr w:type="spellEnd"/>
+    </w:p>
+    <w:p>
+      <w:r>
+        <w:t xml:space="preserve">Il a été modifié afin de pouvoir lier le dossier scripts et </w:t>
+      </w:r>
+      <w:proofErr w:type="spellStart"/>
+      <w:r>
+        <w:t>mysql</w:t>
+      </w:r>
+      <w:proofErr w:type="spellEnd"/>
+      <w:r>
+        <w:t>. Pour ceci la partie volumes du fichier a été légèrement modifiée. Voici ce que ça donne après la modification.</w:t>
+      </w:r>
+    </w:p>
+    <w:p>
+      <w:pPr>
+        <w:pStyle w:val="Sansinterligne"/>
+      </w:pPr>
+      <w:r>
+        <w:t>volumes:</w:t>
+      </w:r>
+    </w:p>
+    <w:p>
+      <w:pPr>
+        <w:pStyle w:val="Sansinterligne"/>
+      </w:pPr>
+      <w:r>
+        <w:t xml:space="preserve">      - </w:t>
+      </w:r>
+      <w:proofErr w:type="spellStart"/>
+      <w:r>
+        <w:t>dbdata</w:t>
+      </w:r>
+      <w:proofErr w:type="spellEnd"/>
+      <w:r>
+        <w:t>:/var/lib/</w:t>
+      </w:r>
+      <w:proofErr w:type="spellStart"/>
+      <w:r>
+        <w:t>mysql</w:t>
+      </w:r>
+      <w:proofErr w:type="spellEnd"/>
+    </w:p>
+    <w:p>
+      <w:pPr>
+        <w:pStyle w:val="Sansinterligne"/>
+      </w:pPr>
+      <w:r>
+        <w:t xml:space="preserve">      - ./scripts:/var/lib/</w:t>
+      </w:r>
+      <w:proofErr w:type="spellStart"/>
+      <w:r>
+        <w:t>mysql</w:t>
+      </w:r>
+      <w:proofErr w:type="spellEnd"/>
+      <w:r>
+        <w:t>-files</w:t>
+      </w:r>
+    </w:p>
     <w:p>
       <w:pPr>
         <w:pStyle w:val="Titre2"/>
       </w:pPr>
       <w:bookmarkStart w:id="1" w:name="_Toc210392958"/>
       <w:r>
+        <w:lastRenderedPageBreak/>
         <w:t>Chargement des données</w:t>
       </w:r>
       <w:bookmarkEnd w:id="1"/>
@@ -689,20 +760,11 @@
         <w:t>nen</w:t>
       </w:r>
       <w:r>
-        <w:t xml:space="preserve">t toutes les données à insérer et voici ce que j’ai fait pour </w:t>
-      </w:r>
-      <w:proofErr w:type="gramStart"/>
-      <w:r>
-        <w:t>les loader</w:t>
-      </w:r>
-      <w:proofErr w:type="gramEnd"/>
-      <w:r>
-        <w:t>.</w:t>
-      </w:r>
-    </w:p>
-    <w:p>
-      <w:r>
-        <w:lastRenderedPageBreak/>
+        <w:t>t toutes les données à insérer et voici ce que j’ai fait pour les loader.</w:t>
+      </w:r>
+    </w:p>
+    <w:p>
+      <w:r>
         <w:t>Premier pas : créer la structure de la base de données. Facile il suffit de copier-coller le script LDD de Looping, après avoir ajouté l’énoncé CREATE-USE database manuellement, vers un fichier texte. Il faut ensuite placer le fichier texte dans le répertoire scripts de docker et l’importer à l’aide de la commande suivante à jouer dans la console “</w:t>
       </w:r>
       <w:proofErr w:type="spellStart"/>
@@ -750,28 +812,56 @@
       </w:r>
     </w:p>
     <w:p>
-      <w:r>
+      <w:pPr>
+        <w:rPr>
+          <w:lang w:val="en-US"/>
+        </w:rPr>
+      </w:pPr>
+      <w:r>
+        <w:rPr>
+          <w:lang w:val="en-US"/>
+        </w:rPr>
         <w:t>-- table 1</w:t>
       </w:r>
     </w:p>
     <w:p>
-      <w:r>
+      <w:pPr>
+        <w:rPr>
+          <w:lang w:val="en-US"/>
+        </w:rPr>
+      </w:pPr>
+      <w:r>
+        <w:rPr>
+          <w:lang w:val="en-US"/>
+        </w:rPr>
         <w:t>LOAD DATA INFILE '/var/lib/</w:t>
       </w:r>
       <w:proofErr w:type="spellStart"/>
       <w:r>
+        <w:rPr>
+          <w:lang w:val="en-US"/>
+        </w:rPr>
         <w:t>mysql</w:t>
       </w:r>
       <w:proofErr w:type="spellEnd"/>
       <w:r>
+        <w:rPr>
+          <w:lang w:val="en-US"/>
+        </w:rPr>
         <w:t>-files/</w:t>
       </w:r>
       <w:proofErr w:type="spellStart"/>
       <w:r>
+        <w:rPr>
+          <w:lang w:val="en-US"/>
+        </w:rPr>
         <w:t>t_article.tsv</w:t>
       </w:r>
       <w:proofErr w:type="spellEnd"/>
       <w:r>
+        <w:rPr>
+          <w:lang w:val="en-US"/>
+        </w:rPr>
         <w:t xml:space="preserve">' </w:t>
       </w:r>
     </w:p>
@@ -782,6 +872,9 @@
         </w:rPr>
       </w:pPr>
       <w:r>
+        <w:rPr>
+          <w:lang w:val="en-US"/>
+        </w:rPr>
         <w:tab/>
       </w:r>
       <w:r>
@@ -850,16 +943,8 @@
           <w:lang w:val="en-US"/>
         </w:rPr>
         <w:tab/>
-        <w:t xml:space="preserve">IGNORE 1 </w:t>
-      </w:r>
-      <w:proofErr w:type="gramStart"/>
-      <w:r>
-        <w:rPr>
-          <w:lang w:val="en-US"/>
-        </w:rPr>
-        <w:t>LINES;</w:t>
-      </w:r>
-      <w:proofErr w:type="gramEnd"/>
+        <w:t>IGNORE 1 LINES;</w:t>
+      </w:r>
     </w:p>
     <w:p>
       <w:pPr>
@@ -882,23 +967,43 @@
       </w:r>
     </w:p>
     <w:p>
-      <w:r>
+      <w:pPr>
+        <w:rPr>
+          <w:lang w:val="en-US"/>
+        </w:rPr>
+      </w:pPr>
+      <w:r>
+        <w:rPr>
+          <w:lang w:val="en-US"/>
+        </w:rPr>
         <w:t>LOAD DATA INFILE '/var/lib/</w:t>
       </w:r>
       <w:proofErr w:type="spellStart"/>
       <w:r>
+        <w:rPr>
+          <w:lang w:val="en-US"/>
+        </w:rPr>
         <w:t>mysql</w:t>
       </w:r>
       <w:proofErr w:type="spellEnd"/>
       <w:r>
+        <w:rPr>
+          <w:lang w:val="en-US"/>
+        </w:rPr>
         <w:t>-files/</w:t>
       </w:r>
       <w:proofErr w:type="spellStart"/>
       <w:r>
+        <w:rPr>
+          <w:lang w:val="en-US"/>
+        </w:rPr>
         <w:t>t_livreur.tsv</w:t>
       </w:r>
       <w:proofErr w:type="spellEnd"/>
       <w:r>
+        <w:rPr>
+          <w:lang w:val="en-US"/>
+        </w:rPr>
         <w:t xml:space="preserve">' </w:t>
       </w:r>
     </w:p>
@@ -909,6 +1014,9 @@
         </w:rPr>
       </w:pPr>
       <w:r>
+        <w:rPr>
+          <w:lang w:val="en-US"/>
+        </w:rPr>
         <w:tab/>
       </w:r>
       <w:r>
@@ -977,50 +1085,67 @@
           <w:lang w:val="en-US"/>
         </w:rPr>
         <w:tab/>
-        <w:t xml:space="preserve">IGNORE 1 </w:t>
-      </w:r>
-      <w:proofErr w:type="gramStart"/>
-      <w:r>
-        <w:rPr>
-          <w:lang w:val="en-US"/>
-        </w:rPr>
-        <w:t>LINES;</w:t>
-      </w:r>
-      <w:proofErr w:type="gramEnd"/>
-    </w:p>
-    <w:p>
-      <w:pPr>
-        <w:rPr>
-          <w:lang w:val="en-US"/>
-        </w:rPr>
-      </w:pPr>
-    </w:p>
-    <w:p>
-      <w:r>
-        <w:t>-- t</w:t>
-      </w:r>
-      <w:r>
-        <w:t>able 3</w:t>
-      </w:r>
-    </w:p>
-    <w:p>
-      <w:r>
+        <w:t>IGNORE 1 LINES;</w:t>
+      </w:r>
+    </w:p>
+    <w:p>
+      <w:pPr>
+        <w:rPr>
+          <w:lang w:val="en-US"/>
+        </w:rPr>
+      </w:pPr>
+    </w:p>
+    <w:p>
+      <w:pPr>
+        <w:rPr>
+          <w:lang w:val="en-US"/>
+        </w:rPr>
+      </w:pPr>
+      <w:r>
+        <w:rPr>
+          <w:lang w:val="en-US"/>
+        </w:rPr>
+        <w:t>-- table 3</w:t>
+      </w:r>
+    </w:p>
+    <w:p>
+      <w:pPr>
+        <w:rPr>
+          <w:lang w:val="en-US"/>
+        </w:rPr>
+      </w:pPr>
+      <w:r>
+        <w:rPr>
+          <w:lang w:val="en-US"/>
+        </w:rPr>
         <w:t>LOAD DATA INFILE '/var/lib/</w:t>
       </w:r>
       <w:proofErr w:type="spellStart"/>
       <w:r>
+        <w:rPr>
+          <w:lang w:val="en-US"/>
+        </w:rPr>
         <w:t>mysql</w:t>
       </w:r>
       <w:proofErr w:type="spellEnd"/>
       <w:r>
+        <w:rPr>
+          <w:lang w:val="en-US"/>
+        </w:rPr>
         <w:t>-files/</w:t>
       </w:r>
       <w:proofErr w:type="spellStart"/>
       <w:r>
+        <w:rPr>
+          <w:lang w:val="en-US"/>
+        </w:rPr>
         <w:t>t_client.tsv</w:t>
       </w:r>
       <w:proofErr w:type="spellEnd"/>
       <w:r>
+        <w:rPr>
+          <w:lang w:val="en-US"/>
+        </w:rPr>
         <w:t xml:space="preserve">' </w:t>
       </w:r>
     </w:p>
@@ -1031,6 +1156,9 @@
         </w:rPr>
       </w:pPr>
       <w:r>
+        <w:rPr>
+          <w:lang w:val="en-US"/>
+        </w:rPr>
         <w:tab/>
       </w:r>
       <w:r>
@@ -1099,16 +1227,8 @@
           <w:lang w:val="en-US"/>
         </w:rPr>
         <w:tab/>
-        <w:t xml:space="preserve">IGNORE 1 </w:t>
-      </w:r>
-      <w:proofErr w:type="gramStart"/>
-      <w:r>
-        <w:rPr>
-          <w:lang w:val="en-US"/>
-        </w:rPr>
-        <w:t>LINES;</w:t>
-      </w:r>
-      <w:proofErr w:type="gramEnd"/>
+        <w:t>IGNORE 1 LINES;</w:t>
+      </w:r>
     </w:p>
     <w:p>
       <w:pPr>
@@ -1128,7 +1248,6 @@
         <w:rPr>
           <w:lang w:val="en-US"/>
         </w:rPr>
-        <w:lastRenderedPageBreak/>
         <w:t>-</w:t>
       </w:r>
       <w:r>
@@ -1260,6 +1379,9 @@
     <w:p>
       <w:pPr>
         <w:keepNext/>
+        <w:rPr>
+          <w:lang w:val="en-US"/>
+        </w:rPr>
       </w:pPr>
       <w:r>
         <w:rPr>
@@ -1268,6 +1390,9 @@
         <w:tab/>
       </w:r>
       <w:r>
+        <w:rPr>
+          <w:lang w:val="en-US"/>
+        </w:rPr>
         <w:t>IGNORE 1 LINES</w:t>
       </w:r>
     </w:p>
@@ -1276,7 +1401,13 @@
         <w:keepNext/>
       </w:pPr>
       <w:r>
-        <w:t xml:space="preserve">    (`</w:t>
+        <w:rPr>
+          <w:lang w:val="en-US"/>
+        </w:rPr>
+        <w:t xml:space="preserve">    </w:t>
+      </w:r>
+      <w:r>
+        <w:t>(`</w:t>
       </w:r>
       <w:proofErr w:type="spellStart"/>
       <w:r>
@@ -1525,13 +1656,8 @@
         <w:t xml:space="preserve">    </w:t>
       </w:r>
       <w:proofErr w:type="spellStart"/>
-      <w:proofErr w:type="gramStart"/>
-      <w:r>
-        <w:t>date</w:t>
-      </w:r>
-      <w:proofErr w:type="gramEnd"/>
-      <w:r>
-        <w:t>_et_heure</w:t>
+      <w:r>
+        <w:t>date_et_heure</w:t>
       </w:r>
       <w:proofErr w:type="spellEnd"/>
       <w:r>
@@ -1904,39 +2030,69 @@
     <w:p>
       <w:pPr>
         <w:keepNext/>
-      </w:pPr>
-      <w:r>
+        <w:rPr>
+          <w:lang w:val="en-US"/>
+        </w:rPr>
+      </w:pPr>
+      <w:r>
+        <w:rPr>
+          <w:lang w:val="en-US"/>
+        </w:rPr>
         <w:lastRenderedPageBreak/>
         <w:t>--</w:t>
       </w:r>
       <w:r>
+        <w:rPr>
+          <w:lang w:val="en-US"/>
+        </w:rPr>
         <w:t xml:space="preserve"> </w:t>
       </w:r>
       <w:r>
+        <w:rPr>
+          <w:lang w:val="en-US"/>
+        </w:rPr>
         <w:t>table 7</w:t>
       </w:r>
     </w:p>
     <w:p>
       <w:pPr>
         <w:keepNext/>
-      </w:pPr>
-      <w:r>
+        <w:rPr>
+          <w:lang w:val="en-US"/>
+        </w:rPr>
+      </w:pPr>
+      <w:r>
+        <w:rPr>
+          <w:lang w:val="en-US"/>
+        </w:rPr>
         <w:t>LOAD DATA INFILE '/var/lib/</w:t>
       </w:r>
       <w:proofErr w:type="spellStart"/>
       <w:r>
+        <w:rPr>
+          <w:lang w:val="en-US"/>
+        </w:rPr>
         <w:t>mysql</w:t>
       </w:r>
       <w:proofErr w:type="spellEnd"/>
       <w:r>
+        <w:rPr>
+          <w:lang w:val="en-US"/>
+        </w:rPr>
         <w:t>-files/</w:t>
       </w:r>
       <w:proofErr w:type="spellStart"/>
       <w:r>
+        <w:rPr>
+          <w:lang w:val="en-US"/>
+        </w:rPr>
         <w:t>t_paiement.tsv</w:t>
       </w:r>
       <w:proofErr w:type="spellEnd"/>
       <w:r>
+        <w:rPr>
+          <w:lang w:val="en-US"/>
+        </w:rPr>
         <w:t xml:space="preserve">' </w:t>
       </w:r>
     </w:p>
@@ -1948,6 +2104,9 @@
         </w:rPr>
       </w:pPr>
       <w:r>
+        <w:rPr>
+          <w:lang w:val="en-US"/>
+        </w:rPr>
         <w:tab/>
       </w:r>
       <w:r>
@@ -1998,15 +2157,14 @@
     <w:p>
       <w:pPr>
         <w:keepNext/>
-        <w:rPr>
-          <w:lang w:val="en-US"/>
-        </w:rPr>
       </w:pPr>
       <w:r>
         <w:rPr>
           <w:lang w:val="en-US"/>
         </w:rPr>
         <w:tab/>
+      </w:r>
+      <w:r>
         <w:t>IGNORE 1 LINES</w:t>
       </w:r>
     </w:p>
@@ -2015,9 +2173,6 @@
         <w:keepNext/>
       </w:pPr>
       <w:r>
-        <w:rPr>
-          <w:lang w:val="en-US"/>
-        </w:rPr>
         <w:t xml:space="preserve">    </w:t>
       </w:r>
       <w:r>
@@ -2240,13 +2395,8 @@
         <w:t xml:space="preserve">    </w:t>
       </w:r>
       <w:proofErr w:type="spellStart"/>
-      <w:proofErr w:type="gramStart"/>
-      <w:r>
-        <w:t>heure</w:t>
-      </w:r>
-      <w:proofErr w:type="gramEnd"/>
-      <w:r>
-        <w:t>_arrivee</w:t>
+      <w:r>
+        <w:t>heure_arrivee</w:t>
       </w:r>
       <w:proofErr w:type="spellEnd"/>
       <w:r>
@@ -2285,8 +2435,1770 @@
       <w:pPr>
         <w:pStyle w:val="Titre2"/>
       </w:pPr>
+      <w:r>
+        <w:t>Index</w:t>
+      </w:r>
+    </w:p>
+    <w:p>
+      <w:r>
+        <w:t>Dans ce chapitre, nous allons créer des index afin d’optimiser la recherche de données en temps et en énergie. L’insertion en revanche prendra plus de temps, mais ce ne sera pas perceptible avant longtemps.</w:t>
+      </w:r>
+    </w:p>
+    <w:p>
+      <w:pPr>
+        <w:pStyle w:val="Titre3"/>
+      </w:pPr>
+      <w:r>
+        <w:lastRenderedPageBreak/>
+        <w:t>Requête 1</w:t>
+      </w:r>
+    </w:p>
+    <w:p>
+      <w:pPr>
+        <w:pStyle w:val="Sansinterligne"/>
+        <w:keepNext/>
+        <w:keepLines/>
+      </w:pPr>
+      <w:r>
+        <w:t xml:space="preserve">SELECT </w:t>
+      </w:r>
+      <w:proofErr w:type="spellStart"/>
+      <w:r>
+        <w:t>c.commande_id</w:t>
+      </w:r>
+      <w:proofErr w:type="spellEnd"/>
+      <w:r>
+        <w:t xml:space="preserve">, </w:t>
+      </w:r>
+      <w:proofErr w:type="spellStart"/>
+      <w:r>
+        <w:t>c.date_</w:t>
+      </w:r>
+      <w:r>
+        <w:t>et_heure</w:t>
+      </w:r>
+      <w:proofErr w:type="spellEnd"/>
+      <w:r>
+        <w:t xml:space="preserve">, </w:t>
+      </w:r>
+      <w:proofErr w:type="spellStart"/>
+      <w:r>
+        <w:t>c.statut</w:t>
+      </w:r>
+      <w:proofErr w:type="spellEnd"/>
+      <w:r>
+        <w:t xml:space="preserve">, </w:t>
+      </w:r>
+      <w:proofErr w:type="spellStart"/>
+      <w:r>
+        <w:t>cl.nom</w:t>
+      </w:r>
+      <w:proofErr w:type="spellEnd"/>
+      <w:r>
+        <w:t xml:space="preserve"> AS client</w:t>
+      </w:r>
+    </w:p>
+    <w:p>
+      <w:pPr>
+        <w:pStyle w:val="Sansinterligne"/>
+        <w:keepNext/>
+        <w:keepLines/>
+      </w:pPr>
+      <w:r>
+        <w:t xml:space="preserve">FROM </w:t>
+      </w:r>
+      <w:proofErr w:type="spellStart"/>
+      <w:r>
+        <w:t>t_commande</w:t>
+      </w:r>
+      <w:proofErr w:type="spellEnd"/>
+      <w:r>
+        <w:t xml:space="preserve"> AS c</w:t>
+      </w:r>
+    </w:p>
+    <w:p>
+      <w:pPr>
+        <w:pStyle w:val="Sansinterligne"/>
+        <w:keepNext/>
+        <w:keepLines/>
+      </w:pPr>
+      <w:r>
+        <w:t xml:space="preserve">JOIN </w:t>
+      </w:r>
+      <w:proofErr w:type="spellStart"/>
+      <w:r>
+        <w:t>t_client</w:t>
+      </w:r>
+      <w:proofErr w:type="spellEnd"/>
+      <w:r>
+        <w:t xml:space="preserve"> AS cl ON </w:t>
+      </w:r>
+      <w:proofErr w:type="spellStart"/>
+      <w:r>
+        <w:t>c.client_fk</w:t>
+      </w:r>
+      <w:proofErr w:type="spellEnd"/>
+      <w:r>
+        <w:t xml:space="preserve"> = </w:t>
+      </w:r>
+      <w:proofErr w:type="spellStart"/>
+      <w:r>
+        <w:t>cl.client_id</w:t>
+      </w:r>
+      <w:proofErr w:type="spellEnd"/>
+    </w:p>
+    <w:p>
+      <w:pPr>
+        <w:pStyle w:val="Sansinterligne"/>
+        <w:keepNext/>
+        <w:keepLines/>
+      </w:pPr>
+      <w:r>
+        <w:t xml:space="preserve">WHERE </w:t>
+      </w:r>
+      <w:proofErr w:type="spellStart"/>
+      <w:r>
+        <w:t>c.statut</w:t>
+      </w:r>
+      <w:proofErr w:type="spellEnd"/>
+      <w:r>
+        <w:t xml:space="preserve"> = '</w:t>
+      </w:r>
+      <w:proofErr w:type="spellStart"/>
+      <w:r>
+        <w:t>en_livraison</w:t>
+      </w:r>
+      <w:proofErr w:type="spellEnd"/>
+      <w:r>
+        <w:t xml:space="preserve">' AND </w:t>
+      </w:r>
+      <w:proofErr w:type="spellStart"/>
+      <w:r>
+        <w:t>c.date_</w:t>
+      </w:r>
+      <w:r>
+        <w:t>et_heur</w:t>
+      </w:r>
+      <w:r>
+        <w:t>e</w:t>
+      </w:r>
+      <w:proofErr w:type="spellEnd"/>
+      <w:r>
+        <w:t xml:space="preserve"> &gt; '2025-01-01'</w:t>
+      </w:r>
+    </w:p>
+    <w:p>
+      <w:pPr>
+        <w:pStyle w:val="Sansinterligne"/>
+        <w:keepNext/>
+        <w:keepLines/>
+        <w:rPr>
+          <w:lang w:val="en-US"/>
+        </w:rPr>
+      </w:pPr>
+      <w:r>
+        <w:rPr>
+          <w:lang w:val="en-US"/>
+        </w:rPr>
+        <w:t xml:space="preserve">ORDER BY </w:t>
+      </w:r>
+      <w:proofErr w:type="spellStart"/>
+      <w:r>
+        <w:rPr>
+          <w:lang w:val="en-US"/>
+        </w:rPr>
+        <w:t>c.date_</w:t>
+      </w:r>
+      <w:r>
+        <w:rPr>
+          <w:lang w:val="en-US"/>
+        </w:rPr>
+        <w:t>et_heure</w:t>
+      </w:r>
+      <w:proofErr w:type="spellEnd"/>
+      <w:r>
+        <w:rPr>
+          <w:lang w:val="en-US"/>
+        </w:rPr>
+        <w:t xml:space="preserve"> DESC;</w:t>
+      </w:r>
+    </w:p>
+    <w:p>
+      <w:pPr>
+        <w:pStyle w:val="Titre2"/>
+      </w:pPr>
+      <w:r>
+        <w:t>Utilisateurs et rôles</w:t>
+      </w:r>
+    </w:p>
+    <w:p>
+      <w:pPr>
+        <w:keepNext/>
+        <w:keepLines/>
+      </w:pPr>
+      <w:r>
+        <w:t xml:space="preserve">Nous allons maintenant créer de nouveaux </w:t>
+      </w:r>
+      <w:r>
+        <w:t>utilisateurs</w:t>
+      </w:r>
+      <w:r>
+        <w:t xml:space="preserve"> et leur donner des permissions</w:t>
+      </w:r>
+      <w:r>
+        <w:t xml:space="preserve"> à l’aide de rôles. Nous utiliserons des rôles afin de pouvoir assigner les permissions aux autres utilisateurs plus rapidement. Nous allons procéder par étapes.</w:t>
+      </w:r>
+    </w:p>
+    <w:p>
+      <w:pPr>
+        <w:pStyle w:val="Paragraphedeliste"/>
+        <w:keepNext/>
+        <w:keepLines/>
+        <w:numPr>
+          <w:ilvl w:val="0"/>
+          <w:numId w:val="8"/>
+        </w:numPr>
+      </w:pPr>
+      <w:r>
+        <w:t>Créer les rôles.</w:t>
+      </w:r>
+    </w:p>
+    <w:p>
+      <w:pPr>
+        <w:pStyle w:val="Paragraphedeliste"/>
+        <w:keepNext/>
+        <w:keepLines/>
+        <w:numPr>
+          <w:ilvl w:val="0"/>
+          <w:numId w:val="8"/>
+        </w:numPr>
+      </w:pPr>
+      <w:r>
+        <w:t>Donner des permissions aux rôles.</w:t>
+      </w:r>
+    </w:p>
+    <w:p>
+      <w:pPr>
+        <w:pStyle w:val="Paragraphedeliste"/>
+        <w:keepNext/>
+        <w:keepLines/>
+        <w:numPr>
+          <w:ilvl w:val="0"/>
+          <w:numId w:val="8"/>
+        </w:numPr>
+      </w:pPr>
+      <w:r>
+        <w:t>Vérifier les privilèges des rôles.</w:t>
+      </w:r>
+    </w:p>
+    <w:p>
+      <w:pPr>
+        <w:pStyle w:val="Paragraphedeliste"/>
+        <w:keepNext/>
+        <w:keepLines/>
+        <w:numPr>
+          <w:ilvl w:val="0"/>
+          <w:numId w:val="8"/>
+        </w:numPr>
+      </w:pPr>
+      <w:r>
+        <w:t>Créer les utilisateurs.</w:t>
+      </w:r>
+    </w:p>
+    <w:p>
+      <w:pPr>
+        <w:pStyle w:val="Paragraphedeliste"/>
+        <w:keepNext/>
+        <w:keepLines/>
+        <w:numPr>
+          <w:ilvl w:val="0"/>
+          <w:numId w:val="8"/>
+        </w:numPr>
+      </w:pPr>
+      <w:r>
+        <w:t>Assigner les rôles aux utilisateurs</w:t>
+      </w:r>
+    </w:p>
+    <w:p>
+      <w:pPr>
+        <w:keepNext/>
+        <w:keepLines/>
+      </w:pPr>
+    </w:p>
+    <w:p>
+      <w:pPr>
+        <w:pStyle w:val="Titre3"/>
+        <w:numPr>
+          <w:ilvl w:val="0"/>
+          <w:numId w:val="9"/>
+        </w:numPr>
+      </w:pPr>
+      <w:r>
+        <w:t>Créer les rôles</w:t>
+      </w:r>
+    </w:p>
+    <w:p>
+      <w:r>
+        <w:t>Nous commençons par créer tous les rôles “vides”, nous leur donnerons des permissions plus tard.</w:t>
+      </w:r>
+    </w:p>
+    <w:p>
+      <w:proofErr w:type="spellStart"/>
+      <w:r>
+        <w:t>create</w:t>
+      </w:r>
+      <w:proofErr w:type="spellEnd"/>
+      <w:r>
+        <w:t xml:space="preserve"> </w:t>
+      </w:r>
+      <w:proofErr w:type="spellStart"/>
+      <w:r>
+        <w:t>role</w:t>
+      </w:r>
+      <w:proofErr w:type="spellEnd"/>
+      <w:r>
+        <w:t xml:space="preserve"> 'Administrateur', 'Manager', 'Pizzaiolo', 'Livreur', 'Agent de caisse', 'Analyste';</w:t>
+      </w:r>
+    </w:p>
+    <w:p>
+      <w:pPr>
+        <w:pStyle w:val="Titre2"/>
+        <w:numPr>
+          <w:ilvl w:val="0"/>
+          <w:numId w:val="9"/>
+        </w:numPr>
+      </w:pPr>
+      <w:r>
+        <w:t>Attribuer les permissions aux rôles</w:t>
+      </w:r>
+    </w:p>
+    <w:p>
+      <w:pPr>
+        <w:rPr>
+          <w:lang w:val="en-US"/>
+        </w:rPr>
+      </w:pPr>
+      <w:r>
+        <w:t>Nos rôles sont maintenant actifs mais sans permissions, nous allons donc leur en donner.</w:t>
+      </w:r>
+      <w:r>
+        <w:t xml:space="preserve"> </w:t>
+      </w:r>
+      <w:r>
+        <w:rPr>
+          <w:lang w:val="en-US"/>
+        </w:rPr>
+        <w:t>Vous pouvez copier-co</w:t>
+      </w:r>
+      <w:r>
+        <w:rPr>
+          <w:lang w:val="en-US"/>
+        </w:rPr>
+        <w:t>ller les lignes ci-dessous.</w:t>
+      </w:r>
+    </w:p>
+    <w:p>
+      <w:pPr>
+        <w:pStyle w:val="Sansinterligne"/>
+        <w:rPr>
+          <w:lang w:val="en-US"/>
+        </w:rPr>
+      </w:pPr>
+      <w:r>
+        <w:rPr>
+          <w:lang w:val="en-US"/>
+        </w:rPr>
+        <w:t>--</w:t>
+      </w:r>
+      <w:r>
+        <w:rPr>
+          <w:lang w:val="en-US"/>
+        </w:rPr>
+        <w:t xml:space="preserve"> </w:t>
+      </w:r>
+      <w:r>
+        <w:rPr>
+          <w:lang w:val="en-US"/>
+        </w:rPr>
+        <w:t>administrateur</w:t>
+      </w:r>
+    </w:p>
+    <w:p>
+      <w:pPr>
+        <w:pStyle w:val="Sansinterligne"/>
+        <w:rPr>
+          <w:lang w:val="en-US"/>
+        </w:rPr>
+      </w:pPr>
+      <w:r>
+        <w:rPr>
+          <w:lang w:val="en-US"/>
+        </w:rPr>
+        <w:t>grant all privileges on db_Thanoss_</w:t>
+      </w:r>
+      <w:r>
+        <w:rPr>
+          <w:lang w:val="en-US"/>
+        </w:rPr>
+        <w:t>Pizza.</w:t>
+      </w:r>
+      <w:r>
+        <w:rPr>
+          <w:lang w:val="en-US"/>
+        </w:rPr>
+        <w:t>* to 'Administrateur';</w:t>
+      </w:r>
+    </w:p>
+    <w:p>
+      <w:pPr>
+        <w:pStyle w:val="Sansinterligne"/>
+        <w:rPr>
+          <w:lang w:val="en-US"/>
+        </w:rPr>
+      </w:pPr>
+      <w:r>
+        <w:rPr>
+          <w:lang w:val="en-US"/>
+        </w:rPr>
+        <w:t>grant grant option on db_Thanoss_</w:t>
+      </w:r>
+      <w:r>
+        <w:rPr>
+          <w:lang w:val="en-US"/>
+        </w:rPr>
+        <w:t>Pizza.</w:t>
+      </w:r>
+      <w:r>
+        <w:rPr>
+          <w:lang w:val="en-US"/>
+        </w:rPr>
+        <w:t>* to 'Administrateur';</w:t>
+      </w:r>
+    </w:p>
+    <w:p>
+      <w:pPr>
+        <w:pStyle w:val="Sansinterligne"/>
+        <w:rPr>
+          <w:lang w:val="en-US"/>
+        </w:rPr>
+      </w:pPr>
+      <w:r>
+        <w:rPr>
+          <w:lang w:val="en-US"/>
+        </w:rPr>
+        <w:t>--</w:t>
+      </w:r>
+      <w:r>
+        <w:rPr>
+          <w:lang w:val="en-US"/>
+        </w:rPr>
+        <w:t xml:space="preserve"> </w:t>
+      </w:r>
+      <w:r>
+        <w:rPr>
+          <w:lang w:val="en-US"/>
+        </w:rPr>
+        <w:t>manager</w:t>
+      </w:r>
+    </w:p>
+    <w:p>
+      <w:pPr>
+        <w:pStyle w:val="Sansinterligne"/>
+        <w:rPr>
+          <w:lang w:val="en-US"/>
+        </w:rPr>
+      </w:pPr>
+      <w:r>
+        <w:rPr>
+          <w:lang w:val="en-US"/>
+        </w:rPr>
+        <w:t xml:space="preserve">grant </w:t>
+      </w:r>
+      <w:r>
+        <w:rPr>
+          <w:lang w:val="en-US"/>
+        </w:rPr>
+        <w:t>update</w:t>
+      </w:r>
+      <w:r>
+        <w:rPr>
+          <w:lang w:val="en-US"/>
+        </w:rPr>
+        <w:t xml:space="preserve"> on </w:t>
+      </w:r>
+      <w:proofErr w:type="spellStart"/>
+      <w:r>
+        <w:rPr>
+          <w:lang w:val="en-US"/>
+        </w:rPr>
+        <w:t>db_Thanoss_Piz</w:t>
+      </w:r>
+      <w:r>
+        <w:rPr>
+          <w:lang w:val="en-US"/>
+        </w:rPr>
+        <w:t>za.t_commande</w:t>
+      </w:r>
+      <w:proofErr w:type="spellEnd"/>
+      <w:r>
+        <w:rPr>
+          <w:lang w:val="en-US"/>
+        </w:rPr>
+        <w:t xml:space="preserve"> to </w:t>
+      </w:r>
+      <w:r>
+        <w:rPr>
+          <w:lang w:val="en-US"/>
+        </w:rPr>
+        <w:t>'</w:t>
+      </w:r>
+      <w:r>
+        <w:rPr>
+          <w:lang w:val="en-US"/>
+        </w:rPr>
+        <w:t>Manager</w:t>
+      </w:r>
+      <w:r>
+        <w:rPr>
+          <w:lang w:val="en-US"/>
+        </w:rPr>
+        <w:t>'</w:t>
+      </w:r>
+      <w:r>
+        <w:rPr>
+          <w:lang w:val="en-US"/>
+        </w:rPr>
+        <w:t>;</w:t>
+      </w:r>
+    </w:p>
+    <w:p>
+      <w:pPr>
+        <w:pStyle w:val="Sansinterligne"/>
+        <w:rPr>
+          <w:lang w:val="en-US"/>
+        </w:rPr>
+      </w:pPr>
+      <w:r>
+        <w:rPr>
+          <w:lang w:val="en-US"/>
+        </w:rPr>
+        <w:t xml:space="preserve">grant </w:t>
+      </w:r>
+      <w:r>
+        <w:rPr>
+          <w:lang w:val="en-US"/>
+        </w:rPr>
+        <w:t>update</w:t>
+      </w:r>
+      <w:r>
+        <w:rPr>
+          <w:lang w:val="en-US"/>
+        </w:rPr>
+        <w:t xml:space="preserve"> on </w:t>
+      </w:r>
+      <w:proofErr w:type="spellStart"/>
+      <w:r>
+        <w:rPr>
+          <w:lang w:val="en-US"/>
+        </w:rPr>
+        <w:t>db_Thanoss_Pizza</w:t>
+      </w:r>
+      <w:r>
+        <w:rPr>
+          <w:lang w:val="en-US"/>
+        </w:rPr>
+        <w:t>.t_livraison</w:t>
+      </w:r>
+      <w:proofErr w:type="spellEnd"/>
+      <w:r>
+        <w:rPr>
+          <w:lang w:val="en-US"/>
+        </w:rPr>
+        <w:t xml:space="preserve"> to </w:t>
+      </w:r>
+      <w:r>
+        <w:rPr>
+          <w:lang w:val="en-US"/>
+        </w:rPr>
+        <w:t>'</w:t>
+      </w:r>
+      <w:r>
+        <w:rPr>
+          <w:lang w:val="en-US"/>
+        </w:rPr>
+        <w:t>Manager</w:t>
+      </w:r>
+      <w:r>
+        <w:rPr>
+          <w:lang w:val="en-US"/>
+        </w:rPr>
+        <w:t>'</w:t>
+      </w:r>
+      <w:r>
+        <w:rPr>
+          <w:lang w:val="en-US"/>
+        </w:rPr>
+        <w:t>;</w:t>
+      </w:r>
+    </w:p>
+    <w:p>
+      <w:pPr>
+        <w:pStyle w:val="Sansinterligne"/>
+        <w:rPr>
+          <w:lang w:val="en-US"/>
+        </w:rPr>
+      </w:pPr>
+      <w:r>
+        <w:rPr>
+          <w:lang w:val="en-US"/>
+        </w:rPr>
+        <w:t xml:space="preserve">grant select on </w:t>
+      </w:r>
+      <w:proofErr w:type="spellStart"/>
+      <w:r>
+        <w:rPr>
+          <w:lang w:val="en-US"/>
+        </w:rPr>
+        <w:t>db_Thanoss_Pizza</w:t>
+      </w:r>
+      <w:r>
+        <w:rPr>
+          <w:lang w:val="en-US"/>
+        </w:rPr>
+        <w:t>.t_paiement</w:t>
+      </w:r>
+      <w:proofErr w:type="spellEnd"/>
+      <w:r>
+        <w:rPr>
+          <w:lang w:val="en-US"/>
+        </w:rPr>
+        <w:t xml:space="preserve"> to </w:t>
+      </w:r>
+      <w:r>
+        <w:rPr>
+          <w:lang w:val="en-US"/>
+        </w:rPr>
+        <w:t>'</w:t>
+      </w:r>
+      <w:r>
+        <w:rPr>
+          <w:lang w:val="en-US"/>
+        </w:rPr>
+        <w:t>Manager</w:t>
+      </w:r>
+      <w:r>
+        <w:rPr>
+          <w:lang w:val="en-US"/>
+        </w:rPr>
+        <w:t>'</w:t>
+      </w:r>
+      <w:r>
+        <w:rPr>
+          <w:lang w:val="en-US"/>
+        </w:rPr>
+        <w:t>;</w:t>
+      </w:r>
+    </w:p>
+    <w:p>
+      <w:pPr>
+        <w:pStyle w:val="Sansinterligne"/>
+        <w:rPr>
+          <w:lang w:val="en-US"/>
+        </w:rPr>
+      </w:pPr>
+      <w:r>
+        <w:rPr>
+          <w:lang w:val="en-US"/>
+        </w:rPr>
+        <w:t xml:space="preserve">grant </w:t>
+      </w:r>
+      <w:r>
+        <w:rPr>
+          <w:lang w:val="en-US"/>
+        </w:rPr>
+        <w:t>update</w:t>
+      </w:r>
+      <w:r>
+        <w:rPr>
+          <w:lang w:val="en-US"/>
+        </w:rPr>
+        <w:t xml:space="preserve"> on </w:t>
+      </w:r>
+      <w:proofErr w:type="spellStart"/>
+      <w:r>
+        <w:rPr>
+          <w:lang w:val="en-US"/>
+        </w:rPr>
+        <w:t>db_Thanoss_Pizza</w:t>
+      </w:r>
+      <w:r>
+        <w:rPr>
+          <w:lang w:val="en-US"/>
+        </w:rPr>
+        <w:t>.t_produit</w:t>
+      </w:r>
+      <w:proofErr w:type="spellEnd"/>
+      <w:r>
+        <w:rPr>
+          <w:lang w:val="en-US"/>
+        </w:rPr>
+        <w:t xml:space="preserve"> to </w:t>
+      </w:r>
+      <w:r>
+        <w:rPr>
+          <w:lang w:val="en-US"/>
+        </w:rPr>
+        <w:t>'</w:t>
+      </w:r>
+      <w:r>
+        <w:rPr>
+          <w:lang w:val="en-US"/>
+        </w:rPr>
+        <w:t>Manager</w:t>
+      </w:r>
+      <w:r>
+        <w:rPr>
+          <w:lang w:val="en-US"/>
+        </w:rPr>
+        <w:t>'</w:t>
+      </w:r>
+      <w:r>
+        <w:rPr>
+          <w:lang w:val="en-US"/>
+        </w:rPr>
+        <w:t>;</w:t>
+      </w:r>
+    </w:p>
+    <w:p>
+      <w:pPr>
+        <w:pStyle w:val="Sansinterligne"/>
+        <w:rPr>
+          <w:lang w:val="en-US"/>
+        </w:rPr>
+      </w:pPr>
+      <w:r>
+        <w:rPr>
+          <w:lang w:val="en-US"/>
+        </w:rPr>
+        <w:t>--</w:t>
+      </w:r>
+      <w:r>
+        <w:rPr>
+          <w:lang w:val="en-US"/>
+        </w:rPr>
+        <w:t xml:space="preserve"> </w:t>
+      </w:r>
+      <w:r>
+        <w:rPr>
+          <w:lang w:val="en-US"/>
+        </w:rPr>
+        <w:t>pizzaiolo</w:t>
+      </w:r>
+    </w:p>
+    <w:p>
+      <w:pPr>
+        <w:pStyle w:val="Sansinterligne"/>
+        <w:rPr>
+          <w:lang w:val="en-US"/>
+        </w:rPr>
+      </w:pPr>
+      <w:r>
+        <w:rPr>
+          <w:lang w:val="en-US"/>
+        </w:rPr>
+        <w:t xml:space="preserve">grant select on </w:t>
+      </w:r>
+      <w:proofErr w:type="spellStart"/>
+      <w:r>
+        <w:rPr>
+          <w:lang w:val="en-US"/>
+        </w:rPr>
+        <w:t>db_Thanoss_Pizza</w:t>
+      </w:r>
+      <w:r>
+        <w:rPr>
+          <w:lang w:val="en-US"/>
+        </w:rPr>
+        <w:t>.t_commande</w:t>
+      </w:r>
+      <w:proofErr w:type="spellEnd"/>
+      <w:r>
+        <w:rPr>
+          <w:lang w:val="en-US"/>
+        </w:rPr>
+        <w:t xml:space="preserve"> to </w:t>
+      </w:r>
+      <w:r>
+        <w:rPr>
+          <w:lang w:val="en-US"/>
+        </w:rPr>
+        <w:t>'</w:t>
+      </w:r>
+      <w:r>
+        <w:rPr>
+          <w:lang w:val="en-US"/>
+        </w:rPr>
+        <w:t>Pizzaiolo</w:t>
+      </w:r>
+      <w:r>
+        <w:rPr>
+          <w:lang w:val="en-US"/>
+        </w:rPr>
+        <w:t>'</w:t>
+      </w:r>
+      <w:r>
+        <w:rPr>
+          <w:lang w:val="en-US"/>
+        </w:rPr>
+        <w:t>;</w:t>
+      </w:r>
+    </w:p>
+    <w:p>
+      <w:pPr>
+        <w:pStyle w:val="Sansinterligne"/>
+        <w:rPr>
+          <w:lang w:val="en-US"/>
+        </w:rPr>
+      </w:pPr>
+      <w:r>
+        <w:rPr>
+          <w:lang w:val="en-US"/>
+        </w:rPr>
+        <w:t xml:space="preserve">grant select on </w:t>
+      </w:r>
+      <w:proofErr w:type="spellStart"/>
+      <w:r>
+        <w:rPr>
+          <w:lang w:val="en-US"/>
+        </w:rPr>
+        <w:t>db_Thanoss_Pizza</w:t>
+      </w:r>
+      <w:r>
+        <w:rPr>
+          <w:lang w:val="en-US"/>
+        </w:rPr>
+        <w:t>.t_commande</w:t>
+      </w:r>
+      <w:proofErr w:type="spellEnd"/>
+      <w:r>
+        <w:rPr>
+          <w:lang w:val="en-US"/>
+        </w:rPr>
+        <w:t xml:space="preserve"> to </w:t>
+      </w:r>
+      <w:r>
+        <w:rPr>
+          <w:lang w:val="en-US"/>
+        </w:rPr>
+        <w:t>'</w:t>
+      </w:r>
+      <w:r>
+        <w:rPr>
+          <w:lang w:val="en-US"/>
+        </w:rPr>
+        <w:t>Pizzaiolo</w:t>
+      </w:r>
+      <w:r>
+        <w:rPr>
+          <w:lang w:val="en-US"/>
+        </w:rPr>
+        <w:t>'</w:t>
+      </w:r>
+      <w:r>
+        <w:rPr>
+          <w:lang w:val="en-US"/>
+        </w:rPr>
+        <w:t>;</w:t>
+      </w:r>
+    </w:p>
+    <w:p>
+      <w:pPr>
+        <w:pStyle w:val="Sansinterligne"/>
+        <w:rPr>
+          <w:lang w:val="en-US"/>
+        </w:rPr>
+      </w:pPr>
+      <w:r>
+        <w:rPr>
+          <w:lang w:val="en-US"/>
+        </w:rPr>
+        <w:t xml:space="preserve">grant </w:t>
+      </w:r>
+      <w:r>
+        <w:rPr>
+          <w:lang w:val="en-US"/>
+        </w:rPr>
+        <w:t>update</w:t>
+      </w:r>
+      <w:r>
+        <w:rPr>
+          <w:lang w:val="en-US"/>
+        </w:rPr>
+        <w:t>(</w:t>
+      </w:r>
+      <w:proofErr w:type="spellStart"/>
+      <w:r>
+        <w:rPr>
+          <w:lang w:val="en-US"/>
+        </w:rPr>
+        <w:t>statut</w:t>
+      </w:r>
+      <w:proofErr w:type="spellEnd"/>
+      <w:r>
+        <w:rPr>
+          <w:lang w:val="en-US"/>
+        </w:rPr>
+        <w:t xml:space="preserve">) on </w:t>
+      </w:r>
+      <w:proofErr w:type="spellStart"/>
+      <w:r>
+        <w:rPr>
+          <w:lang w:val="en-US"/>
+        </w:rPr>
+        <w:t>db_Thanoss_Pizza</w:t>
+      </w:r>
+      <w:r>
+        <w:rPr>
+          <w:lang w:val="en-US"/>
+        </w:rPr>
+        <w:t>.t_commande</w:t>
+      </w:r>
+      <w:proofErr w:type="spellEnd"/>
+      <w:r>
+        <w:rPr>
+          <w:lang w:val="en-US"/>
+        </w:rPr>
+        <w:t xml:space="preserve"> to </w:t>
+      </w:r>
+      <w:r>
+        <w:rPr>
+          <w:lang w:val="en-US"/>
+        </w:rPr>
+        <w:t>'</w:t>
+      </w:r>
+      <w:r>
+        <w:rPr>
+          <w:lang w:val="en-US"/>
+        </w:rPr>
+        <w:t>Pizzaiolo</w:t>
+      </w:r>
+      <w:r>
+        <w:rPr>
+          <w:lang w:val="en-US"/>
+        </w:rPr>
+        <w:t>'</w:t>
+      </w:r>
+      <w:r>
+        <w:rPr>
+          <w:lang w:val="en-US"/>
+        </w:rPr>
+        <w:t>;</w:t>
+      </w:r>
+    </w:p>
+    <w:p>
+      <w:pPr>
+        <w:pStyle w:val="Sansinterligne"/>
+        <w:rPr>
+          <w:lang w:val="en-US"/>
+        </w:rPr>
+      </w:pPr>
+      <w:r>
+        <w:rPr>
+          <w:lang w:val="en-US"/>
+        </w:rPr>
+        <w:t xml:space="preserve">-- </w:t>
+      </w:r>
+      <w:proofErr w:type="spellStart"/>
+      <w:r>
+        <w:rPr>
+          <w:lang w:val="en-US"/>
+        </w:rPr>
+        <w:t>livreur</w:t>
+      </w:r>
+      <w:proofErr w:type="spellEnd"/>
+    </w:p>
+    <w:p>
+      <w:pPr>
+        <w:pStyle w:val="Sansinterligne"/>
+        <w:rPr>
+          <w:lang w:val="en-US"/>
+        </w:rPr>
+      </w:pPr>
+      <w:r>
+        <w:rPr>
+          <w:lang w:val="en-US"/>
+        </w:rPr>
+        <w:t xml:space="preserve">grant select on </w:t>
+      </w:r>
+      <w:proofErr w:type="spellStart"/>
+      <w:r>
+        <w:rPr>
+          <w:lang w:val="en-US"/>
+        </w:rPr>
+        <w:t>db_Thanoss_Pizza</w:t>
+      </w:r>
+      <w:r>
+        <w:rPr>
+          <w:lang w:val="en-US"/>
+        </w:rPr>
+        <w:t>.t_livraison</w:t>
+      </w:r>
+      <w:proofErr w:type="spellEnd"/>
+      <w:r>
+        <w:rPr>
+          <w:lang w:val="en-US"/>
+        </w:rPr>
+        <w:t xml:space="preserve"> to </w:t>
+      </w:r>
+      <w:r>
+        <w:t>'</w:t>
+      </w:r>
+      <w:proofErr w:type="spellStart"/>
+      <w:r>
+        <w:rPr>
+          <w:lang w:val="en-US"/>
+        </w:rPr>
+        <w:t>Livreur</w:t>
+      </w:r>
+      <w:proofErr w:type="spellEnd"/>
+      <w:r>
+        <w:t>'</w:t>
+      </w:r>
+      <w:r>
+        <w:rPr>
+          <w:lang w:val="en-US"/>
+        </w:rPr>
+        <w:t>;</w:t>
+      </w:r>
+    </w:p>
+    <w:p>
+      <w:pPr>
+        <w:pStyle w:val="Sansinterligne"/>
+        <w:rPr>
+          <w:lang w:val="en-US"/>
+        </w:rPr>
+      </w:pPr>
+      <w:r>
+        <w:rPr>
+          <w:lang w:val="en-US"/>
+        </w:rPr>
+        <w:t xml:space="preserve">grant select on </w:t>
+      </w:r>
+      <w:proofErr w:type="spellStart"/>
+      <w:r>
+        <w:rPr>
+          <w:lang w:val="en-US"/>
+        </w:rPr>
+        <w:t>db_Thanoss_Pizza</w:t>
+      </w:r>
+      <w:r>
+        <w:rPr>
+          <w:lang w:val="en-US"/>
+        </w:rPr>
+        <w:t>.t_commande</w:t>
+      </w:r>
+      <w:proofErr w:type="spellEnd"/>
+      <w:r>
+        <w:rPr>
+          <w:lang w:val="en-US"/>
+        </w:rPr>
+        <w:t xml:space="preserve"> to </w:t>
+      </w:r>
+      <w:r>
+        <w:rPr>
+          <w:lang w:val="en-US"/>
+        </w:rPr>
+        <w:t>'</w:t>
+      </w:r>
+      <w:proofErr w:type="spellStart"/>
+      <w:r>
+        <w:rPr>
+          <w:lang w:val="en-US"/>
+        </w:rPr>
+        <w:t>Livreur</w:t>
+      </w:r>
+      <w:proofErr w:type="spellEnd"/>
+      <w:r>
+        <w:rPr>
+          <w:lang w:val="en-US"/>
+        </w:rPr>
+        <w:t>'</w:t>
+      </w:r>
+      <w:r>
+        <w:rPr>
+          <w:lang w:val="en-US"/>
+        </w:rPr>
+        <w:t>;</w:t>
+      </w:r>
+    </w:p>
+    <w:p>
+      <w:pPr>
+        <w:pStyle w:val="Sansinterligne"/>
+        <w:rPr>
+          <w:lang w:val="en-US"/>
+        </w:rPr>
+      </w:pPr>
+      <w:r>
+        <w:rPr>
+          <w:lang w:val="en-US"/>
+        </w:rPr>
+        <w:lastRenderedPageBreak/>
+        <w:t xml:space="preserve">grant </w:t>
+      </w:r>
+      <w:r>
+        <w:rPr>
+          <w:lang w:val="en-US"/>
+        </w:rPr>
+        <w:t>update</w:t>
+      </w:r>
+      <w:r>
+        <w:rPr>
+          <w:lang w:val="en-US"/>
+        </w:rPr>
+        <w:t>(</w:t>
+      </w:r>
+      <w:proofErr w:type="spellStart"/>
+      <w:r>
+        <w:rPr>
+          <w:lang w:val="en-US"/>
+        </w:rPr>
+        <w:t>statut</w:t>
+      </w:r>
+      <w:proofErr w:type="spellEnd"/>
+      <w:r>
+        <w:rPr>
+          <w:lang w:val="en-US"/>
+        </w:rPr>
+        <w:t xml:space="preserve">) on </w:t>
+      </w:r>
+      <w:proofErr w:type="spellStart"/>
+      <w:r>
+        <w:rPr>
+          <w:lang w:val="en-US"/>
+        </w:rPr>
+        <w:t>db_Thanoss_Pizza</w:t>
+      </w:r>
+      <w:r>
+        <w:rPr>
+          <w:lang w:val="en-US"/>
+        </w:rPr>
+        <w:t>.t_livraison</w:t>
+      </w:r>
+      <w:proofErr w:type="spellEnd"/>
+      <w:r>
+        <w:rPr>
+          <w:lang w:val="en-US"/>
+        </w:rPr>
+        <w:t xml:space="preserve"> to </w:t>
+      </w:r>
+      <w:r>
+        <w:rPr>
+          <w:lang w:val="en-US"/>
+        </w:rPr>
+        <w:t>'</w:t>
+      </w:r>
+      <w:proofErr w:type="spellStart"/>
+      <w:r>
+        <w:rPr>
+          <w:lang w:val="en-US"/>
+        </w:rPr>
+        <w:t>Livreur</w:t>
+      </w:r>
+      <w:proofErr w:type="spellEnd"/>
+      <w:r>
+        <w:rPr>
+          <w:lang w:val="en-US"/>
+        </w:rPr>
+        <w:t>'</w:t>
+      </w:r>
+      <w:r>
+        <w:rPr>
+          <w:lang w:val="en-US"/>
+        </w:rPr>
+        <w:t>;</w:t>
+      </w:r>
+    </w:p>
+    <w:p>
+      <w:pPr>
+        <w:pStyle w:val="Sansinterligne"/>
+      </w:pPr>
+      <w:r>
+        <w:t>-- agent de caisse</w:t>
+      </w:r>
+    </w:p>
+    <w:p>
+      <w:pPr>
+        <w:pStyle w:val="Sansinterligne"/>
+      </w:pPr>
+      <w:proofErr w:type="spellStart"/>
+      <w:r>
+        <w:t>grant</w:t>
+      </w:r>
+      <w:proofErr w:type="spellEnd"/>
+      <w:r>
+        <w:t xml:space="preserve"> select on </w:t>
+      </w:r>
+      <w:proofErr w:type="spellStart"/>
+      <w:r>
+        <w:t>db_Thanoss_Pizza.t_paiement</w:t>
+      </w:r>
+      <w:proofErr w:type="spellEnd"/>
+      <w:r>
+        <w:t xml:space="preserve"> to </w:t>
+      </w:r>
+      <w:r>
+        <w:t>'Agent de caisse'</w:t>
+      </w:r>
+      <w:r>
+        <w:t>;</w:t>
+      </w:r>
+    </w:p>
+    <w:p>
+      <w:pPr>
+        <w:pStyle w:val="Sansinterligne"/>
+      </w:pPr>
+      <w:proofErr w:type="spellStart"/>
+      <w:r>
+        <w:t>grant</w:t>
+      </w:r>
+      <w:proofErr w:type="spellEnd"/>
+      <w:r>
+        <w:t xml:space="preserve"> insert on </w:t>
+      </w:r>
+      <w:proofErr w:type="spellStart"/>
+      <w:r>
+        <w:t>db_Thanoss_Pizza</w:t>
+      </w:r>
+      <w:r>
+        <w:t>.t_paiement</w:t>
+      </w:r>
+      <w:proofErr w:type="spellEnd"/>
+      <w:r>
+        <w:t xml:space="preserve"> to </w:t>
+      </w:r>
+      <w:r>
+        <w:t>'Agent de caisse'</w:t>
+      </w:r>
+      <w:r>
+        <w:t> ;</w:t>
+      </w:r>
+    </w:p>
+    <w:p>
+      <w:pPr>
+        <w:pStyle w:val="Sansinterligne"/>
+        <w:rPr>
+          <w:lang w:val="en-US"/>
+        </w:rPr>
+      </w:pPr>
+      <w:r>
+        <w:rPr>
+          <w:lang w:val="en-US"/>
+        </w:rPr>
+        <w:t xml:space="preserve">grant select on </w:t>
+      </w:r>
+      <w:proofErr w:type="spellStart"/>
+      <w:r>
+        <w:rPr>
+          <w:lang w:val="en-US"/>
+        </w:rPr>
+        <w:t>db_Thanoss_Pizza</w:t>
+      </w:r>
+      <w:r>
+        <w:rPr>
+          <w:lang w:val="en-US"/>
+        </w:rPr>
+        <w:t>.t_commande</w:t>
+      </w:r>
+      <w:proofErr w:type="spellEnd"/>
+      <w:r>
+        <w:rPr>
+          <w:lang w:val="en-US"/>
+        </w:rPr>
+        <w:t xml:space="preserve"> to </w:t>
+      </w:r>
+      <w:r>
+        <w:rPr>
+          <w:lang w:val="en-US"/>
+        </w:rPr>
+        <w:t xml:space="preserve">'Agent de </w:t>
+      </w:r>
+      <w:proofErr w:type="spellStart"/>
+      <w:r>
+        <w:rPr>
+          <w:lang w:val="en-US"/>
+        </w:rPr>
+        <w:t>caisse</w:t>
+      </w:r>
+      <w:proofErr w:type="spellEnd"/>
+      <w:r>
+        <w:rPr>
+          <w:lang w:val="en-US"/>
+        </w:rPr>
+        <w:t>'</w:t>
+      </w:r>
+      <w:r>
+        <w:rPr>
+          <w:lang w:val="en-US"/>
+        </w:rPr>
+        <w:t> ;</w:t>
+      </w:r>
+    </w:p>
+    <w:p>
+      <w:pPr>
+        <w:pStyle w:val="Sansinterligne"/>
+        <w:rPr>
+          <w:lang w:val="en-US"/>
+        </w:rPr>
+      </w:pPr>
+      <w:r>
+        <w:rPr>
+          <w:lang w:val="en-US"/>
+        </w:rPr>
+        <w:t xml:space="preserve">-- </w:t>
+      </w:r>
+      <w:proofErr w:type="spellStart"/>
+      <w:r>
+        <w:rPr>
+          <w:lang w:val="en-US"/>
+        </w:rPr>
+        <w:t>analyste</w:t>
+      </w:r>
+      <w:proofErr w:type="spellEnd"/>
+    </w:p>
+    <w:p>
+      <w:pPr>
+        <w:rPr>
+          <w:lang w:val="en-US"/>
+        </w:rPr>
+      </w:pPr>
+      <w:r>
+        <w:rPr>
+          <w:lang w:val="en-US"/>
+        </w:rPr>
+        <w:t xml:space="preserve">grant select on </w:t>
+      </w:r>
+      <w:r>
+        <w:rPr>
+          <w:lang w:val="en-US"/>
+        </w:rPr>
+        <w:t>db_Thanoss_Pizza</w:t>
+      </w:r>
+      <w:r>
+        <w:rPr>
+          <w:lang w:val="en-US"/>
+        </w:rPr>
+        <w:t xml:space="preserve">.* to </w:t>
+      </w:r>
+      <w:r>
+        <w:rPr>
+          <w:lang w:val="en-US"/>
+        </w:rPr>
+        <w:t>'</w:t>
+      </w:r>
+      <w:proofErr w:type="spellStart"/>
+      <w:r>
+        <w:rPr>
+          <w:lang w:val="en-US"/>
+        </w:rPr>
+        <w:t>Analyste</w:t>
+      </w:r>
+      <w:proofErr w:type="spellEnd"/>
+      <w:r>
+        <w:rPr>
+          <w:lang w:val="en-US"/>
+        </w:rPr>
+        <w:t>'</w:t>
+      </w:r>
+      <w:r>
+        <w:rPr>
+          <w:lang w:val="en-US"/>
+        </w:rPr>
+        <w:t>;</w:t>
+      </w:r>
+    </w:p>
+    <w:p>
+      <w:pPr>
+        <w:pStyle w:val="Titre3"/>
+        <w:numPr>
+          <w:ilvl w:val="0"/>
+          <w:numId w:val="9"/>
+        </w:numPr>
+      </w:pPr>
+      <w:r>
+        <w:t>Vérifier les privilèges des r</w:t>
+      </w:r>
+      <w:r>
+        <w:t>ôles</w:t>
+      </w:r>
+    </w:p>
+    <w:p>
+      <w:pPr>
+        <w:pStyle w:val="Sansinterligne"/>
+      </w:pPr>
+      <w:r>
+        <w:t>Avant d’attribuer les rôles aux utilisateurs, il est vital de vérifier les privilèges de chaque rôle. Ainsi nous allons utiliser cette commande :</w:t>
+      </w:r>
+    </w:p>
+    <w:p>
+      <w:pPr>
+        <w:pStyle w:val="Sansinterligne"/>
+      </w:pPr>
+      <w:r>
+        <w:t xml:space="preserve">SHOW GRANTS FOR </w:t>
+      </w:r>
+      <w:r>
+        <w:t>‘</w:t>
+      </w:r>
+      <w:proofErr w:type="spellStart"/>
+      <w:r>
+        <w:t>role</w:t>
+      </w:r>
+      <w:proofErr w:type="spellEnd"/>
+      <w:r>
+        <w:t>’</w:t>
+      </w:r>
+      <w:r>
+        <w:t>;</w:t>
+      </w:r>
+    </w:p>
+    <w:p>
+      <w:pPr>
+        <w:pStyle w:val="Sansinterligne"/>
+      </w:pPr>
+      <w:r>
+        <w:t>Où nous remplacerons ‘</w:t>
+      </w:r>
+      <w:proofErr w:type="spellStart"/>
+      <w:r>
+        <w:t>role</w:t>
+      </w:r>
+      <w:proofErr w:type="spellEnd"/>
+      <w:r>
+        <w:t>’ par le véritable nom du rôle</w:t>
+      </w:r>
+      <w:r>
+        <w:t>.</w:t>
+      </w:r>
+      <w:r>
+        <w:t xml:space="preserve"> </w:t>
+      </w:r>
+      <w:r>
+        <w:t xml:space="preserve">Voici les commandes à entrer et en </w:t>
+      </w:r>
+      <w:proofErr w:type="spellStart"/>
+      <w:r>
+        <w:t>screenshot</w:t>
+      </w:r>
+      <w:proofErr w:type="spellEnd"/>
+      <w:r>
+        <w:t>, les résultats attendus.</w:t>
+      </w:r>
+    </w:p>
+    <w:p>
+      <w:pPr>
+        <w:pStyle w:val="Sansinterligne"/>
+        <w:rPr>
+          <w:lang w:val="en-US"/>
+        </w:rPr>
+      </w:pPr>
+      <w:r>
+        <w:rPr>
+          <w:lang w:val="en-US"/>
+        </w:rPr>
+        <w:t>--</w:t>
+      </w:r>
+      <w:r>
+        <w:rPr>
+          <w:lang w:val="en-US"/>
+        </w:rPr>
+        <w:t xml:space="preserve"> administrateur</w:t>
+      </w:r>
+      <w:r>
+        <w:rPr>
+          <w:lang w:val="en-US"/>
+        </w:rPr>
+        <w:br/>
+      </w:r>
+      <w:r>
+        <w:rPr>
+          <w:lang w:val="en-US"/>
+        </w:rPr>
+        <w:t>SHOW GRANTS FOR 'Administrateur';</w:t>
+      </w:r>
+    </w:p>
+    <w:p>
+      <w:pPr>
+        <w:pStyle w:val="Sansinterligne"/>
+        <w:rPr>
+          <w:lang w:val="en-US"/>
+        </w:rPr>
+      </w:pPr>
+      <w:r>
+        <w:rPr>
+          <w:lang w:val="en-US"/>
+        </w:rPr>
+        <w:t>--</w:t>
+      </w:r>
+      <w:r>
+        <w:rPr>
+          <w:lang w:val="en-US"/>
+        </w:rPr>
+        <w:t xml:space="preserve"> </w:t>
+      </w:r>
+      <w:r>
+        <w:rPr>
+          <w:lang w:val="en-US"/>
+        </w:rPr>
+        <w:t>manager</w:t>
+      </w:r>
+      <w:r>
+        <w:rPr>
+          <w:lang w:val="en-US"/>
+        </w:rPr>
+        <w:br/>
+        <w:t>SHOW GRANTS FOR '</w:t>
+      </w:r>
+      <w:r>
+        <w:rPr>
+          <w:lang w:val="en-US"/>
+        </w:rPr>
+        <w:t>Manager</w:t>
+      </w:r>
+      <w:r>
+        <w:rPr>
+          <w:lang w:val="en-US"/>
+        </w:rPr>
+        <w:t>';</w:t>
+      </w:r>
+    </w:p>
+    <w:p>
+      <w:pPr>
+        <w:pStyle w:val="Sansinterligne"/>
+        <w:rPr>
+          <w:lang w:val="en-US"/>
+        </w:rPr>
+      </w:pPr>
+      <w:r>
+        <w:rPr>
+          <w:lang w:val="en-US"/>
+        </w:rPr>
+        <w:t>--</w:t>
+      </w:r>
+      <w:r>
+        <w:rPr>
+          <w:lang w:val="en-US"/>
+        </w:rPr>
+        <w:t xml:space="preserve"> </w:t>
+      </w:r>
+      <w:r>
+        <w:rPr>
+          <w:lang w:val="en-US"/>
+        </w:rPr>
+        <w:t>pizzaiolo</w:t>
+      </w:r>
+      <w:r>
+        <w:rPr>
+          <w:lang w:val="en-US"/>
+        </w:rPr>
+        <w:br/>
+        <w:t>SHOW GRANTS FOR '</w:t>
+      </w:r>
+      <w:r>
+        <w:rPr>
+          <w:lang w:val="en-US"/>
+        </w:rPr>
+        <w:t>Pizzaiolo</w:t>
+      </w:r>
+      <w:r>
+        <w:rPr>
+          <w:lang w:val="en-US"/>
+        </w:rPr>
+        <w:t>';</w:t>
+      </w:r>
+    </w:p>
+    <w:p>
+      <w:pPr>
+        <w:pStyle w:val="Sansinterligne"/>
+        <w:rPr>
+          <w:lang w:val="en-US"/>
+        </w:rPr>
+      </w:pPr>
+      <w:r>
+        <w:rPr>
+          <w:lang w:val="en-US"/>
+        </w:rPr>
+        <w:t>--</w:t>
+      </w:r>
+      <w:r>
+        <w:rPr>
+          <w:lang w:val="en-US"/>
+        </w:rPr>
+        <w:t xml:space="preserve"> </w:t>
+      </w:r>
+      <w:proofErr w:type="spellStart"/>
+      <w:r>
+        <w:rPr>
+          <w:lang w:val="en-US"/>
+        </w:rPr>
+        <w:t>livreur</w:t>
+      </w:r>
+      <w:proofErr w:type="spellEnd"/>
+      <w:r>
+        <w:rPr>
+          <w:lang w:val="en-US"/>
+        </w:rPr>
+        <w:br/>
+        <w:t>SHOW GRANTS FOR '</w:t>
+      </w:r>
+      <w:proofErr w:type="spellStart"/>
+      <w:r>
+        <w:rPr>
+          <w:lang w:val="en-US"/>
+        </w:rPr>
+        <w:t>Livreur</w:t>
+      </w:r>
+      <w:proofErr w:type="spellEnd"/>
+      <w:r>
+        <w:rPr>
+          <w:lang w:val="en-US"/>
+        </w:rPr>
+        <w:t>';</w:t>
+      </w:r>
+    </w:p>
+    <w:p>
+      <w:pPr>
+        <w:pStyle w:val="Sansinterligne"/>
+      </w:pPr>
+      <w:r>
+        <w:t xml:space="preserve">-- </w:t>
+      </w:r>
+      <w:r>
+        <w:t>agent de caisse</w:t>
+      </w:r>
+      <w:r>
+        <w:br/>
+        <w:t>SHOW GRANTS FOR 'A</w:t>
+      </w:r>
+      <w:r>
+        <w:t>gent de caisse</w:t>
+      </w:r>
+      <w:r>
+        <w:t>';</w:t>
+      </w:r>
+    </w:p>
+    <w:p>
+      <w:pPr>
+        <w:pStyle w:val="Sansinterligne"/>
+        <w:rPr>
+          <w:lang w:val="en-US"/>
+        </w:rPr>
+      </w:pPr>
+      <w:r>
+        <w:rPr>
+          <w:lang w:val="en-US"/>
+        </w:rPr>
+        <w:t>--</w:t>
+      </w:r>
+      <w:r>
+        <w:rPr>
+          <w:lang w:val="en-US"/>
+        </w:rPr>
+        <w:t xml:space="preserve"> </w:t>
+      </w:r>
+      <w:proofErr w:type="spellStart"/>
+      <w:r>
+        <w:rPr>
+          <w:lang w:val="en-US"/>
+        </w:rPr>
+        <w:t>analyste</w:t>
+      </w:r>
+      <w:proofErr w:type="spellEnd"/>
+      <w:r>
+        <w:rPr>
+          <w:lang w:val="en-US"/>
+        </w:rPr>
+        <w:br/>
+        <w:t>SHOW GRANTS FOR '</w:t>
+      </w:r>
+      <w:proofErr w:type="spellStart"/>
+      <w:r>
+        <w:rPr>
+          <w:lang w:val="en-US"/>
+        </w:rPr>
+        <w:t>Analyste</w:t>
+      </w:r>
+      <w:proofErr w:type="spellEnd"/>
+      <w:r>
+        <w:rPr>
+          <w:lang w:val="en-US"/>
+        </w:rPr>
+        <w:t>';</w:t>
+      </w:r>
+    </w:p>
+    <w:p>
+      <w:pPr>
+        <w:pStyle w:val="Sansinterligne"/>
+        <w:rPr>
+          <w:lang w:val="en-US"/>
+        </w:rPr>
+      </w:pPr>
+    </w:p>
+    <w:p>
+      <w:pPr>
+        <w:pStyle w:val="Sansinterligne"/>
+        <w:rPr>
+          <w:lang w:val="en-US"/>
+        </w:rPr>
+      </w:pPr>
+      <w:r>
+        <w:rPr>
+          <w:lang w:val="en-US"/>
+        </w:rPr>
+        <w:lastRenderedPageBreak/>
+        <w:drawing>
+          <wp:inline distT="0" distB="0" distL="0" distR="0" wp14:anchorId="5F6603E5" wp14:editId="2E752A55">
+            <wp:extent cx="5760720" cy="8074660"/>
+            <wp:effectExtent l="0" t="0" r="0" b="2540"/>
+            <wp:docPr id="843445525" name="Image 1"/>
+            <wp:cNvGraphicFramePr>
+              <a:graphicFrameLocks xmlns:a="http://schemas.openxmlformats.org/drawingml/2006/main" noChangeAspect="1"/>
+            </wp:cNvGraphicFramePr>
+            <a:graphic xmlns:a="http://schemas.openxmlformats.org/drawingml/2006/main">
+              <a:graphicData uri="http://schemas.openxmlformats.org/drawingml/2006/picture">
+                <pic:pic xmlns:pic="http://schemas.openxmlformats.org/drawingml/2006/picture">
+                  <pic:nvPicPr>
+                    <pic:cNvPr id="843445525" name=""/>
+                    <pic:cNvPicPr/>
+                  </pic:nvPicPr>
+                  <pic:blipFill>
+                    <a:blip r:embed="rId8"/>
+                    <a:stretch>
+                      <a:fillRect/>
+                    </a:stretch>
+                  </pic:blipFill>
+                  <pic:spPr>
+                    <a:xfrm>
+                      <a:off x="0" y="0"/>
+                      <a:ext cx="5760720" cy="8074660"/>
+                    </a:xfrm>
+                    <a:prstGeom prst="rect">
+                      <a:avLst/>
+                    </a:prstGeom>
+                  </pic:spPr>
+                </pic:pic>
+              </a:graphicData>
+            </a:graphic>
+          </wp:inline>
+        </w:drawing>
+      </w:r>
+    </w:p>
+    <w:p>
+      <w:pPr>
+        <w:pStyle w:val="Titre2"/>
+      </w:pPr>
       <w:bookmarkStart w:id="4" w:name="_Toc210392961"/>
       <w:r>
+        <w:lastRenderedPageBreak/>
         <w:t>Conclusion</w:t>
       </w:r>
       <w:bookmarkEnd w:id="4"/>
@@ -2312,8 +4224,8 @@
       <w:bookmarkEnd w:id="6"/>
     </w:p>
     <w:sectPr>
-      <w:headerReference w:type="default" r:id="rId8"/>
-      <w:footerReference w:type="default" r:id="rId9"/>
+      <w:headerReference w:type="default" r:id="rId9"/>
+      <w:footerReference w:type="default" r:id="rId10"/>
       <w:pgSz w:w="11906" w:h="16838"/>
       <w:pgMar w:top="1417" w:right="1417" w:bottom="1417" w:left="1417" w:header="708" w:footer="708" w:gutter="0"/>
       <w:cols w:space="708"/>
@@ -2765,6 +4677,95 @@
     </w:lvl>
   </w:abstractNum>
   <w:abstractNum w:abstractNumId="1" w15:restartNumberingAfterBreak="0">
+    <w:nsid w:val="42A04763"/>
+    <w:multiLevelType w:val="hybridMultilevel"/>
+    <w:tmpl w:val="D48A66F4"/>
+    <w:lvl w:ilvl="0" w:tplc="100C000F">
+      <w:start w:val="1"/>
+      <w:numFmt w:val="decimal"/>
+      <w:lvlText w:val="%1."/>
+      <w:lvlJc w:val="left"/>
+      <w:pPr>
+        <w:ind w:left="720" w:hanging="360"/>
+      </w:pPr>
+      <w:rPr>
+        <w:rFonts w:hint="default"/>
+      </w:rPr>
+    </w:lvl>
+    <w:lvl w:ilvl="1" w:tplc="100C0019" w:tentative="1">
+      <w:start w:val="1"/>
+      <w:numFmt w:val="lowerLetter"/>
+      <w:lvlText w:val="%2."/>
+      <w:lvlJc w:val="left"/>
+      <w:pPr>
+        <w:ind w:left="1440" w:hanging="360"/>
+      </w:pPr>
+    </w:lvl>
+    <w:lvl w:ilvl="2" w:tplc="100C001B" w:tentative="1">
+      <w:start w:val="1"/>
+      <w:numFmt w:val="lowerRoman"/>
+      <w:lvlText w:val="%3."/>
+      <w:lvlJc w:val="right"/>
+      <w:pPr>
+        <w:ind w:left="2160" w:hanging="180"/>
+      </w:pPr>
+    </w:lvl>
+    <w:lvl w:ilvl="3" w:tplc="100C000F" w:tentative="1">
+      <w:start w:val="1"/>
+      <w:numFmt w:val="decimal"/>
+      <w:lvlText w:val="%4."/>
+      <w:lvlJc w:val="left"/>
+      <w:pPr>
+        <w:ind w:left="2880" w:hanging="360"/>
+      </w:pPr>
+    </w:lvl>
+    <w:lvl w:ilvl="4" w:tplc="100C0019" w:tentative="1">
+      <w:start w:val="1"/>
+      <w:numFmt w:val="lowerLetter"/>
+      <w:lvlText w:val="%5."/>
+      <w:lvlJc w:val="left"/>
+      <w:pPr>
+        <w:ind w:left="3600" w:hanging="360"/>
+      </w:pPr>
+    </w:lvl>
+    <w:lvl w:ilvl="5" w:tplc="100C001B" w:tentative="1">
+      <w:start w:val="1"/>
+      <w:numFmt w:val="lowerRoman"/>
+      <w:lvlText w:val="%6."/>
+      <w:lvlJc w:val="right"/>
+      <w:pPr>
+        <w:ind w:left="4320" w:hanging="180"/>
+      </w:pPr>
+    </w:lvl>
+    <w:lvl w:ilvl="6" w:tplc="100C000F" w:tentative="1">
+      <w:start w:val="1"/>
+      <w:numFmt w:val="decimal"/>
+      <w:lvlText w:val="%7."/>
+      <w:lvlJc w:val="left"/>
+      <w:pPr>
+        <w:ind w:left="5040" w:hanging="360"/>
+      </w:pPr>
+    </w:lvl>
+    <w:lvl w:ilvl="7" w:tplc="100C0019" w:tentative="1">
+      <w:start w:val="1"/>
+      <w:numFmt w:val="lowerLetter"/>
+      <w:lvlText w:val="%8."/>
+      <w:lvlJc w:val="left"/>
+      <w:pPr>
+        <w:ind w:left="5760" w:hanging="360"/>
+      </w:pPr>
+    </w:lvl>
+    <w:lvl w:ilvl="8" w:tplc="100C001B" w:tentative="1">
+      <w:start w:val="1"/>
+      <w:numFmt w:val="lowerRoman"/>
+      <w:lvlText w:val="%9."/>
+      <w:lvlJc w:val="right"/>
+      <w:pPr>
+        <w:ind w:left="6480" w:hanging="180"/>
+      </w:pPr>
+    </w:lvl>
+  </w:abstractNum>
+  <w:abstractNum w:abstractNumId="2" w15:restartNumberingAfterBreak="0">
     <w:nsid w:val="55894058"/>
     <w:multiLevelType w:val="hybridMultilevel"/>
     <w:tmpl w:val="BED6D18E"/>
@@ -2877,7 +4878,7 @@
       </w:rPr>
     </w:lvl>
   </w:abstractNum>
-  <w:abstractNum w:abstractNumId="2" w15:restartNumberingAfterBreak="0">
+  <w:abstractNum w:abstractNumId="3" w15:restartNumberingAfterBreak="0">
     <w:nsid w:val="5CA43A5A"/>
     <w:multiLevelType w:val="hybridMultilevel"/>
     <w:tmpl w:val="C924F67C"/>
@@ -2990,7 +4991,7 @@
       </w:rPr>
     </w:lvl>
   </w:abstractNum>
-  <w:abstractNum w:abstractNumId="3" w15:restartNumberingAfterBreak="0">
+  <w:abstractNum w:abstractNumId="4" w15:restartNumberingAfterBreak="0">
     <w:nsid w:val="68217A16"/>
     <w:multiLevelType w:val="hybridMultilevel"/>
     <w:tmpl w:val="D8F00BE8"/>
@@ -3103,7 +5104,96 @@
       </w:rPr>
     </w:lvl>
   </w:abstractNum>
-  <w:abstractNum w:abstractNumId="4" w15:restartNumberingAfterBreak="0">
+  <w:abstractNum w:abstractNumId="5" w15:restartNumberingAfterBreak="0">
+    <w:nsid w:val="6D5C266A"/>
+    <w:multiLevelType w:val="hybridMultilevel"/>
+    <w:tmpl w:val="3AC29C9E"/>
+    <w:lvl w:ilvl="0" w:tplc="100C000F">
+      <w:start w:val="1"/>
+      <w:numFmt w:val="decimal"/>
+      <w:lvlText w:val="%1."/>
+      <w:lvlJc w:val="left"/>
+      <w:pPr>
+        <w:ind w:left="720" w:hanging="360"/>
+      </w:pPr>
+      <w:rPr>
+        <w:rFonts w:hint="default"/>
+      </w:rPr>
+    </w:lvl>
+    <w:lvl w:ilvl="1" w:tplc="100C0019" w:tentative="1">
+      <w:start w:val="1"/>
+      <w:numFmt w:val="lowerLetter"/>
+      <w:lvlText w:val="%2."/>
+      <w:lvlJc w:val="left"/>
+      <w:pPr>
+        <w:ind w:left="1440" w:hanging="360"/>
+      </w:pPr>
+    </w:lvl>
+    <w:lvl w:ilvl="2" w:tplc="100C001B" w:tentative="1">
+      <w:start w:val="1"/>
+      <w:numFmt w:val="lowerRoman"/>
+      <w:lvlText w:val="%3."/>
+      <w:lvlJc w:val="right"/>
+      <w:pPr>
+        <w:ind w:left="2160" w:hanging="180"/>
+      </w:pPr>
+    </w:lvl>
+    <w:lvl w:ilvl="3" w:tplc="100C000F" w:tentative="1">
+      <w:start w:val="1"/>
+      <w:numFmt w:val="decimal"/>
+      <w:lvlText w:val="%4."/>
+      <w:lvlJc w:val="left"/>
+      <w:pPr>
+        <w:ind w:left="2880" w:hanging="360"/>
+      </w:pPr>
+    </w:lvl>
+    <w:lvl w:ilvl="4" w:tplc="100C0019" w:tentative="1">
+      <w:start w:val="1"/>
+      <w:numFmt w:val="lowerLetter"/>
+      <w:lvlText w:val="%5."/>
+      <w:lvlJc w:val="left"/>
+      <w:pPr>
+        <w:ind w:left="3600" w:hanging="360"/>
+      </w:pPr>
+    </w:lvl>
+    <w:lvl w:ilvl="5" w:tplc="100C001B" w:tentative="1">
+      <w:start w:val="1"/>
+      <w:numFmt w:val="lowerRoman"/>
+      <w:lvlText w:val="%6."/>
+      <w:lvlJc w:val="right"/>
+      <w:pPr>
+        <w:ind w:left="4320" w:hanging="180"/>
+      </w:pPr>
+    </w:lvl>
+    <w:lvl w:ilvl="6" w:tplc="100C000F" w:tentative="1">
+      <w:start w:val="1"/>
+      <w:numFmt w:val="decimal"/>
+      <w:lvlText w:val="%7."/>
+      <w:lvlJc w:val="left"/>
+      <w:pPr>
+        <w:ind w:left="5040" w:hanging="360"/>
+      </w:pPr>
+    </w:lvl>
+    <w:lvl w:ilvl="7" w:tplc="100C0019" w:tentative="1">
+      <w:start w:val="1"/>
+      <w:numFmt w:val="lowerLetter"/>
+      <w:lvlText w:val="%8."/>
+      <w:lvlJc w:val="left"/>
+      <w:pPr>
+        <w:ind w:left="5760" w:hanging="360"/>
+      </w:pPr>
+    </w:lvl>
+    <w:lvl w:ilvl="8" w:tplc="100C001B" w:tentative="1">
+      <w:start w:val="1"/>
+      <w:numFmt w:val="lowerRoman"/>
+      <w:lvlText w:val="%9."/>
+      <w:lvlJc w:val="right"/>
+      <w:pPr>
+        <w:ind w:left="6480" w:hanging="180"/>
+      </w:pPr>
+    </w:lvl>
+  </w:abstractNum>
+  <w:abstractNum w:abstractNumId="6" w15:restartNumberingAfterBreak="0">
     <w:nsid w:val="70AC432E"/>
     <w:multiLevelType w:val="hybridMultilevel"/>
     <w:tmpl w:val="88AE25EE"/>
@@ -3192,7 +5282,96 @@
       </w:pPr>
     </w:lvl>
   </w:abstractNum>
-  <w:abstractNum w:abstractNumId="5" w15:restartNumberingAfterBreak="0">
+  <w:abstractNum w:abstractNumId="7" w15:restartNumberingAfterBreak="0">
+    <w:nsid w:val="74CC0C2D"/>
+    <w:multiLevelType w:val="hybridMultilevel"/>
+    <w:tmpl w:val="0D3C10E0"/>
+    <w:lvl w:ilvl="0" w:tplc="100C000F">
+      <w:start w:val="1"/>
+      <w:numFmt w:val="decimal"/>
+      <w:lvlText w:val="%1."/>
+      <w:lvlJc w:val="left"/>
+      <w:pPr>
+        <w:ind w:left="720" w:hanging="360"/>
+      </w:pPr>
+      <w:rPr>
+        <w:rFonts w:hint="default"/>
+      </w:rPr>
+    </w:lvl>
+    <w:lvl w:ilvl="1" w:tplc="100C0019" w:tentative="1">
+      <w:start w:val="1"/>
+      <w:numFmt w:val="lowerLetter"/>
+      <w:lvlText w:val="%2."/>
+      <w:lvlJc w:val="left"/>
+      <w:pPr>
+        <w:ind w:left="1440" w:hanging="360"/>
+      </w:pPr>
+    </w:lvl>
+    <w:lvl w:ilvl="2" w:tplc="100C001B" w:tentative="1">
+      <w:start w:val="1"/>
+      <w:numFmt w:val="lowerRoman"/>
+      <w:lvlText w:val="%3."/>
+      <w:lvlJc w:val="right"/>
+      <w:pPr>
+        <w:ind w:left="2160" w:hanging="180"/>
+      </w:pPr>
+    </w:lvl>
+    <w:lvl w:ilvl="3" w:tplc="100C000F" w:tentative="1">
+      <w:start w:val="1"/>
+      <w:numFmt w:val="decimal"/>
+      <w:lvlText w:val="%4."/>
+      <w:lvlJc w:val="left"/>
+      <w:pPr>
+        <w:ind w:left="2880" w:hanging="360"/>
+      </w:pPr>
+    </w:lvl>
+    <w:lvl w:ilvl="4" w:tplc="100C0019" w:tentative="1">
+      <w:start w:val="1"/>
+      <w:numFmt w:val="lowerLetter"/>
+      <w:lvlText w:val="%5."/>
+      <w:lvlJc w:val="left"/>
+      <w:pPr>
+        <w:ind w:left="3600" w:hanging="360"/>
+      </w:pPr>
+    </w:lvl>
+    <w:lvl w:ilvl="5" w:tplc="100C001B" w:tentative="1">
+      <w:start w:val="1"/>
+      <w:numFmt w:val="lowerRoman"/>
+      <w:lvlText w:val="%6."/>
+      <w:lvlJc w:val="right"/>
+      <w:pPr>
+        <w:ind w:left="4320" w:hanging="180"/>
+      </w:pPr>
+    </w:lvl>
+    <w:lvl w:ilvl="6" w:tplc="100C000F" w:tentative="1">
+      <w:start w:val="1"/>
+      <w:numFmt w:val="decimal"/>
+      <w:lvlText w:val="%7."/>
+      <w:lvlJc w:val="left"/>
+      <w:pPr>
+        <w:ind w:left="5040" w:hanging="360"/>
+      </w:pPr>
+    </w:lvl>
+    <w:lvl w:ilvl="7" w:tplc="100C0019" w:tentative="1">
+      <w:start w:val="1"/>
+      <w:numFmt w:val="lowerLetter"/>
+      <w:lvlText w:val="%8."/>
+      <w:lvlJc w:val="left"/>
+      <w:pPr>
+        <w:ind w:left="5760" w:hanging="360"/>
+      </w:pPr>
+    </w:lvl>
+    <w:lvl w:ilvl="8" w:tplc="100C001B" w:tentative="1">
+      <w:start w:val="1"/>
+      <w:numFmt w:val="lowerRoman"/>
+      <w:lvlText w:val="%9."/>
+      <w:lvlJc w:val="right"/>
+      <w:pPr>
+        <w:ind w:left="6480" w:hanging="180"/>
+      </w:pPr>
+    </w:lvl>
+  </w:abstractNum>
+  <w:abstractNum w:abstractNumId="8" w15:restartNumberingAfterBreak="0">
     <w:nsid w:val="799C30BC"/>
     <w:multiLevelType w:val="hybridMultilevel"/>
     <w:tmpl w:val="8D80DFB0"/>
@@ -3282,22 +5461,31 @@
     </w:lvl>
   </w:abstractNum>
   <w:num w:numId="1" w16cid:durableId="1932200371">
-    <w:abstractNumId w:val="5"/>
+    <w:abstractNumId w:val="8"/>
   </w:num>
   <w:num w:numId="2" w16cid:durableId="1384259163">
-    <w:abstractNumId w:val="4"/>
+    <w:abstractNumId w:val="6"/>
   </w:num>
   <w:num w:numId="3" w16cid:durableId="309990493">
     <w:abstractNumId w:val="0"/>
   </w:num>
   <w:num w:numId="4" w16cid:durableId="817889362">
+    <w:abstractNumId w:val="3"/>
+  </w:num>
+  <w:num w:numId="5" w16cid:durableId="306323428">
     <w:abstractNumId w:val="2"/>
   </w:num>
-  <w:num w:numId="5" w16cid:durableId="306323428">
+  <w:num w:numId="6" w16cid:durableId="1381517572">
+    <w:abstractNumId w:val="4"/>
+  </w:num>
+  <w:num w:numId="7" w16cid:durableId="1400208128">
+    <w:abstractNumId w:val="7"/>
+  </w:num>
+  <w:num w:numId="8" w16cid:durableId="199980412">
     <w:abstractNumId w:val="1"/>
   </w:num>
-  <w:num w:numId="6" w16cid:durableId="1381517572">
-    <w:abstractNumId w:val="3"/>
+  <w:num w:numId="9" w16cid:durableId="1571115120">
+    <w:abstractNumId w:val="5"/>
   </w:num>
 </w:numbering>
 </file>
@@ -4342,6 +6530,15 @@
       <w:shd w:val="clear" w:color="auto" w:fill="E1DFDD"/>
     </w:rPr>
   </w:style>
+  <w:style w:type="paragraph" w:styleId="Sansinterligne">
+    <w:name w:val="No Spacing"/>
+    <w:uiPriority w:val="1"/>
+    <w:qFormat/>
+    <w:rsid w:val="009A1C03"/>
+    <w:pPr>
+      <w:spacing w:after="0" w:line="240" w:lineRule="auto"/>
+    </w:pPr>
+  </w:style>
 </w:styles>
 </file>
 

</xml_diff>

<commit_message>
doc(rapport, chapitre users) : ajout
Rédaction du chapitre users dans le rapport, avec les infos données, nous pouvons créer les users et leur attribuer les rôles
</commit_message>
<xml_diff>
--- a/R106-JonJunod-ThanosPizza.docx
+++ b/R106-JonJunod-ThanosPizza.docx
@@ -760,7 +760,15 @@
         <w:t>nen</w:t>
       </w:r>
       <w:r>
-        <w:t>t toutes les données à insérer et voici ce que j’ai fait pour les loader.</w:t>
+        <w:t xml:space="preserve">t toutes les données à insérer et voici ce que j’ai fait pour </w:t>
+      </w:r>
+      <w:proofErr w:type="gramStart"/>
+      <w:r>
+        <w:t>les loader</w:t>
+      </w:r>
+      <w:proofErr w:type="gramEnd"/>
+      <w:r>
+        <w:t>.</w:t>
       </w:r>
     </w:p>
     <w:p>
@@ -943,8 +951,16 @@
           <w:lang w:val="en-US"/>
         </w:rPr>
         <w:tab/>
-        <w:t>IGNORE 1 LINES;</w:t>
-      </w:r>
+        <w:t xml:space="preserve">IGNORE 1 </w:t>
+      </w:r>
+      <w:proofErr w:type="gramStart"/>
+      <w:r>
+        <w:rPr>
+          <w:lang w:val="en-US"/>
+        </w:rPr>
+        <w:t>LINES;</w:t>
+      </w:r>
+      <w:proofErr w:type="gramEnd"/>
     </w:p>
     <w:p>
       <w:pPr>
@@ -1085,8 +1101,16 @@
           <w:lang w:val="en-US"/>
         </w:rPr>
         <w:tab/>
-        <w:t>IGNORE 1 LINES;</w:t>
-      </w:r>
+        <w:t xml:space="preserve">IGNORE 1 </w:t>
+      </w:r>
+      <w:proofErr w:type="gramStart"/>
+      <w:r>
+        <w:rPr>
+          <w:lang w:val="en-US"/>
+        </w:rPr>
+        <w:t>LINES;</w:t>
+      </w:r>
+      <w:proofErr w:type="gramEnd"/>
     </w:p>
     <w:p>
       <w:pPr>
@@ -1227,8 +1251,16 @@
           <w:lang w:val="en-US"/>
         </w:rPr>
         <w:tab/>
-        <w:t>IGNORE 1 LINES;</w:t>
-      </w:r>
+        <w:t xml:space="preserve">IGNORE 1 </w:t>
+      </w:r>
+      <w:proofErr w:type="gramStart"/>
+      <w:r>
+        <w:rPr>
+          <w:lang w:val="en-US"/>
+        </w:rPr>
+        <w:t>LINES;</w:t>
+      </w:r>
+      <w:proofErr w:type="gramEnd"/>
     </w:p>
     <w:p>
       <w:pPr>
@@ -1553,111 +1585,67 @@
       </w:r>
     </w:p>
     <w:p>
-      <w:pPr>
-        <w:rPr>
-          <w:lang w:val="en-US"/>
-        </w:rPr>
-      </w:pPr>
       <w:r>
         <w:rPr>
           <w:lang w:val="en-US"/>
         </w:rPr>
         <w:tab/>
+      </w:r>
+      <w:r>
         <w:t>IGNORE 1 LINES</w:t>
       </w:r>
     </w:p>
     <w:p>
-      <w:pPr>
-        <w:rPr>
-          <w:lang w:val="en-US"/>
-        </w:rPr>
-      </w:pPr>
-      <w:r>
-        <w:rPr>
-          <w:lang w:val="en-US"/>
-        </w:rPr>
+      <w:r>
         <w:t xml:space="preserve">    (</w:t>
       </w:r>
       <w:proofErr w:type="spellStart"/>
-      <w:r>
-        <w:rPr>
-          <w:lang w:val="en-US"/>
-        </w:rPr>
-        <w:t>commande_id</w:t>
-      </w:r>
-      <w:proofErr w:type="spellEnd"/>
-      <w:r>
-        <w:rPr>
-          <w:lang w:val="en-US"/>
-        </w:rPr>
+      <w:proofErr w:type="gramStart"/>
+      <w:r>
+        <w:t>commande</w:t>
+      </w:r>
+      <w:proofErr w:type="gramEnd"/>
+      <w:r>
+        <w:t>_id</w:t>
+      </w:r>
+      <w:proofErr w:type="spellEnd"/>
+      <w:r>
         <w:t xml:space="preserve">, </w:t>
       </w:r>
       <w:proofErr w:type="spellStart"/>
       <w:r>
-        <w:rPr>
-          <w:lang w:val="en-US"/>
-        </w:rPr>
         <w:t>client_fk</w:t>
       </w:r>
       <w:proofErr w:type="spellEnd"/>
       <w:r>
-        <w:rPr>
-          <w:lang w:val="en-US"/>
-        </w:rPr>
-        <w:t xml:space="preserve">, type, @vAdresse, @mytimestamp, </w:t>
-      </w:r>
-      <w:proofErr w:type="spellStart"/>
-      <w:r>
-        <w:rPr>
-          <w:lang w:val="en-US"/>
-        </w:rPr>
-        <w:t>statut</w:t>
-      </w:r>
-      <w:proofErr w:type="spellEnd"/>
-      <w:r>
-        <w:rPr>
-          <w:lang w:val="en-US"/>
-        </w:rPr>
-        <w:t>)</w:t>
-      </w:r>
-    </w:p>
-    <w:p>
-      <w:pPr>
-        <w:rPr>
-          <w:lang w:val="en-US"/>
-        </w:rPr>
-      </w:pPr>
-      <w:r>
-        <w:rPr>
-          <w:lang w:val="en-US"/>
-        </w:rPr>
+        <w:t>, type, @vAdresse, @mytimestamp, statut)</w:t>
+      </w:r>
+    </w:p>
+    <w:p>
+      <w:r>
         <w:t xml:space="preserve">    SET </w:t>
       </w:r>
       <w:proofErr w:type="spellStart"/>
       <w:r>
-        <w:rPr>
-          <w:lang w:val="en-US"/>
-        </w:rPr>
         <w:t>adresse_fk</w:t>
       </w:r>
       <w:proofErr w:type="spellEnd"/>
       <w:r>
-        <w:rPr>
-          <w:lang w:val="en-US"/>
-        </w:rPr>
         <w:t xml:space="preserve"> = NULLIF(@vAdresse,''), </w:t>
       </w:r>
     </w:p>
     <w:p>
       <w:r>
-        <w:rPr>
-          <w:lang w:val="en-US"/>
-        </w:rPr>
         <w:t xml:space="preserve">    </w:t>
       </w:r>
       <w:proofErr w:type="spellStart"/>
-      <w:r>
-        <w:t>date_et_heure</w:t>
+      <w:proofErr w:type="gramStart"/>
+      <w:r>
+        <w:t>date</w:t>
+      </w:r>
+      <w:proofErr w:type="gramEnd"/>
+      <w:r>
+        <w:t>_et_heure</w:t>
       </w:r>
       <w:proofErr w:type="spellEnd"/>
       <w:r>
@@ -2395,8 +2383,13 @@
         <w:t xml:space="preserve">    </w:t>
       </w:r>
       <w:proofErr w:type="spellStart"/>
-      <w:r>
-        <w:t>heure_arrivee</w:t>
+      <w:proofErr w:type="gramStart"/>
+      <w:r>
+        <w:t>heure</w:t>
+      </w:r>
+      <w:proofErr w:type="gramEnd"/>
+      <w:r>
+        <w:t>_arrivee</w:t>
       </w:r>
       <w:proofErr w:type="spellEnd"/>
       <w:r>
@@ -2574,10 +2567,7 @@
       </w:r>
       <w:proofErr w:type="spellStart"/>
       <w:r>
-        <w:t>c.date_</w:t>
-      </w:r>
-      <w:r>
-        <w:t>et_heur</w:t>
+        <w:t>c.date_et_heur</w:t>
       </w:r>
       <w:r>
         <w:t>e</w:t>
@@ -2592,34 +2582,16 @@
         <w:pStyle w:val="Sansinterligne"/>
         <w:keepNext/>
         <w:keepLines/>
-        <w:rPr>
-          <w:lang w:val="en-US"/>
-        </w:rPr>
-      </w:pPr>
-      <w:r>
-        <w:rPr>
-          <w:lang w:val="en-US"/>
-        </w:rPr>
+      </w:pPr>
+      <w:r>
         <w:t xml:space="preserve">ORDER BY </w:t>
       </w:r>
       <w:proofErr w:type="spellStart"/>
       <w:r>
-        <w:rPr>
-          <w:lang w:val="en-US"/>
-        </w:rPr>
-        <w:t>c.date_</w:t>
-      </w:r>
-      <w:r>
-        <w:rPr>
-          <w:lang w:val="en-US"/>
-        </w:rPr>
-        <w:t>et_heure</w:t>
-      </w:r>
-      <w:proofErr w:type="spellEnd"/>
-      <w:r>
-        <w:rPr>
-          <w:lang w:val="en-US"/>
-        </w:rPr>
+        <w:t>c.date_et_heure</w:t>
+      </w:r>
+      <w:proofErr w:type="spellEnd"/>
+      <w:r>
         <w:t xml:space="preserve"> DESC;</w:t>
       </w:r>
     </w:p>
@@ -2744,10 +2716,12 @@
     </w:p>
     <w:p>
       <w:proofErr w:type="spellStart"/>
+      <w:proofErr w:type="gramStart"/>
       <w:r>
         <w:t>create</w:t>
       </w:r>
       <w:proofErr w:type="spellEnd"/>
+      <w:proofErr w:type="gramEnd"/>
       <w:r>
         <w:t xml:space="preserve"> </w:t>
       </w:r>
@@ -2773,11 +2747,6 @@
       </w:r>
     </w:p>
     <w:p>
-      <w:pPr>
-        <w:rPr>
-          <w:lang w:val="en-US"/>
-        </w:rPr>
-      </w:pPr>
       <w:r>
         <w:t>Nos rôles sont maintenant actifs mais sans permissions, nous allons donc leur en donner.</w:t>
       </w:r>
@@ -2785,67 +2754,49 @@
         <w:t xml:space="preserve"> </w:t>
       </w:r>
       <w:r>
-        <w:rPr>
-          <w:lang w:val="en-US"/>
-        </w:rPr>
-        <w:t>Vous pouvez copier-co</w:t>
-      </w:r>
-      <w:r>
-        <w:rPr>
-          <w:lang w:val="en-US"/>
-        </w:rPr>
-        <w:t>ller les lignes ci-dessous.</w:t>
+        <w:t>Vous pouvez copier-coller les lignes ci-dessous.</w:t>
       </w:r>
     </w:p>
     <w:p>
       <w:pPr>
         <w:pStyle w:val="Sansinterligne"/>
-        <w:rPr>
-          <w:lang w:val="en-US"/>
-        </w:rPr>
-      </w:pPr>
-      <w:r>
-        <w:rPr>
-          <w:lang w:val="en-US"/>
-        </w:rPr>
+      </w:pPr>
+      <w:r>
         <w:t>--</w:t>
       </w:r>
       <w:r>
-        <w:rPr>
-          <w:lang w:val="en-US"/>
-        </w:rPr>
         <w:t xml:space="preserve"> </w:t>
       </w:r>
       <w:r>
-        <w:rPr>
-          <w:lang w:val="en-US"/>
-        </w:rPr>
         <w:t>administrateur</w:t>
       </w:r>
     </w:p>
     <w:p>
       <w:pPr>
         <w:pStyle w:val="Sansinterligne"/>
-        <w:rPr>
-          <w:lang w:val="en-US"/>
-        </w:rPr>
-      </w:pPr>
-      <w:r>
-        <w:rPr>
-          <w:lang w:val="en-US"/>
-        </w:rPr>
-        <w:t>grant all privileges on db_Thanoss_</w:t>
-      </w:r>
-      <w:r>
-        <w:rPr>
-          <w:lang w:val="en-US"/>
-        </w:rPr>
+      </w:pPr>
+      <w:proofErr w:type="spellStart"/>
+      <w:proofErr w:type="gramStart"/>
+      <w:r>
+        <w:t>grant</w:t>
+      </w:r>
+      <w:proofErr w:type="spellEnd"/>
+      <w:proofErr w:type="gramEnd"/>
+      <w:r>
+        <w:t xml:space="preserve"> all </w:t>
+      </w:r>
+      <w:proofErr w:type="spellStart"/>
+      <w:r>
+        <w:t>privileges</w:t>
+      </w:r>
+      <w:proofErr w:type="spellEnd"/>
+      <w:r>
+        <w:t xml:space="preserve"> on db_Thanoss_</w:t>
+      </w:r>
+      <w:r>
         <w:t>Pizza.</w:t>
       </w:r>
       <w:r>
-        <w:rPr>
-          <w:lang w:val="en-US"/>
-        </w:rPr>
         <w:t>* to 'Administrateur';</w:t>
       </w:r>
     </w:p>
@@ -2860,8 +2811,23 @@
         <w:rPr>
           <w:lang w:val="en-US"/>
         </w:rPr>
-        <w:t>grant grant option on db_Thanoss_</w:t>
-      </w:r>
+        <w:t xml:space="preserve">grant </w:t>
+      </w:r>
+      <w:proofErr w:type="spellStart"/>
+      <w:r>
+        <w:rPr>
+          <w:lang w:val="en-US"/>
+        </w:rPr>
+        <w:t>grant</w:t>
+      </w:r>
+      <w:proofErr w:type="spellEnd"/>
+      <w:r>
+        <w:rPr>
+          <w:lang w:val="en-US"/>
+        </w:rPr>
+        <w:t xml:space="preserve"> option on db_Thanoss_</w:t>
+      </w:r>
+      <w:proofErr w:type="gramStart"/>
       <w:r>
         <w:rPr>
           <w:lang w:val="en-US"/>
@@ -2872,7 +2838,14 @@
         <w:rPr>
           <w:lang w:val="en-US"/>
         </w:rPr>
-        <w:t>* to 'Administrateur';</w:t>
+        <w:t>*</w:t>
+      </w:r>
+      <w:proofErr w:type="gramEnd"/>
+      <w:r>
+        <w:rPr>
+          <w:lang w:val="en-US"/>
+        </w:rPr>
+        <w:t xml:space="preserve"> to 'Administrateur';</w:t>
       </w:r>
     </w:p>
     <w:p>
@@ -2958,6 +2931,7 @@
         </w:rPr>
         <w:t>Manager</w:t>
       </w:r>
+      <w:proofErr w:type="gramStart"/>
       <w:r>
         <w:rPr>
           <w:lang w:val="en-US"/>
@@ -2970,6 +2944,7 @@
         </w:rPr>
         <w:t>;</w:t>
       </w:r>
+      <w:proofErr w:type="gramEnd"/>
     </w:p>
     <w:p>
       <w:pPr>
@@ -3028,6 +3003,7 @@
         </w:rPr>
         <w:t>Manager</w:t>
       </w:r>
+      <w:proofErr w:type="gramStart"/>
       <w:r>
         <w:rPr>
           <w:lang w:val="en-US"/>
@@ -3040,6 +3016,7 @@
         </w:rPr>
         <w:t>;</w:t>
       </w:r>
+      <w:proofErr w:type="gramEnd"/>
     </w:p>
     <w:p>
       <w:pPr>
@@ -3086,6 +3063,7 @@
         </w:rPr>
         <w:t>Manager</w:t>
       </w:r>
+      <w:proofErr w:type="gramStart"/>
       <w:r>
         <w:rPr>
           <w:lang w:val="en-US"/>
@@ -3098,6 +3076,7 @@
         </w:rPr>
         <w:t>;</w:t>
       </w:r>
+      <w:proofErr w:type="gramEnd"/>
     </w:p>
     <w:p>
       <w:pPr>
@@ -3156,6 +3135,7 @@
         </w:rPr>
         <w:t>Manager</w:t>
       </w:r>
+      <w:proofErr w:type="gramStart"/>
       <w:r>
         <w:rPr>
           <w:lang w:val="en-US"/>
@@ -3168,6 +3148,7 @@
         </w:rPr>
         <w:t>;</w:t>
       </w:r>
+      <w:proofErr w:type="gramEnd"/>
     </w:p>
     <w:p>
       <w:pPr>
@@ -3240,6 +3221,7 @@
         </w:rPr>
         <w:t>Pizzaiolo</w:t>
       </w:r>
+      <w:proofErr w:type="gramStart"/>
       <w:r>
         <w:rPr>
           <w:lang w:val="en-US"/>
@@ -3252,6 +3234,7 @@
         </w:rPr>
         <w:t>;</w:t>
       </w:r>
+      <w:proofErr w:type="gramEnd"/>
     </w:p>
     <w:p>
       <w:pPr>
@@ -3298,6 +3281,7 @@
         </w:rPr>
         <w:t>Pizzaiolo</w:t>
       </w:r>
+      <w:proofErr w:type="gramStart"/>
       <w:r>
         <w:rPr>
           <w:lang w:val="en-US"/>
@@ -3310,6 +3294,7 @@
         </w:rPr>
         <w:t>;</w:t>
       </w:r>
+      <w:proofErr w:type="gramEnd"/>
     </w:p>
     <w:p>
       <w:pPr>
@@ -3382,6 +3367,7 @@
         </w:rPr>
         <w:t>Pizzaiolo</w:t>
       </w:r>
+      <w:proofErr w:type="gramStart"/>
       <w:r>
         <w:rPr>
           <w:lang w:val="en-US"/>
@@ -3394,6 +3380,7 @@
         </w:rPr>
         <w:t>;</w:t>
       </w:r>
+      <w:proofErr w:type="gramEnd"/>
     </w:p>
     <w:p>
       <w:pPr>
@@ -3451,6 +3438,9 @@
         <w:t xml:space="preserve"> to </w:t>
       </w:r>
       <w:r>
+        <w:rPr>
+          <w:lang w:val="en-US"/>
+        </w:rPr>
         <w:t>'</w:t>
       </w:r>
       <w:proofErr w:type="spellStart"/>
@@ -3461,7 +3451,11 @@
         <w:t>Livreur</w:t>
       </w:r>
       <w:proofErr w:type="spellEnd"/>
-      <w:r>
+      <w:proofErr w:type="gramStart"/>
+      <w:r>
+        <w:rPr>
+          <w:lang w:val="en-US"/>
+        </w:rPr>
         <w:t>'</w:t>
       </w:r>
       <w:r>
@@ -3470,6 +3464,7 @@
         </w:rPr>
         <w:t>;</w:t>
       </w:r>
+      <w:proofErr w:type="gramEnd"/>
     </w:p>
     <w:p>
       <w:pPr>
@@ -3518,6 +3513,7 @@
         <w:t>Livreur</w:t>
       </w:r>
       <w:proofErr w:type="spellEnd"/>
+      <w:proofErr w:type="gramStart"/>
       <w:r>
         <w:rPr>
           <w:lang w:val="en-US"/>
@@ -3530,6 +3526,7 @@
         </w:rPr>
         <w:t>;</w:t>
       </w:r>
+      <w:proofErr w:type="gramEnd"/>
     </w:p>
     <w:p>
       <w:pPr>
@@ -3605,6 +3602,7 @@
         <w:t>Livreur</w:t>
       </w:r>
       <w:proofErr w:type="spellEnd"/>
+      <w:proofErr w:type="gramStart"/>
       <w:r>
         <w:rPr>
           <w:lang w:val="en-US"/>
@@ -3617,6 +3615,7 @@
         </w:rPr>
         <w:t>;</w:t>
       </w:r>
+      <w:proofErr w:type="gramEnd"/>
     </w:p>
     <w:p>
       <w:pPr>
@@ -3631,10 +3630,12 @@
         <w:pStyle w:val="Sansinterligne"/>
       </w:pPr>
       <w:proofErr w:type="spellStart"/>
+      <w:proofErr w:type="gramStart"/>
       <w:r>
         <w:t>grant</w:t>
       </w:r>
       <w:proofErr w:type="spellEnd"/>
+      <w:proofErr w:type="gramEnd"/>
       <w:r>
         <w:t xml:space="preserve"> select on </w:t>
       </w:r>
@@ -3658,19 +3659,18 @@
         <w:pStyle w:val="Sansinterligne"/>
       </w:pPr>
       <w:proofErr w:type="spellStart"/>
+      <w:proofErr w:type="gramStart"/>
       <w:r>
         <w:t>grant</w:t>
       </w:r>
       <w:proofErr w:type="spellEnd"/>
+      <w:proofErr w:type="gramEnd"/>
       <w:r>
         <w:t xml:space="preserve"> insert on </w:t>
       </w:r>
       <w:proofErr w:type="spellStart"/>
       <w:r>
-        <w:t>db_Thanoss_Pizza</w:t>
-      </w:r>
-      <w:r>
-        <w:t>.t_paiement</w:t>
+        <w:t>db_Thanoss_Pizza.t_paiement</w:t>
       </w:r>
       <w:proofErr w:type="spellEnd"/>
       <w:r>
@@ -3686,6 +3686,53 @@
     <w:p>
       <w:pPr>
         <w:pStyle w:val="Sansinterligne"/>
+      </w:pPr>
+      <w:proofErr w:type="spellStart"/>
+      <w:proofErr w:type="gramStart"/>
+      <w:r>
+        <w:t>grant</w:t>
+      </w:r>
+      <w:proofErr w:type="spellEnd"/>
+      <w:proofErr w:type="gramEnd"/>
+      <w:r>
+        <w:t xml:space="preserve"> select on </w:t>
+      </w:r>
+      <w:proofErr w:type="spellStart"/>
+      <w:r>
+        <w:t>db_Thanoss_Pizza.t_commande</w:t>
+      </w:r>
+      <w:proofErr w:type="spellEnd"/>
+      <w:r>
+        <w:t xml:space="preserve"> to </w:t>
+      </w:r>
+      <w:r>
+        <w:t>'Agent de caisse' ;</w:t>
+      </w:r>
+    </w:p>
+    <w:p>
+      <w:pPr>
+        <w:pStyle w:val="Sansinterligne"/>
+        <w:rPr>
+          <w:lang w:val="en-US"/>
+        </w:rPr>
+      </w:pPr>
+      <w:r>
+        <w:rPr>
+          <w:lang w:val="en-US"/>
+        </w:rPr>
+        <w:t xml:space="preserve">-- </w:t>
+      </w:r>
+      <w:proofErr w:type="spellStart"/>
+      <w:r>
+        <w:rPr>
+          <w:lang w:val="en-US"/>
+        </w:rPr>
+        <w:t>analyste</w:t>
+      </w:r>
+      <w:proofErr w:type="spellEnd"/>
+    </w:p>
+    <w:p>
+      <w:pPr>
         <w:rPr>
           <w:lang w:val="en-US"/>
         </w:rPr>
@@ -3696,98 +3743,31 @@
         </w:rPr>
         <w:t xml:space="preserve">grant select on </w:t>
       </w:r>
-      <w:proofErr w:type="spellStart"/>
-      <w:r>
-        <w:rPr>
-          <w:lang w:val="en-US"/>
-        </w:rPr>
-        <w:t>db_Thanoss_Pizza</w:t>
-      </w:r>
-      <w:r>
-        <w:rPr>
-          <w:lang w:val="en-US"/>
-        </w:rPr>
-        <w:t>.t_commande</w:t>
-      </w:r>
-      <w:proofErr w:type="spellEnd"/>
+      <w:r>
+        <w:rPr>
+          <w:lang w:val="en-US"/>
+        </w:rPr>
+        <w:t>db_Thanoss_</w:t>
+      </w:r>
+      <w:proofErr w:type="gramStart"/>
+      <w:r>
+        <w:rPr>
+          <w:lang w:val="en-US"/>
+        </w:rPr>
+        <w:t>Pizza</w:t>
+      </w:r>
+      <w:r>
+        <w:rPr>
+          <w:lang w:val="en-US"/>
+        </w:rPr>
+        <w:t>.*</w:t>
+      </w:r>
+      <w:proofErr w:type="gramEnd"/>
       <w:r>
         <w:rPr>
           <w:lang w:val="en-US"/>
         </w:rPr>
         <w:t xml:space="preserve"> to </w:t>
-      </w:r>
-      <w:r>
-        <w:rPr>
-          <w:lang w:val="en-US"/>
-        </w:rPr>
-        <w:t xml:space="preserve">'Agent de </w:t>
-      </w:r>
-      <w:proofErr w:type="spellStart"/>
-      <w:r>
-        <w:rPr>
-          <w:lang w:val="en-US"/>
-        </w:rPr>
-        <w:t>caisse</w:t>
-      </w:r>
-      <w:proofErr w:type="spellEnd"/>
-      <w:r>
-        <w:rPr>
-          <w:lang w:val="en-US"/>
-        </w:rPr>
-        <w:t>'</w:t>
-      </w:r>
-      <w:r>
-        <w:rPr>
-          <w:lang w:val="en-US"/>
-        </w:rPr>
-        <w:t> ;</w:t>
-      </w:r>
-    </w:p>
-    <w:p>
-      <w:pPr>
-        <w:pStyle w:val="Sansinterligne"/>
-        <w:rPr>
-          <w:lang w:val="en-US"/>
-        </w:rPr>
-      </w:pPr>
-      <w:r>
-        <w:rPr>
-          <w:lang w:val="en-US"/>
-        </w:rPr>
-        <w:t xml:space="preserve">-- </w:t>
-      </w:r>
-      <w:proofErr w:type="spellStart"/>
-      <w:r>
-        <w:rPr>
-          <w:lang w:val="en-US"/>
-        </w:rPr>
-        <w:t>analyste</w:t>
-      </w:r>
-      <w:proofErr w:type="spellEnd"/>
-    </w:p>
-    <w:p>
-      <w:pPr>
-        <w:rPr>
-          <w:lang w:val="en-US"/>
-        </w:rPr>
-      </w:pPr>
-      <w:r>
-        <w:rPr>
-          <w:lang w:val="en-US"/>
-        </w:rPr>
-        <w:t xml:space="preserve">grant select on </w:t>
-      </w:r>
-      <w:r>
-        <w:rPr>
-          <w:lang w:val="en-US"/>
-        </w:rPr>
-        <w:t>db_Thanoss_Pizza</w:t>
-      </w:r>
-      <w:r>
-        <w:rPr>
-          <w:lang w:val="en-US"/>
-        </w:rPr>
-        <w:t xml:space="preserve">.* to </w:t>
       </w:r>
       <w:r>
         <w:rPr>
@@ -3918,13 +3898,16 @@
           <w:lang w:val="en-US"/>
         </w:rPr>
         <w:br/>
-      </w:r>
-      <w:r>
-        <w:rPr>
-          <w:lang w:val="en-US"/>
-        </w:rPr>
-        <w:t>SHOW GRANTS FOR 'Administrateur';</w:t>
-      </w:r>
+        <w:t>SHOW GRANTS FOR 'Administrateur</w:t>
+      </w:r>
+      <w:proofErr w:type="gramStart"/>
+      <w:r>
+        <w:rPr>
+          <w:lang w:val="en-US"/>
+        </w:rPr>
+        <w:t>';</w:t>
+      </w:r>
+      <w:proofErr w:type="gramEnd"/>
     </w:p>
     <w:p>
       <w:pPr>
@@ -3943,13 +3926,7 @@
         <w:rPr>
           <w:lang w:val="en-US"/>
         </w:rPr>
-        <w:t xml:space="preserve"> </w:t>
-      </w:r>
-      <w:r>
-        <w:rPr>
-          <w:lang w:val="en-US"/>
-        </w:rPr>
-        <w:t>manager</w:t>
+        <w:t xml:space="preserve"> manager</w:t>
       </w:r>
       <w:r>
         <w:rPr>
@@ -3964,12 +3941,14 @@
         </w:rPr>
         <w:t>Manager</w:t>
       </w:r>
+      <w:proofErr w:type="gramStart"/>
       <w:r>
         <w:rPr>
           <w:lang w:val="en-US"/>
         </w:rPr>
         <w:t>';</w:t>
       </w:r>
+      <w:proofErr w:type="gramEnd"/>
     </w:p>
     <w:p>
       <w:pPr>
@@ -3988,13 +3967,7 @@
         <w:rPr>
           <w:lang w:val="en-US"/>
         </w:rPr>
-        <w:t xml:space="preserve"> </w:t>
-      </w:r>
-      <w:r>
-        <w:rPr>
-          <w:lang w:val="en-US"/>
-        </w:rPr>
-        <w:t>pizzaiolo</w:t>
+        <w:t xml:space="preserve"> pizzaiolo</w:t>
       </w:r>
       <w:r>
         <w:rPr>
@@ -4009,16 +3982,42 @@
         </w:rPr>
         <w:t>Pizzaiolo</w:t>
       </w:r>
+      <w:proofErr w:type="gramStart"/>
       <w:r>
         <w:rPr>
           <w:lang w:val="en-US"/>
         </w:rPr>
         <w:t>';</w:t>
       </w:r>
+      <w:proofErr w:type="gramEnd"/>
     </w:p>
     <w:p>
       <w:pPr>
         <w:pStyle w:val="Sansinterligne"/>
+      </w:pPr>
+      <w:r>
+        <w:t>-- livreur</w:t>
+      </w:r>
+      <w:r>
+        <w:br/>
+        <w:t>SHOW GRANTS FOR 'Livreur';</w:t>
+      </w:r>
+    </w:p>
+    <w:p>
+      <w:pPr>
+        <w:pStyle w:val="Sansinterligne"/>
+      </w:pPr>
+      <w:r>
+        <w:t>-- agent de caisse</w:t>
+      </w:r>
+      <w:r>
+        <w:br/>
+        <w:t>SHOW GRANTS FOR 'Agent de caisse';</w:t>
+      </w:r>
+    </w:p>
+    <w:p>
+      <w:pPr>
+        <w:pStyle w:val="Sansinterligne"/>
         <w:rPr>
           <w:lang w:val="en-US"/>
         </w:rPr>
@@ -4040,7 +4039,7 @@
         <w:rPr>
           <w:lang w:val="en-US"/>
         </w:rPr>
-        <w:t>livreur</w:t>
+        <w:t>analyste</w:t>
       </w:r>
       <w:proofErr w:type="spellEnd"/>
       <w:r>
@@ -4055,36 +4054,25 @@
         <w:rPr>
           <w:lang w:val="en-US"/>
         </w:rPr>
-        <w:t>Livreur</w:t>
-      </w:r>
-      <w:proofErr w:type="spellEnd"/>
+        <w:t>Analyste</w:t>
+      </w:r>
+      <w:proofErr w:type="spellEnd"/>
+      <w:proofErr w:type="gramStart"/>
       <w:r>
         <w:rPr>
           <w:lang w:val="en-US"/>
         </w:rPr>
         <w:t>';</w:t>
       </w:r>
+      <w:proofErr w:type="gramEnd"/>
     </w:p>
     <w:p>
       <w:pPr>
         <w:pStyle w:val="Sansinterligne"/>
-      </w:pPr>
-      <w:r>
-        <w:t xml:space="preserve">-- </w:t>
-      </w:r>
-      <w:r>
-        <w:t>agent de caisse</w:t>
-      </w:r>
-      <w:r>
-        <w:br/>
-        <w:t>SHOW GRANTS FOR 'A</w:t>
-      </w:r>
-      <w:r>
-        <w:t>gent de caisse</w:t>
-      </w:r>
-      <w:r>
-        <w:t>';</w:t>
-      </w:r>
+        <w:rPr>
+          <w:lang w:val="en-US"/>
+        </w:rPr>
+      </w:pPr>
     </w:p>
     <w:p>
       <w:pPr>
@@ -4095,63 +4083,7 @@
       </w:pPr>
       <w:r>
         <w:rPr>
-          <w:lang w:val="en-US"/>
-        </w:rPr>
-        <w:t>--</w:t>
-      </w:r>
-      <w:r>
-        <w:rPr>
-          <w:lang w:val="en-US"/>
-        </w:rPr>
-        <w:t xml:space="preserve"> </w:t>
-      </w:r>
-      <w:proofErr w:type="spellStart"/>
-      <w:r>
-        <w:rPr>
-          <w:lang w:val="en-US"/>
-        </w:rPr>
-        <w:t>analyste</w:t>
-      </w:r>
-      <w:proofErr w:type="spellEnd"/>
-      <w:r>
-        <w:rPr>
-          <w:lang w:val="en-US"/>
-        </w:rPr>
-        <w:br/>
-        <w:t>SHOW GRANTS FOR '</w:t>
-      </w:r>
-      <w:proofErr w:type="spellStart"/>
-      <w:r>
-        <w:rPr>
-          <w:lang w:val="en-US"/>
-        </w:rPr>
-        <w:t>Analyste</w:t>
-      </w:r>
-      <w:proofErr w:type="spellEnd"/>
-      <w:r>
-        <w:rPr>
-          <w:lang w:val="en-US"/>
-        </w:rPr>
-        <w:t>';</w:t>
-      </w:r>
-    </w:p>
-    <w:p>
-      <w:pPr>
-        <w:pStyle w:val="Sansinterligne"/>
-        <w:rPr>
-          <w:lang w:val="en-US"/>
-        </w:rPr>
-      </w:pPr>
-    </w:p>
-    <w:p>
-      <w:pPr>
-        <w:pStyle w:val="Sansinterligne"/>
-        <w:rPr>
-          <w:lang w:val="en-US"/>
-        </w:rPr>
-      </w:pPr>
-      <w:r>
-        <w:rPr>
+          <w:noProof/>
           <w:lang w:val="en-US"/>
         </w:rPr>
         <w:lastRenderedPageBreak/>
@@ -4194,10 +4126,1537 @@
     </w:p>
     <w:p>
       <w:pPr>
+        <w:rPr>
+          <w:lang w:val="en-US"/>
+        </w:rPr>
+      </w:pPr>
+      <w:r>
+        <w:rPr>
+          <w:lang w:val="en-US"/>
+        </w:rPr>
+        <w:br w:type="page"/>
+      </w:r>
+    </w:p>
+    <w:p>
+      <w:pPr>
+        <w:pStyle w:val="Titre3"/>
+        <w:numPr>
+          <w:ilvl w:val="0"/>
+          <w:numId w:val="9"/>
+        </w:numPr>
+      </w:pPr>
+      <w:r>
+        <w:lastRenderedPageBreak/>
+        <w:t>Créer les utilisateurs</w:t>
+      </w:r>
+    </w:p>
+    <w:p>
+      <w:r>
+        <w:t xml:space="preserve">À présent, nous avons les rôles à jour. Nous allons donc créer des utilisateurs, n’ayant pas de spécifications pour les noms et mot de passe de ces derniers, nous allons les définir ici. Tous les mots de passe des utilisateurs correspondent à leur nom. Voici la commande à entrer afin de créer les </w:t>
+      </w:r>
+      <w:proofErr w:type="spellStart"/>
+      <w:r>
+        <w:t>users</w:t>
+      </w:r>
+      <w:proofErr w:type="spellEnd"/>
+      <w:r>
+        <w:t>.</w:t>
+      </w:r>
+    </w:p>
+    <w:p>
+      <w:pPr>
+        <w:pStyle w:val="Sansinterligne"/>
+        <w:rPr>
+          <w:lang w:val="en-US"/>
+        </w:rPr>
+      </w:pPr>
+      <w:r>
+        <w:rPr>
+          <w:lang w:val="en-US"/>
+        </w:rPr>
+        <w:t xml:space="preserve">create user </w:t>
+      </w:r>
+    </w:p>
+    <w:p>
+      <w:pPr>
+        <w:pStyle w:val="Sansinterligne"/>
+        <w:rPr>
+          <w:lang w:val="en-US"/>
+        </w:rPr>
+      </w:pPr>
+      <w:r>
+        <w:rPr>
+          <w:lang w:val="en-US"/>
+        </w:rPr>
+        <w:t>'</w:t>
+      </w:r>
+      <w:proofErr w:type="spellStart"/>
+      <w:r>
+        <w:rPr>
+          <w:lang w:val="en-US"/>
+        </w:rPr>
+        <w:t>Thanoss_Pizza</w:t>
+      </w:r>
+      <w:proofErr w:type="spellEnd"/>
+      <w:r>
+        <w:rPr>
+          <w:lang w:val="en-US"/>
+        </w:rPr>
+        <w:t xml:space="preserve"> </w:t>
+      </w:r>
+      <w:proofErr w:type="spellStart"/>
+      <w:r>
+        <w:rPr>
+          <w:lang w:val="en-US"/>
+        </w:rPr>
+        <w:t>admin</w:t>
+      </w:r>
+      <w:r>
+        <w:rPr>
+          <w:lang w:val="en-US"/>
+        </w:rPr>
+        <w:t>'</w:t>
+      </w:r>
+      <w:r>
+        <w:rPr>
+          <w:lang w:val="en-US"/>
+        </w:rPr>
+        <w:t>@</w:t>
+      </w:r>
+      <w:r>
+        <w:rPr>
+          <w:lang w:val="en-US"/>
+        </w:rPr>
+        <w:t>'</w:t>
+      </w:r>
+      <w:r>
+        <w:rPr>
+          <w:lang w:val="en-US"/>
+        </w:rPr>
+        <w:t>localhost</w:t>
+      </w:r>
+      <w:proofErr w:type="spellEnd"/>
+      <w:r>
+        <w:rPr>
+          <w:lang w:val="en-US"/>
+        </w:rPr>
+        <w:t>'</w:t>
+      </w:r>
+      <w:r>
+        <w:rPr>
+          <w:lang w:val="en-US"/>
+        </w:rPr>
+        <w:t xml:space="preserve"> identified by </w:t>
+      </w:r>
+      <w:r>
+        <w:rPr>
+          <w:lang w:val="en-US"/>
+        </w:rPr>
+        <w:t>'</w:t>
+      </w:r>
+      <w:proofErr w:type="spellStart"/>
+      <w:r>
+        <w:rPr>
+          <w:lang w:val="en-US"/>
+        </w:rPr>
+        <w:t>Thanoss_Pizza</w:t>
+      </w:r>
+      <w:proofErr w:type="spellEnd"/>
+      <w:r>
+        <w:rPr>
+          <w:lang w:val="en-US"/>
+        </w:rPr>
+        <w:t xml:space="preserve"> admin</w:t>
+      </w:r>
+      <w:r>
+        <w:rPr>
+          <w:lang w:val="en-US"/>
+        </w:rPr>
+        <w:t>'</w:t>
+      </w:r>
+      <w:r>
+        <w:rPr>
+          <w:lang w:val="en-US"/>
+        </w:rPr>
+        <w:t>,</w:t>
+      </w:r>
+    </w:p>
+    <w:p>
+      <w:pPr>
+        <w:pStyle w:val="Sansinterligne"/>
+        <w:rPr>
+          <w:lang w:val="en-US"/>
+        </w:rPr>
+      </w:pPr>
+      <w:r>
+        <w:rPr>
+          <w:lang w:val="en-US"/>
+        </w:rPr>
+        <w:t>'</w:t>
+      </w:r>
+      <w:proofErr w:type="spellStart"/>
+      <w:r>
+        <w:rPr>
+          <w:lang w:val="en-US"/>
+        </w:rPr>
+        <w:t>Thanoss_Pizza</w:t>
+      </w:r>
+      <w:proofErr w:type="spellEnd"/>
+      <w:r>
+        <w:rPr>
+          <w:lang w:val="en-US"/>
+        </w:rPr>
+        <w:t xml:space="preserve"> </w:t>
+      </w:r>
+      <w:proofErr w:type="spellStart"/>
+      <w:r>
+        <w:rPr>
+          <w:lang w:val="en-US"/>
+        </w:rPr>
+        <w:t>manager</w:t>
+      </w:r>
+      <w:r>
+        <w:rPr>
+          <w:lang w:val="en-US"/>
+        </w:rPr>
+        <w:t>'</w:t>
+      </w:r>
+      <w:r>
+        <w:rPr>
+          <w:lang w:val="en-US"/>
+        </w:rPr>
+        <w:t>@</w:t>
+      </w:r>
+      <w:r>
+        <w:rPr>
+          <w:lang w:val="en-US"/>
+        </w:rPr>
+        <w:t>'</w:t>
+      </w:r>
+      <w:r>
+        <w:rPr>
+          <w:lang w:val="en-US"/>
+        </w:rPr>
+        <w:t>localhost</w:t>
+      </w:r>
+      <w:proofErr w:type="spellEnd"/>
+      <w:r>
+        <w:rPr>
+          <w:lang w:val="en-US"/>
+        </w:rPr>
+        <w:t>'</w:t>
+      </w:r>
+      <w:r>
+        <w:rPr>
+          <w:lang w:val="en-US"/>
+        </w:rPr>
+        <w:t xml:space="preserve"> identified by </w:t>
+      </w:r>
+      <w:r>
+        <w:rPr>
+          <w:lang w:val="en-US"/>
+        </w:rPr>
+        <w:t>'</w:t>
+      </w:r>
+      <w:proofErr w:type="spellStart"/>
+      <w:r>
+        <w:rPr>
+          <w:lang w:val="en-US"/>
+        </w:rPr>
+        <w:t>Thanoss_Pizza</w:t>
+      </w:r>
+      <w:proofErr w:type="spellEnd"/>
+      <w:r>
+        <w:rPr>
+          <w:lang w:val="en-US"/>
+        </w:rPr>
+        <w:t xml:space="preserve"> </w:t>
+      </w:r>
+      <w:r>
+        <w:rPr>
+          <w:lang w:val="en-US"/>
+        </w:rPr>
+        <w:t>manager</w:t>
+      </w:r>
+      <w:r>
+        <w:rPr>
+          <w:lang w:val="en-US"/>
+        </w:rPr>
+        <w:t>'</w:t>
+      </w:r>
+      <w:r>
+        <w:rPr>
+          <w:lang w:val="en-US"/>
+        </w:rPr>
+        <w:t>,</w:t>
+      </w:r>
+    </w:p>
+    <w:p>
+      <w:pPr>
+        <w:pStyle w:val="Sansinterligne"/>
+        <w:rPr>
+          <w:lang w:val="en-US"/>
+        </w:rPr>
+      </w:pPr>
+      <w:r>
+        <w:rPr>
+          <w:lang w:val="en-US"/>
+        </w:rPr>
+        <w:t>'</w:t>
+      </w:r>
+      <w:proofErr w:type="spellStart"/>
+      <w:r>
+        <w:rPr>
+          <w:lang w:val="en-US"/>
+        </w:rPr>
+        <w:t>Thanoss_Pizza</w:t>
+      </w:r>
+      <w:proofErr w:type="spellEnd"/>
+      <w:r>
+        <w:rPr>
+          <w:lang w:val="en-US"/>
+        </w:rPr>
+        <w:t xml:space="preserve"> </w:t>
+      </w:r>
+      <w:proofErr w:type="spellStart"/>
+      <w:r>
+        <w:rPr>
+          <w:lang w:val="en-US"/>
+        </w:rPr>
+        <w:t>pizzaiolo</w:t>
+      </w:r>
+      <w:r>
+        <w:rPr>
+          <w:lang w:val="en-US"/>
+        </w:rPr>
+        <w:t>'</w:t>
+      </w:r>
+      <w:r>
+        <w:rPr>
+          <w:lang w:val="en-US"/>
+        </w:rPr>
+        <w:t>@</w:t>
+      </w:r>
+      <w:r>
+        <w:rPr>
+          <w:lang w:val="en-US"/>
+        </w:rPr>
+        <w:t>'</w:t>
+      </w:r>
+      <w:r>
+        <w:rPr>
+          <w:lang w:val="en-US"/>
+        </w:rPr>
+        <w:t>localhost</w:t>
+      </w:r>
+      <w:proofErr w:type="spellEnd"/>
+      <w:r>
+        <w:rPr>
+          <w:lang w:val="en-US"/>
+        </w:rPr>
+        <w:t>'</w:t>
+      </w:r>
+      <w:r>
+        <w:rPr>
+          <w:lang w:val="en-US"/>
+        </w:rPr>
+        <w:t xml:space="preserve"> identified by </w:t>
+      </w:r>
+      <w:r>
+        <w:rPr>
+          <w:lang w:val="en-US"/>
+        </w:rPr>
+        <w:t>'</w:t>
+      </w:r>
+      <w:proofErr w:type="spellStart"/>
+      <w:r>
+        <w:rPr>
+          <w:lang w:val="en-US"/>
+        </w:rPr>
+        <w:t>Thanoss_Pizza</w:t>
+      </w:r>
+      <w:proofErr w:type="spellEnd"/>
+      <w:r>
+        <w:rPr>
+          <w:lang w:val="en-US"/>
+        </w:rPr>
+        <w:t xml:space="preserve"> </w:t>
+      </w:r>
+      <w:r>
+        <w:rPr>
+          <w:lang w:val="en-US"/>
+        </w:rPr>
+        <w:t>pizzaiolo</w:t>
+      </w:r>
+      <w:r>
+        <w:rPr>
+          <w:lang w:val="en-US"/>
+        </w:rPr>
+        <w:t>'</w:t>
+      </w:r>
+      <w:r>
+        <w:rPr>
+          <w:lang w:val="en-US"/>
+        </w:rPr>
+        <w:t>,</w:t>
+      </w:r>
+    </w:p>
+    <w:p>
+      <w:pPr>
+        <w:pStyle w:val="Sansinterligne"/>
+        <w:rPr>
+          <w:lang w:val="en-US"/>
+        </w:rPr>
+      </w:pPr>
+      <w:r>
+        <w:rPr>
+          <w:lang w:val="en-US"/>
+        </w:rPr>
+        <w:t>'</w:t>
+      </w:r>
+      <w:proofErr w:type="spellStart"/>
+      <w:r>
+        <w:rPr>
+          <w:lang w:val="en-US"/>
+        </w:rPr>
+        <w:t>Thanoss_Pizza</w:t>
+      </w:r>
+      <w:proofErr w:type="spellEnd"/>
+      <w:r>
+        <w:rPr>
+          <w:lang w:val="en-US"/>
+        </w:rPr>
+        <w:t xml:space="preserve"> </w:t>
+      </w:r>
+      <w:proofErr w:type="spellStart"/>
+      <w:r>
+        <w:rPr>
+          <w:lang w:val="en-US"/>
+        </w:rPr>
+        <w:t>livreur</w:t>
+      </w:r>
+      <w:proofErr w:type="spellEnd"/>
+      <w:r>
+        <w:rPr>
+          <w:lang w:val="en-US"/>
+        </w:rPr>
+        <w:t>'</w:t>
+      </w:r>
+      <w:r>
+        <w:rPr>
+          <w:lang w:val="en-US"/>
+        </w:rPr>
+        <w:t>@</w:t>
+      </w:r>
+      <w:r>
+        <w:rPr>
+          <w:lang w:val="en-US"/>
+        </w:rPr>
+        <w:t>'</w:t>
+      </w:r>
+      <w:r>
+        <w:rPr>
+          <w:lang w:val="en-US"/>
+        </w:rPr>
+        <w:t>localhost</w:t>
+      </w:r>
+      <w:r>
+        <w:rPr>
+          <w:lang w:val="en-US"/>
+        </w:rPr>
+        <w:t>'</w:t>
+      </w:r>
+      <w:r>
+        <w:rPr>
+          <w:lang w:val="en-US"/>
+        </w:rPr>
+        <w:t xml:space="preserve"> identified by </w:t>
+      </w:r>
+      <w:r>
+        <w:rPr>
+          <w:lang w:val="en-US"/>
+        </w:rPr>
+        <w:t>'</w:t>
+      </w:r>
+      <w:proofErr w:type="spellStart"/>
+      <w:r>
+        <w:rPr>
+          <w:lang w:val="en-US"/>
+        </w:rPr>
+        <w:t>Thanoss_Pizza</w:t>
+      </w:r>
+      <w:proofErr w:type="spellEnd"/>
+      <w:r>
+        <w:rPr>
+          <w:lang w:val="en-US"/>
+        </w:rPr>
+        <w:t xml:space="preserve"> </w:t>
+      </w:r>
+      <w:proofErr w:type="spellStart"/>
+      <w:r>
+        <w:rPr>
+          <w:lang w:val="en-US"/>
+        </w:rPr>
+        <w:t>livreur</w:t>
+      </w:r>
+      <w:proofErr w:type="spellEnd"/>
+      <w:r>
+        <w:rPr>
+          <w:lang w:val="en-US"/>
+        </w:rPr>
+        <w:t>'</w:t>
+      </w:r>
+      <w:r>
+        <w:rPr>
+          <w:lang w:val="en-US"/>
+        </w:rPr>
+        <w:t>,</w:t>
+      </w:r>
+    </w:p>
+    <w:p>
+      <w:pPr>
+        <w:pStyle w:val="Sansinterligne"/>
+        <w:rPr>
+          <w:lang w:val="en-US"/>
+        </w:rPr>
+      </w:pPr>
+      <w:r>
+        <w:rPr>
+          <w:lang w:val="en-US"/>
+        </w:rPr>
+        <w:t>'</w:t>
+      </w:r>
+      <w:proofErr w:type="spellStart"/>
+      <w:r>
+        <w:rPr>
+          <w:lang w:val="en-US"/>
+        </w:rPr>
+        <w:t>Thanoss_Pizza</w:t>
+      </w:r>
+      <w:proofErr w:type="spellEnd"/>
+      <w:r>
+        <w:rPr>
+          <w:lang w:val="en-US"/>
+        </w:rPr>
+        <w:t xml:space="preserve"> </w:t>
+      </w:r>
+      <w:r>
+        <w:rPr>
+          <w:lang w:val="en-US"/>
+        </w:rPr>
+        <w:t xml:space="preserve">agent de </w:t>
+      </w:r>
+      <w:proofErr w:type="spellStart"/>
+      <w:r>
+        <w:rPr>
+          <w:lang w:val="en-US"/>
+        </w:rPr>
+        <w:t>caisse</w:t>
+      </w:r>
+      <w:proofErr w:type="spellEnd"/>
+      <w:r>
+        <w:rPr>
+          <w:lang w:val="en-US"/>
+        </w:rPr>
+        <w:t>'</w:t>
+      </w:r>
+      <w:r>
+        <w:rPr>
+          <w:lang w:val="en-US"/>
+        </w:rPr>
+        <w:t>@</w:t>
+      </w:r>
+      <w:r>
+        <w:rPr>
+          <w:lang w:val="en-US"/>
+        </w:rPr>
+        <w:t>'</w:t>
+      </w:r>
+      <w:r>
+        <w:rPr>
+          <w:lang w:val="en-US"/>
+        </w:rPr>
+        <w:t>localhost</w:t>
+      </w:r>
+      <w:r>
+        <w:rPr>
+          <w:lang w:val="en-US"/>
+        </w:rPr>
+        <w:t>'</w:t>
+      </w:r>
+      <w:r>
+        <w:rPr>
+          <w:lang w:val="en-US"/>
+        </w:rPr>
+        <w:t xml:space="preserve"> identified by </w:t>
+      </w:r>
+      <w:r>
+        <w:rPr>
+          <w:lang w:val="en-US"/>
+        </w:rPr>
+        <w:t>'</w:t>
+      </w:r>
+      <w:proofErr w:type="spellStart"/>
+      <w:r>
+        <w:rPr>
+          <w:lang w:val="en-US"/>
+        </w:rPr>
+        <w:t>Thanoss_Pizza</w:t>
+      </w:r>
+      <w:proofErr w:type="spellEnd"/>
+      <w:r>
+        <w:rPr>
+          <w:lang w:val="en-US"/>
+        </w:rPr>
+        <w:t xml:space="preserve"> a</w:t>
+      </w:r>
+      <w:r>
+        <w:rPr>
+          <w:lang w:val="en-US"/>
+        </w:rPr>
+        <w:t xml:space="preserve">gent de </w:t>
+      </w:r>
+      <w:proofErr w:type="spellStart"/>
+      <w:r>
+        <w:rPr>
+          <w:lang w:val="en-US"/>
+        </w:rPr>
+        <w:t>caisse</w:t>
+      </w:r>
+      <w:proofErr w:type="spellEnd"/>
+      <w:r>
+        <w:rPr>
+          <w:lang w:val="en-US"/>
+        </w:rPr>
+        <w:t>'</w:t>
+      </w:r>
+      <w:r>
+        <w:rPr>
+          <w:lang w:val="en-US"/>
+        </w:rPr>
+        <w:t>,</w:t>
+      </w:r>
+    </w:p>
+    <w:p>
+      <w:pPr>
+        <w:rPr>
+          <w:lang w:val="en-US"/>
+        </w:rPr>
+      </w:pPr>
+      <w:r>
+        <w:rPr>
+          <w:lang w:val="en-US"/>
+        </w:rPr>
+        <w:t>'</w:t>
+      </w:r>
+      <w:proofErr w:type="spellStart"/>
+      <w:r>
+        <w:rPr>
+          <w:lang w:val="en-US"/>
+        </w:rPr>
+        <w:t>Thanoss_Pizza</w:t>
+      </w:r>
+      <w:proofErr w:type="spellEnd"/>
+      <w:r>
+        <w:rPr>
+          <w:lang w:val="en-US"/>
+        </w:rPr>
+        <w:t xml:space="preserve"> </w:t>
+      </w:r>
+      <w:proofErr w:type="spellStart"/>
+      <w:r>
+        <w:rPr>
+          <w:lang w:val="en-US"/>
+        </w:rPr>
+        <w:t>analyste</w:t>
+      </w:r>
+      <w:proofErr w:type="spellEnd"/>
+      <w:r>
+        <w:rPr>
+          <w:lang w:val="en-US"/>
+        </w:rPr>
+        <w:t>'</w:t>
+      </w:r>
+      <w:r>
+        <w:rPr>
+          <w:lang w:val="en-US"/>
+        </w:rPr>
+        <w:t>@</w:t>
+      </w:r>
+      <w:r>
+        <w:rPr>
+          <w:lang w:val="en-US"/>
+        </w:rPr>
+        <w:t>'</w:t>
+      </w:r>
+      <w:r>
+        <w:rPr>
+          <w:lang w:val="en-US"/>
+        </w:rPr>
+        <w:t>localhost</w:t>
+      </w:r>
+      <w:r>
+        <w:rPr>
+          <w:lang w:val="en-US"/>
+        </w:rPr>
+        <w:t>'</w:t>
+      </w:r>
+      <w:r>
+        <w:rPr>
+          <w:lang w:val="en-US"/>
+        </w:rPr>
+        <w:t xml:space="preserve"> identified by </w:t>
+      </w:r>
+      <w:r>
+        <w:rPr>
+          <w:lang w:val="en-US"/>
+        </w:rPr>
+        <w:t>'</w:t>
+      </w:r>
+      <w:proofErr w:type="spellStart"/>
+      <w:r>
+        <w:rPr>
+          <w:lang w:val="en-US"/>
+        </w:rPr>
+        <w:t>Thanoss_Pizza</w:t>
+      </w:r>
+      <w:proofErr w:type="spellEnd"/>
+      <w:r>
+        <w:rPr>
+          <w:lang w:val="en-US"/>
+        </w:rPr>
+        <w:t xml:space="preserve"> </w:t>
+      </w:r>
+      <w:proofErr w:type="spellStart"/>
+      <w:r>
+        <w:rPr>
+          <w:lang w:val="en-US"/>
+        </w:rPr>
+        <w:t>a</w:t>
+      </w:r>
+      <w:r>
+        <w:rPr>
+          <w:lang w:val="en-US"/>
+        </w:rPr>
+        <w:t>nalyste</w:t>
+      </w:r>
+      <w:proofErr w:type="spellEnd"/>
+      <w:proofErr w:type="gramStart"/>
+      <w:r>
+        <w:rPr>
+          <w:lang w:val="en-US"/>
+        </w:rPr>
+        <w:t>'</w:t>
+      </w:r>
+      <w:r>
+        <w:rPr>
+          <w:lang w:val="en-US"/>
+        </w:rPr>
+        <w:t>;</w:t>
+      </w:r>
+      <w:proofErr w:type="gramEnd"/>
+    </w:p>
+    <w:p>
+      <w:r>
+        <w:t xml:space="preserve">Vérifions que la </w:t>
+      </w:r>
+      <w:proofErr w:type="spellStart"/>
+      <w:r>
+        <w:t>creation</w:t>
+      </w:r>
+      <w:proofErr w:type="spellEnd"/>
+      <w:r>
+        <w:t xml:space="preserve"> s’est bien déroulée :</w:t>
+      </w:r>
+    </w:p>
+    <w:p>
+      <w:pPr>
+        <w:pStyle w:val="Sansinterligne"/>
+      </w:pPr>
+      <w:r>
+        <w:t>-- la commande</w:t>
+      </w:r>
+    </w:p>
+    <w:p>
+      <w:pPr>
+        <w:pStyle w:val="Sansinterligne"/>
+      </w:pPr>
+      <w:proofErr w:type="gramStart"/>
+      <w:r>
+        <w:t>use</w:t>
+      </w:r>
+      <w:proofErr w:type="gramEnd"/>
+      <w:r>
+        <w:t xml:space="preserve"> </w:t>
+      </w:r>
+      <w:proofErr w:type="spellStart"/>
+      <w:r>
+        <w:t>mysql</w:t>
+      </w:r>
+      <w:proofErr w:type="spellEnd"/>
+      <w:r>
+        <w:t> ;</w:t>
+      </w:r>
+    </w:p>
+    <w:p>
+      <w:pPr>
+        <w:rPr>
+          <w:lang w:val="en-US"/>
+        </w:rPr>
+      </w:pPr>
+      <w:r>
+        <w:rPr>
+          <w:lang w:val="en-US"/>
+        </w:rPr>
+        <w:t xml:space="preserve">select User, host from </w:t>
+      </w:r>
+      <w:proofErr w:type="gramStart"/>
+      <w:r>
+        <w:rPr>
+          <w:lang w:val="en-US"/>
+        </w:rPr>
+        <w:t>user;</w:t>
+      </w:r>
+      <w:proofErr w:type="gramEnd"/>
+    </w:p>
+    <w:p>
+      <w:pPr>
+        <w:rPr>
+          <w:lang w:val="en-US"/>
+        </w:rPr>
+      </w:pPr>
+      <w:r>
+        <w:rPr>
+          <w:lang w:val="en-US"/>
+        </w:rPr>
+        <w:drawing>
+          <wp:inline distT="0" distB="0" distL="0" distR="0" wp14:anchorId="6CECE895" wp14:editId="57A38F11">
+            <wp:extent cx="3248478" cy="952633"/>
+            <wp:effectExtent l="0" t="0" r="0" b="0"/>
+            <wp:docPr id="963299010" name="Image 1"/>
+            <wp:cNvGraphicFramePr>
+              <a:graphicFrameLocks xmlns:a="http://schemas.openxmlformats.org/drawingml/2006/main" noChangeAspect="1"/>
+            </wp:cNvGraphicFramePr>
+            <a:graphic xmlns:a="http://schemas.openxmlformats.org/drawingml/2006/main">
+              <a:graphicData uri="http://schemas.openxmlformats.org/drawingml/2006/picture">
+                <pic:pic xmlns:pic="http://schemas.openxmlformats.org/drawingml/2006/picture">
+                  <pic:nvPicPr>
+                    <pic:cNvPr id="963299010" name=""/>
+                    <pic:cNvPicPr/>
+                  </pic:nvPicPr>
+                  <pic:blipFill>
+                    <a:blip r:embed="rId9"/>
+                    <a:stretch>
+                      <a:fillRect/>
+                    </a:stretch>
+                  </pic:blipFill>
+                  <pic:spPr>
+                    <a:xfrm>
+                      <a:off x="0" y="0"/>
+                      <a:ext cx="3248478" cy="952633"/>
+                    </a:xfrm>
+                    <a:prstGeom prst="rect">
+                      <a:avLst/>
+                    </a:prstGeom>
+                  </pic:spPr>
+                </pic:pic>
+              </a:graphicData>
+            </a:graphic>
+          </wp:inline>
+        </w:drawing>
+      </w:r>
+    </w:p>
+    <w:p>
+      <w:pPr>
+        <w:pStyle w:val="Titre3"/>
+        <w:numPr>
+          <w:ilvl w:val="0"/>
+          <w:numId w:val="9"/>
+        </w:numPr>
+      </w:pPr>
+      <w:r>
+        <w:t>Attribuer les rôles aux u</w:t>
+      </w:r>
+      <w:r>
+        <w:t>tilisateurs</w:t>
+      </w:r>
+    </w:p>
+    <w:p>
+      <w:r>
+        <w:t>Finalement, nous allons donner un rôle à chaque utilisateur, voici les commandes :</w:t>
+      </w:r>
+    </w:p>
+    <w:p>
+      <w:pPr>
+        <w:pStyle w:val="Sansinterligne"/>
+      </w:pPr>
+      <w:r>
+        <w:t>-- administrateur</w:t>
+      </w:r>
+    </w:p>
+    <w:p>
+      <w:pPr>
+        <w:pStyle w:val="Sansinterligne"/>
+        <w:rPr>
+          <w:lang w:val="en-US"/>
+        </w:rPr>
+      </w:pPr>
+      <w:r>
+        <w:rPr>
+          <w:lang w:val="en-US"/>
+        </w:rPr>
+        <w:t xml:space="preserve">grant </w:t>
+      </w:r>
+      <w:r>
+        <w:rPr>
+          <w:lang w:val="en-US"/>
+        </w:rPr>
+        <w:t>'Administrateur'</w:t>
+      </w:r>
+      <w:r>
+        <w:rPr>
+          <w:lang w:val="en-US"/>
+        </w:rPr>
+        <w:t xml:space="preserve"> to </w:t>
+      </w:r>
+      <w:r>
+        <w:rPr>
+          <w:lang w:val="en-US"/>
+        </w:rPr>
+        <w:t>'</w:t>
+      </w:r>
+      <w:proofErr w:type="spellStart"/>
+      <w:r>
+        <w:rPr>
+          <w:lang w:val="en-US"/>
+        </w:rPr>
+        <w:t>Thanoss_Pizza</w:t>
+      </w:r>
+      <w:proofErr w:type="spellEnd"/>
+      <w:r>
+        <w:rPr>
+          <w:lang w:val="en-US"/>
+        </w:rPr>
+        <w:t xml:space="preserve"> </w:t>
+      </w:r>
+      <w:proofErr w:type="spellStart"/>
+      <w:r>
+        <w:rPr>
+          <w:lang w:val="en-US"/>
+        </w:rPr>
+        <w:t>a</w:t>
+      </w:r>
+      <w:r>
+        <w:rPr>
+          <w:lang w:val="en-US"/>
+        </w:rPr>
+        <w:t>dmin'</w:t>
+      </w:r>
+      <w:r>
+        <w:rPr>
+          <w:lang w:val="en-US"/>
+        </w:rPr>
+        <w:t>@</w:t>
+      </w:r>
+      <w:r>
+        <w:rPr>
+          <w:lang w:val="en-US"/>
+        </w:rPr>
+        <w:t>'</w:t>
+      </w:r>
+      <w:r>
+        <w:rPr>
+          <w:lang w:val="en-US"/>
+        </w:rPr>
+        <w:t>localhost</w:t>
+      </w:r>
+      <w:proofErr w:type="spellEnd"/>
+      <w:proofErr w:type="gramStart"/>
+      <w:r>
+        <w:rPr>
+          <w:lang w:val="en-US"/>
+        </w:rPr>
+        <w:t>'</w:t>
+      </w:r>
+      <w:r>
+        <w:rPr>
+          <w:lang w:val="en-US"/>
+        </w:rPr>
+        <w:t>;</w:t>
+      </w:r>
+      <w:proofErr w:type="gramEnd"/>
+    </w:p>
+    <w:p>
+      <w:pPr>
+        <w:pStyle w:val="Sansinterligne"/>
+        <w:rPr>
+          <w:lang w:val="en-US"/>
+        </w:rPr>
+      </w:pPr>
+      <w:r>
+        <w:rPr>
+          <w:lang w:val="en-US"/>
+        </w:rPr>
+        <w:t>-- manager</w:t>
+      </w:r>
+    </w:p>
+    <w:p>
+      <w:pPr>
+        <w:pStyle w:val="Sansinterligne"/>
+        <w:rPr>
+          <w:lang w:val="en-US"/>
+        </w:rPr>
+      </w:pPr>
+      <w:r>
+        <w:rPr>
+          <w:lang w:val="en-US"/>
+        </w:rPr>
+        <w:t xml:space="preserve">grant </w:t>
+      </w:r>
+      <w:r>
+        <w:rPr>
+          <w:lang w:val="en-US"/>
+        </w:rPr>
+        <w:t>'</w:t>
+      </w:r>
+      <w:r>
+        <w:rPr>
+          <w:lang w:val="en-US"/>
+        </w:rPr>
+        <w:t>Manager</w:t>
+      </w:r>
+      <w:r>
+        <w:rPr>
+          <w:lang w:val="en-US"/>
+        </w:rPr>
+        <w:t>'</w:t>
+      </w:r>
+      <w:r>
+        <w:rPr>
+          <w:lang w:val="en-US"/>
+        </w:rPr>
+        <w:t xml:space="preserve"> to </w:t>
+      </w:r>
+      <w:r>
+        <w:rPr>
+          <w:lang w:val="en-US"/>
+        </w:rPr>
+        <w:t>'</w:t>
+      </w:r>
+      <w:proofErr w:type="spellStart"/>
+      <w:r>
+        <w:rPr>
+          <w:lang w:val="en-US"/>
+        </w:rPr>
+        <w:t>Thanoss_Pizza</w:t>
+      </w:r>
+      <w:proofErr w:type="spellEnd"/>
+      <w:r>
+        <w:rPr>
+          <w:lang w:val="en-US"/>
+        </w:rPr>
+        <w:t xml:space="preserve"> </w:t>
+      </w:r>
+      <w:proofErr w:type="spellStart"/>
+      <w:r>
+        <w:rPr>
+          <w:lang w:val="en-US"/>
+        </w:rPr>
+        <w:t>manager</w:t>
+      </w:r>
+      <w:r>
+        <w:rPr>
+          <w:lang w:val="en-US"/>
+        </w:rPr>
+        <w:t>'</w:t>
+      </w:r>
+      <w:r>
+        <w:rPr>
+          <w:lang w:val="en-US"/>
+        </w:rPr>
+        <w:t>@</w:t>
+      </w:r>
+      <w:r>
+        <w:rPr>
+          <w:lang w:val="en-US"/>
+        </w:rPr>
+        <w:t>'</w:t>
+      </w:r>
+      <w:r>
+        <w:rPr>
+          <w:lang w:val="en-US"/>
+        </w:rPr>
+        <w:t>localhost</w:t>
+      </w:r>
+      <w:proofErr w:type="spellEnd"/>
+      <w:proofErr w:type="gramStart"/>
+      <w:r>
+        <w:rPr>
+          <w:lang w:val="en-US"/>
+        </w:rPr>
+        <w:t>'</w:t>
+      </w:r>
+      <w:r>
+        <w:rPr>
+          <w:lang w:val="en-US"/>
+        </w:rPr>
+        <w:t>;</w:t>
+      </w:r>
+      <w:proofErr w:type="gramEnd"/>
+    </w:p>
+    <w:p>
+      <w:pPr>
+        <w:pStyle w:val="Sansinterligne"/>
+        <w:rPr>
+          <w:lang w:val="en-US"/>
+        </w:rPr>
+      </w:pPr>
+      <w:r>
+        <w:rPr>
+          <w:lang w:val="en-US"/>
+        </w:rPr>
+        <w:t>-- pizzaiolo</w:t>
+      </w:r>
+    </w:p>
+    <w:p>
+      <w:pPr>
+        <w:pStyle w:val="Sansinterligne"/>
+        <w:rPr>
+          <w:lang w:val="en-US"/>
+        </w:rPr>
+      </w:pPr>
+      <w:r>
+        <w:rPr>
+          <w:lang w:val="en-US"/>
+        </w:rPr>
+        <w:t xml:space="preserve">grant </w:t>
+      </w:r>
+      <w:r>
+        <w:rPr>
+          <w:lang w:val="en-US"/>
+        </w:rPr>
+        <w:t>'</w:t>
+      </w:r>
+      <w:r>
+        <w:rPr>
+          <w:lang w:val="en-US"/>
+        </w:rPr>
+        <w:t>Pizzaiolo</w:t>
+      </w:r>
+      <w:r>
+        <w:rPr>
+          <w:lang w:val="en-US"/>
+        </w:rPr>
+        <w:t>'</w:t>
+      </w:r>
+      <w:r>
+        <w:rPr>
+          <w:lang w:val="en-US"/>
+        </w:rPr>
+        <w:t xml:space="preserve"> to </w:t>
+      </w:r>
+      <w:r>
+        <w:rPr>
+          <w:lang w:val="en-US"/>
+        </w:rPr>
+        <w:t>'</w:t>
+      </w:r>
+      <w:proofErr w:type="spellStart"/>
+      <w:r>
+        <w:rPr>
+          <w:lang w:val="en-US"/>
+        </w:rPr>
+        <w:t>Thanoss_Pizza</w:t>
+      </w:r>
+      <w:proofErr w:type="spellEnd"/>
+      <w:r>
+        <w:rPr>
+          <w:lang w:val="en-US"/>
+        </w:rPr>
+        <w:t xml:space="preserve"> </w:t>
+      </w:r>
+      <w:proofErr w:type="spellStart"/>
+      <w:r>
+        <w:rPr>
+          <w:lang w:val="en-US"/>
+        </w:rPr>
+        <w:t>pizzaiolo</w:t>
+      </w:r>
+      <w:r>
+        <w:rPr>
+          <w:lang w:val="en-US"/>
+        </w:rPr>
+        <w:t>'</w:t>
+      </w:r>
+      <w:r>
+        <w:rPr>
+          <w:lang w:val="en-US"/>
+        </w:rPr>
+        <w:t>@</w:t>
+      </w:r>
+      <w:r>
+        <w:rPr>
+          <w:lang w:val="en-US"/>
+        </w:rPr>
+        <w:t>'</w:t>
+      </w:r>
+      <w:r>
+        <w:rPr>
+          <w:lang w:val="en-US"/>
+        </w:rPr>
+        <w:t>localhost</w:t>
+      </w:r>
+      <w:proofErr w:type="spellEnd"/>
+      <w:proofErr w:type="gramStart"/>
+      <w:r>
+        <w:rPr>
+          <w:lang w:val="en-US"/>
+        </w:rPr>
+        <w:t>'</w:t>
+      </w:r>
+      <w:r>
+        <w:rPr>
+          <w:lang w:val="en-US"/>
+        </w:rPr>
+        <w:t>;</w:t>
+      </w:r>
+      <w:proofErr w:type="gramEnd"/>
+    </w:p>
+    <w:p>
+      <w:pPr>
+        <w:pStyle w:val="Sansinterligne"/>
+        <w:rPr>
+          <w:lang w:val="en-US"/>
+        </w:rPr>
+      </w:pPr>
+      <w:r>
+        <w:rPr>
+          <w:lang w:val="en-US"/>
+        </w:rPr>
+        <w:t xml:space="preserve">-- </w:t>
+      </w:r>
+      <w:proofErr w:type="spellStart"/>
+      <w:r>
+        <w:rPr>
+          <w:lang w:val="en-US"/>
+        </w:rPr>
+        <w:t>livreur</w:t>
+      </w:r>
+      <w:proofErr w:type="spellEnd"/>
+    </w:p>
+    <w:p>
+      <w:pPr>
+        <w:pStyle w:val="Sansinterligne"/>
+        <w:rPr>
+          <w:lang w:val="en-US"/>
+        </w:rPr>
+      </w:pPr>
+      <w:r>
+        <w:rPr>
+          <w:lang w:val="en-US"/>
+        </w:rPr>
+        <w:t xml:space="preserve">grant </w:t>
+      </w:r>
+      <w:r>
+        <w:rPr>
+          <w:lang w:val="en-US"/>
+        </w:rPr>
+        <w:t>'</w:t>
+      </w:r>
+      <w:proofErr w:type="spellStart"/>
+      <w:r>
+        <w:rPr>
+          <w:lang w:val="en-US"/>
+        </w:rPr>
+        <w:t>Livreur</w:t>
+      </w:r>
+      <w:proofErr w:type="spellEnd"/>
+      <w:r>
+        <w:rPr>
+          <w:lang w:val="en-US"/>
+        </w:rPr>
+        <w:t>'</w:t>
+      </w:r>
+      <w:r>
+        <w:rPr>
+          <w:lang w:val="en-US"/>
+        </w:rPr>
+        <w:t xml:space="preserve"> to </w:t>
+      </w:r>
+      <w:r>
+        <w:rPr>
+          <w:lang w:val="en-US"/>
+        </w:rPr>
+        <w:t>'</w:t>
+      </w:r>
+      <w:proofErr w:type="spellStart"/>
+      <w:r>
+        <w:rPr>
+          <w:lang w:val="en-US"/>
+        </w:rPr>
+        <w:t>Thanoss_Pizza</w:t>
+      </w:r>
+      <w:proofErr w:type="spellEnd"/>
+      <w:r>
+        <w:rPr>
+          <w:lang w:val="en-US"/>
+        </w:rPr>
+        <w:t xml:space="preserve"> </w:t>
+      </w:r>
+      <w:proofErr w:type="spellStart"/>
+      <w:r>
+        <w:rPr>
+          <w:lang w:val="en-US"/>
+        </w:rPr>
+        <w:t>livreur</w:t>
+      </w:r>
+      <w:proofErr w:type="spellEnd"/>
+      <w:r>
+        <w:rPr>
+          <w:lang w:val="en-US"/>
+        </w:rPr>
+        <w:t>'</w:t>
+      </w:r>
+      <w:r>
+        <w:rPr>
+          <w:lang w:val="en-US"/>
+        </w:rPr>
+        <w:t>@</w:t>
+      </w:r>
+      <w:r>
+        <w:rPr>
+          <w:lang w:val="en-US"/>
+        </w:rPr>
+        <w:t>'</w:t>
+      </w:r>
+      <w:r>
+        <w:rPr>
+          <w:lang w:val="en-US"/>
+        </w:rPr>
+        <w:t>localhost</w:t>
+      </w:r>
+      <w:proofErr w:type="gramStart"/>
+      <w:r>
+        <w:rPr>
+          <w:lang w:val="en-US"/>
+        </w:rPr>
+        <w:t>'</w:t>
+      </w:r>
+      <w:r>
+        <w:rPr>
+          <w:lang w:val="en-US"/>
+        </w:rPr>
+        <w:t>;</w:t>
+      </w:r>
+      <w:proofErr w:type="gramEnd"/>
+    </w:p>
+    <w:p>
+      <w:pPr>
+        <w:pStyle w:val="Sansinterligne"/>
+      </w:pPr>
+      <w:r>
+        <w:t>-- agent de</w:t>
+      </w:r>
+      <w:r>
+        <w:t xml:space="preserve"> caisse</w:t>
+      </w:r>
+    </w:p>
+    <w:p>
+      <w:pPr>
+        <w:pStyle w:val="Sansinterligne"/>
+      </w:pPr>
+      <w:proofErr w:type="spellStart"/>
+      <w:proofErr w:type="gramStart"/>
+      <w:r>
+        <w:t>grant</w:t>
+      </w:r>
+      <w:proofErr w:type="spellEnd"/>
+      <w:proofErr w:type="gramEnd"/>
+      <w:r>
+        <w:t xml:space="preserve"> 'A</w:t>
+      </w:r>
+      <w:r>
+        <w:t>gent de caisse</w:t>
+      </w:r>
+      <w:r>
+        <w:t>' to '</w:t>
+      </w:r>
+      <w:proofErr w:type="spellStart"/>
+      <w:r>
+        <w:t>Thanoss_Pizza</w:t>
+      </w:r>
+      <w:proofErr w:type="spellEnd"/>
+      <w:r>
+        <w:t xml:space="preserve"> </w:t>
+      </w:r>
+      <w:r>
+        <w:t xml:space="preserve">agent de </w:t>
+      </w:r>
+      <w:proofErr w:type="spellStart"/>
+      <w:r>
+        <w:t>caisse</w:t>
+      </w:r>
+      <w:r>
+        <w:t>'@'localhost</w:t>
+      </w:r>
+      <w:proofErr w:type="spellEnd"/>
+      <w:r>
+        <w:t>';</w:t>
+      </w:r>
+    </w:p>
+    <w:p>
+      <w:pPr>
+        <w:pStyle w:val="Sansinterligne"/>
+        <w:rPr>
+          <w:lang w:val="en-US"/>
+        </w:rPr>
+      </w:pPr>
+      <w:r>
+        <w:rPr>
+          <w:lang w:val="en-US"/>
+        </w:rPr>
+        <w:t xml:space="preserve">-- </w:t>
+      </w:r>
+      <w:proofErr w:type="spellStart"/>
+      <w:r>
+        <w:rPr>
+          <w:lang w:val="en-US"/>
+        </w:rPr>
+        <w:t>analyste</w:t>
+      </w:r>
+      <w:proofErr w:type="spellEnd"/>
+    </w:p>
+    <w:p>
+      <w:pPr>
+        <w:pStyle w:val="Sansinterligne"/>
+        <w:rPr>
+          <w:lang w:val="en-US"/>
+        </w:rPr>
+      </w:pPr>
+      <w:r>
+        <w:rPr>
+          <w:lang w:val="en-US"/>
+        </w:rPr>
+        <w:t xml:space="preserve">grant </w:t>
+      </w:r>
+      <w:r>
+        <w:rPr>
+          <w:lang w:val="en-US"/>
+        </w:rPr>
+        <w:t>'</w:t>
+      </w:r>
+      <w:proofErr w:type="spellStart"/>
+      <w:r>
+        <w:rPr>
+          <w:lang w:val="en-US"/>
+        </w:rPr>
+        <w:t>A</w:t>
+      </w:r>
+      <w:r>
+        <w:rPr>
+          <w:lang w:val="en-US"/>
+        </w:rPr>
+        <w:t>nalyste</w:t>
+      </w:r>
+      <w:proofErr w:type="spellEnd"/>
+      <w:r>
+        <w:rPr>
+          <w:lang w:val="en-US"/>
+        </w:rPr>
+        <w:t>'</w:t>
+      </w:r>
+      <w:r>
+        <w:rPr>
+          <w:lang w:val="en-US"/>
+        </w:rPr>
+        <w:t xml:space="preserve"> to </w:t>
+      </w:r>
+      <w:r>
+        <w:rPr>
+          <w:lang w:val="en-US"/>
+        </w:rPr>
+        <w:t>'</w:t>
+      </w:r>
+      <w:proofErr w:type="spellStart"/>
+      <w:r>
+        <w:rPr>
+          <w:lang w:val="en-US"/>
+        </w:rPr>
+        <w:t>Thanoss_Pizza</w:t>
+      </w:r>
+      <w:proofErr w:type="spellEnd"/>
+      <w:r>
+        <w:rPr>
+          <w:lang w:val="en-US"/>
+        </w:rPr>
+        <w:t xml:space="preserve"> </w:t>
+      </w:r>
+      <w:proofErr w:type="spellStart"/>
+      <w:r>
+        <w:rPr>
+          <w:lang w:val="en-US"/>
+        </w:rPr>
+        <w:t>analyste</w:t>
+      </w:r>
+      <w:proofErr w:type="spellEnd"/>
+      <w:r>
+        <w:rPr>
+          <w:lang w:val="en-US"/>
+        </w:rPr>
+        <w:t>'</w:t>
+      </w:r>
+      <w:r>
+        <w:rPr>
+          <w:lang w:val="en-US"/>
+        </w:rPr>
+        <w:t>@</w:t>
+      </w:r>
+      <w:r>
+        <w:rPr>
+          <w:lang w:val="en-US"/>
+        </w:rPr>
+        <w:t>'</w:t>
+      </w:r>
+      <w:r>
+        <w:rPr>
+          <w:lang w:val="en-US"/>
+        </w:rPr>
+        <w:t>localhost</w:t>
+      </w:r>
+      <w:proofErr w:type="gramStart"/>
+      <w:r>
+        <w:rPr>
+          <w:lang w:val="en-US"/>
+        </w:rPr>
+        <w:t>'</w:t>
+      </w:r>
+      <w:r>
+        <w:rPr>
+          <w:lang w:val="en-US"/>
+        </w:rPr>
+        <w:t>;</w:t>
+      </w:r>
+      <w:proofErr w:type="gramEnd"/>
+    </w:p>
+    <w:p>
+      <w:pPr>
+        <w:rPr>
+          <w:lang w:val="en-US"/>
+        </w:rPr>
+      </w:pPr>
+    </w:p>
+    <w:p>
+      <w:pPr>
         <w:pStyle w:val="Titre2"/>
+        <w:rPr>
+          <w:lang w:val="en-US"/>
+        </w:rPr>
       </w:pPr>
       <w:bookmarkStart w:id="4" w:name="_Toc210392961"/>
       <w:r>
+        <w:rPr>
+          <w:lang w:val="en-US"/>
+        </w:rPr>
         <w:lastRenderedPageBreak/>
         <w:t>Conclusion</w:t>
       </w:r>
@@ -4224,8 +5683,8 @@
       <w:bookmarkEnd w:id="6"/>
     </w:p>
     <w:sectPr>
-      <w:headerReference w:type="default" r:id="rId9"/>
-      <w:footerReference w:type="default" r:id="rId10"/>
+      <w:headerReference w:type="default" r:id="rId10"/>
+      <w:footerReference w:type="default" r:id="rId11"/>
       <w:pgSz w:w="11906" w:h="16838"/>
       <w:pgMar w:top="1417" w:right="1417" w:bottom="1417" w:left="1417" w:header="708" w:footer="708" w:gutter="0"/>
       <w:cols w:space="708"/>

</xml_diff>

<commit_message>
doc(rapport, chapitre users, partie 5 -> assignation des rôles) : fix
ajout de set default role
</commit_message>
<xml_diff>
--- a/R106-JonJunod-ThanosPizza.docx
+++ b/R106-JonJunod-ThanosPizza.docx
@@ -2774,30 +2774,35 @@
     <w:p>
       <w:pPr>
         <w:pStyle w:val="Sansinterligne"/>
-      </w:pPr>
-      <w:proofErr w:type="spellStart"/>
+        <w:rPr>
+          <w:lang w:val="en-US"/>
+        </w:rPr>
+      </w:pPr>
+      <w:r>
+        <w:rPr>
+          <w:lang w:val="en-US"/>
+        </w:rPr>
+        <w:t>grant all privileges on db_Thanoss_</w:t>
+      </w:r>
       <w:proofErr w:type="gramStart"/>
       <w:r>
-        <w:t>grant</w:t>
-      </w:r>
-      <w:proofErr w:type="spellEnd"/>
+        <w:rPr>
+          <w:lang w:val="en-US"/>
+        </w:rPr>
+        <w:t>Pizza.</w:t>
+      </w:r>
+      <w:r>
+        <w:rPr>
+          <w:lang w:val="en-US"/>
+        </w:rPr>
+        <w:t>*</w:t>
+      </w:r>
       <w:proofErr w:type="gramEnd"/>
       <w:r>
-        <w:t xml:space="preserve"> all </w:t>
-      </w:r>
-      <w:proofErr w:type="spellStart"/>
-      <w:r>
-        <w:t>privileges</w:t>
-      </w:r>
-      <w:proofErr w:type="spellEnd"/>
-      <w:r>
-        <w:t xml:space="preserve"> on db_Thanoss_</w:t>
-      </w:r>
-      <w:r>
-        <w:t>Pizza.</w:t>
-      </w:r>
-      <w:r>
-        <w:t>* to 'Administrateur';</w:t>
+        <w:rPr>
+          <w:lang w:val="en-US"/>
+        </w:rPr>
+        <w:t xml:space="preserve"> to 'Administrateur';</w:t>
       </w:r>
     </w:p>
     <w:p>
@@ -4370,13 +4375,111 @@
         <w:rPr>
           <w:lang w:val="en-US"/>
         </w:rPr>
+        <w:t xml:space="preserve"> manager</w:t>
+      </w:r>
+      <w:r>
+        <w:rPr>
+          <w:lang w:val="en-US"/>
+        </w:rPr>
+        <w:t>'</w:t>
+      </w:r>
+      <w:r>
+        <w:rPr>
+          <w:lang w:val="en-US"/>
+        </w:rPr>
+        <w:t>,</w:t>
+      </w:r>
+    </w:p>
+    <w:p>
+      <w:pPr>
+        <w:pStyle w:val="Sansinterligne"/>
+        <w:rPr>
+          <w:lang w:val="en-US"/>
+        </w:rPr>
+      </w:pPr>
+      <w:r>
+        <w:rPr>
+          <w:lang w:val="en-US"/>
+        </w:rPr>
+        <w:t>'</w:t>
+      </w:r>
+      <w:proofErr w:type="spellStart"/>
+      <w:r>
+        <w:rPr>
+          <w:lang w:val="en-US"/>
+        </w:rPr>
+        <w:t>Thanoss_Pizza</w:t>
+      </w:r>
+      <w:proofErr w:type="spellEnd"/>
+      <w:r>
+        <w:rPr>
+          <w:lang w:val="en-US"/>
+        </w:rPr>
         <w:t xml:space="preserve"> </w:t>
       </w:r>
-      <w:r>
-        <w:rPr>
-          <w:lang w:val="en-US"/>
-        </w:rPr>
-        <w:t>manager</w:t>
+      <w:proofErr w:type="spellStart"/>
+      <w:r>
+        <w:rPr>
+          <w:lang w:val="en-US"/>
+        </w:rPr>
+        <w:t>pizzaiolo</w:t>
+      </w:r>
+      <w:r>
+        <w:rPr>
+          <w:lang w:val="en-US"/>
+        </w:rPr>
+        <w:t>'</w:t>
+      </w:r>
+      <w:r>
+        <w:rPr>
+          <w:lang w:val="en-US"/>
+        </w:rPr>
+        <w:t>@</w:t>
+      </w:r>
+      <w:r>
+        <w:rPr>
+          <w:lang w:val="en-US"/>
+        </w:rPr>
+        <w:t>'</w:t>
+      </w:r>
+      <w:r>
+        <w:rPr>
+          <w:lang w:val="en-US"/>
+        </w:rPr>
+        <w:t>localhost</w:t>
+      </w:r>
+      <w:proofErr w:type="spellEnd"/>
+      <w:r>
+        <w:rPr>
+          <w:lang w:val="en-US"/>
+        </w:rPr>
+        <w:t>'</w:t>
+      </w:r>
+      <w:r>
+        <w:rPr>
+          <w:lang w:val="en-US"/>
+        </w:rPr>
+        <w:t xml:space="preserve"> identified by </w:t>
+      </w:r>
+      <w:r>
+        <w:rPr>
+          <w:lang w:val="en-US"/>
+        </w:rPr>
+        <w:t>'</w:t>
+      </w:r>
+      <w:proofErr w:type="spellStart"/>
+      <w:r>
+        <w:rPr>
+          <w:lang w:val="en-US"/>
+        </w:rPr>
+        <w:t>Thanoss_Pizza</w:t>
+      </w:r>
+      <w:proofErr w:type="spellEnd"/>
+      <w:r>
+        <w:rPr>
+          <w:lang w:val="en-US"/>
+        </w:rPr>
+        <w:t xml:space="preserve"> pizzaiolo</w:t>
       </w:r>
       <w:r>
         <w:rPr>
@@ -4423,8 +4526,9 @@
         <w:rPr>
           <w:lang w:val="en-US"/>
         </w:rPr>
-        <w:t>pizzaiolo</w:t>
-      </w:r>
+        <w:t>livreur</w:t>
+      </w:r>
+      <w:proofErr w:type="spellEnd"/>
       <w:r>
         <w:rPr>
           <w:lang w:val="en-US"/>
@@ -4449,7 +4553,6 @@
         </w:rPr>
         <w:t>localhost</w:t>
       </w:r>
-      <w:proofErr w:type="spellEnd"/>
       <w:r>
         <w:rPr>
           <w:lang w:val="en-US"/>
@@ -4482,12 +4585,14 @@
         </w:rPr>
         <w:t xml:space="preserve"> </w:t>
       </w:r>
-      <w:r>
-        <w:rPr>
-          <w:lang w:val="en-US"/>
-        </w:rPr>
-        <w:t>pizzaiolo</w:t>
-      </w:r>
+      <w:proofErr w:type="spellStart"/>
+      <w:r>
+        <w:rPr>
+          <w:lang w:val="en-US"/>
+        </w:rPr>
+        <w:t>livreur</w:t>
+      </w:r>
+      <w:proofErr w:type="spellEnd"/>
       <w:r>
         <w:rPr>
           <w:lang w:val="en-US"/>
@@ -4526,6 +4631,117 @@
         <w:rPr>
           <w:lang w:val="en-US"/>
         </w:rPr>
+        <w:t xml:space="preserve"> agent de </w:t>
+      </w:r>
+      <w:proofErr w:type="spellStart"/>
+      <w:r>
+        <w:rPr>
+          <w:lang w:val="en-US"/>
+        </w:rPr>
+        <w:t>caisse</w:t>
+      </w:r>
+      <w:proofErr w:type="spellEnd"/>
+      <w:r>
+        <w:rPr>
+          <w:lang w:val="en-US"/>
+        </w:rPr>
+        <w:t>'</w:t>
+      </w:r>
+      <w:r>
+        <w:rPr>
+          <w:lang w:val="en-US"/>
+        </w:rPr>
+        <w:t>@</w:t>
+      </w:r>
+      <w:r>
+        <w:rPr>
+          <w:lang w:val="en-US"/>
+        </w:rPr>
+        <w:t>'</w:t>
+      </w:r>
+      <w:r>
+        <w:rPr>
+          <w:lang w:val="en-US"/>
+        </w:rPr>
+        <w:t>localhost</w:t>
+      </w:r>
+      <w:r>
+        <w:rPr>
+          <w:lang w:val="en-US"/>
+        </w:rPr>
+        <w:t>'</w:t>
+      </w:r>
+      <w:r>
+        <w:rPr>
+          <w:lang w:val="en-US"/>
+        </w:rPr>
+        <w:t xml:space="preserve"> identified by </w:t>
+      </w:r>
+      <w:r>
+        <w:rPr>
+          <w:lang w:val="en-US"/>
+        </w:rPr>
+        <w:t>'</w:t>
+      </w:r>
+      <w:proofErr w:type="spellStart"/>
+      <w:r>
+        <w:rPr>
+          <w:lang w:val="en-US"/>
+        </w:rPr>
+        <w:t>Thanoss_Pizza</w:t>
+      </w:r>
+      <w:proofErr w:type="spellEnd"/>
+      <w:r>
+        <w:rPr>
+          <w:lang w:val="en-US"/>
+        </w:rPr>
+        <w:t xml:space="preserve"> agent de </w:t>
+      </w:r>
+      <w:proofErr w:type="spellStart"/>
+      <w:r>
+        <w:rPr>
+          <w:lang w:val="en-US"/>
+        </w:rPr>
+        <w:t>caisse</w:t>
+      </w:r>
+      <w:proofErr w:type="spellEnd"/>
+      <w:r>
+        <w:rPr>
+          <w:lang w:val="en-US"/>
+        </w:rPr>
+        <w:t>'</w:t>
+      </w:r>
+      <w:r>
+        <w:rPr>
+          <w:lang w:val="en-US"/>
+        </w:rPr>
+        <w:t>,</w:t>
+      </w:r>
+    </w:p>
+    <w:p>
+      <w:pPr>
+        <w:rPr>
+          <w:lang w:val="en-US"/>
+        </w:rPr>
+      </w:pPr>
+      <w:r>
+        <w:rPr>
+          <w:lang w:val="en-US"/>
+        </w:rPr>
+        <w:t>'</w:t>
+      </w:r>
+      <w:proofErr w:type="spellStart"/>
+      <w:r>
+        <w:rPr>
+          <w:lang w:val="en-US"/>
+        </w:rPr>
+        <w:t>Thanoss_Pizza</w:t>
+      </w:r>
+      <w:proofErr w:type="spellEnd"/>
+      <w:r>
+        <w:rPr>
+          <w:lang w:val="en-US"/>
+        </w:rPr>
         <w:t xml:space="preserve"> </w:t>
       </w:r>
       <w:proofErr w:type="spellStart"/>
@@ -4533,7 +4749,7 @@
         <w:rPr>
           <w:lang w:val="en-US"/>
         </w:rPr>
-        <w:t>livreur</w:t>
+        <w:t>analyste</w:t>
       </w:r>
       <w:proofErr w:type="spellEnd"/>
       <w:r>
@@ -4597,336 +4813,105 @@
         <w:rPr>
           <w:lang w:val="en-US"/>
         </w:rPr>
-        <w:t>livreur</w:t>
-      </w:r>
-      <w:proofErr w:type="spellEnd"/>
-      <w:r>
-        <w:rPr>
-          <w:lang w:val="en-US"/>
-        </w:rPr>
-        <w:t>'</w:t>
-      </w:r>
-      <w:r>
-        <w:rPr>
-          <w:lang w:val="en-US"/>
-        </w:rPr>
-        <w:t>,</w:t>
+        <w:t>analyste</w:t>
+      </w:r>
+      <w:proofErr w:type="spellEnd"/>
+      <w:proofErr w:type="gramStart"/>
+      <w:r>
+        <w:rPr>
+          <w:lang w:val="en-US"/>
+        </w:rPr>
+        <w:t>'</w:t>
+      </w:r>
+      <w:r>
+        <w:rPr>
+          <w:lang w:val="en-US"/>
+        </w:rPr>
+        <w:t>;</w:t>
+      </w:r>
+      <w:proofErr w:type="gramEnd"/>
+    </w:p>
+    <w:p>
+      <w:r>
+        <w:t xml:space="preserve">Vérifions que la </w:t>
+      </w:r>
+      <w:proofErr w:type="spellStart"/>
+      <w:r>
+        <w:t>creation</w:t>
+      </w:r>
+      <w:proofErr w:type="spellEnd"/>
+      <w:r>
+        <w:t xml:space="preserve"> s’est bien déroulée :</w:t>
       </w:r>
     </w:p>
     <w:p>
       <w:pPr>
         <w:pStyle w:val="Sansinterligne"/>
-        <w:rPr>
-          <w:lang w:val="en-US"/>
-        </w:rPr>
-      </w:pPr>
-      <w:r>
-        <w:rPr>
-          <w:lang w:val="en-US"/>
-        </w:rPr>
-        <w:t>'</w:t>
-      </w:r>
-      <w:proofErr w:type="spellStart"/>
-      <w:r>
-        <w:rPr>
-          <w:lang w:val="en-US"/>
-        </w:rPr>
-        <w:t>Thanoss_Pizza</w:t>
-      </w:r>
-      <w:proofErr w:type="spellEnd"/>
-      <w:r>
-        <w:rPr>
-          <w:lang w:val="en-US"/>
-        </w:rPr>
-        <w:t xml:space="preserve"> </w:t>
-      </w:r>
-      <w:r>
-        <w:rPr>
-          <w:lang w:val="en-US"/>
-        </w:rPr>
-        <w:t xml:space="preserve">agent de </w:t>
-      </w:r>
-      <w:proofErr w:type="spellStart"/>
-      <w:r>
-        <w:rPr>
-          <w:lang w:val="en-US"/>
-        </w:rPr>
-        <w:t>caisse</w:t>
-      </w:r>
-      <w:proofErr w:type="spellEnd"/>
-      <w:r>
-        <w:rPr>
-          <w:lang w:val="en-US"/>
-        </w:rPr>
-        <w:t>'</w:t>
-      </w:r>
-      <w:r>
-        <w:rPr>
-          <w:lang w:val="en-US"/>
-        </w:rPr>
-        <w:t>@</w:t>
-      </w:r>
-      <w:r>
-        <w:rPr>
-          <w:lang w:val="en-US"/>
-        </w:rPr>
-        <w:t>'</w:t>
-      </w:r>
-      <w:r>
-        <w:rPr>
-          <w:lang w:val="en-US"/>
-        </w:rPr>
-        <w:t>localhost</w:t>
-      </w:r>
-      <w:r>
-        <w:rPr>
-          <w:lang w:val="en-US"/>
-        </w:rPr>
-        <w:t>'</w:t>
-      </w:r>
-      <w:r>
-        <w:rPr>
-          <w:lang w:val="en-US"/>
-        </w:rPr>
-        <w:t xml:space="preserve"> identified by </w:t>
-      </w:r>
-      <w:r>
-        <w:rPr>
-          <w:lang w:val="en-US"/>
-        </w:rPr>
-        <w:t>'</w:t>
-      </w:r>
-      <w:proofErr w:type="spellStart"/>
-      <w:r>
-        <w:rPr>
-          <w:lang w:val="en-US"/>
-        </w:rPr>
-        <w:t>Thanoss_Pizza</w:t>
-      </w:r>
-      <w:proofErr w:type="spellEnd"/>
-      <w:r>
-        <w:rPr>
-          <w:lang w:val="en-US"/>
-        </w:rPr>
-        <w:t xml:space="preserve"> a</w:t>
-      </w:r>
-      <w:r>
-        <w:rPr>
-          <w:lang w:val="en-US"/>
-        </w:rPr>
-        <w:t xml:space="preserve">gent de </w:t>
-      </w:r>
-      <w:proofErr w:type="spellStart"/>
-      <w:r>
-        <w:rPr>
-          <w:lang w:val="en-US"/>
-        </w:rPr>
-        <w:t>caisse</w:t>
-      </w:r>
-      <w:proofErr w:type="spellEnd"/>
-      <w:r>
-        <w:rPr>
-          <w:lang w:val="en-US"/>
-        </w:rPr>
-        <w:t>'</w:t>
-      </w:r>
-      <w:r>
-        <w:rPr>
-          <w:lang w:val="en-US"/>
-        </w:rPr>
-        <w:t>,</w:t>
-      </w:r>
-    </w:p>
-    <w:p>
-      <w:pPr>
-        <w:rPr>
-          <w:lang w:val="en-US"/>
-        </w:rPr>
-      </w:pPr>
-      <w:r>
-        <w:rPr>
-          <w:lang w:val="en-US"/>
-        </w:rPr>
-        <w:t>'</w:t>
-      </w:r>
-      <w:proofErr w:type="spellStart"/>
-      <w:r>
-        <w:rPr>
-          <w:lang w:val="en-US"/>
-        </w:rPr>
-        <w:t>Thanoss_Pizza</w:t>
-      </w:r>
-      <w:proofErr w:type="spellEnd"/>
-      <w:r>
-        <w:rPr>
-          <w:lang w:val="en-US"/>
-        </w:rPr>
-        <w:t xml:space="preserve"> </w:t>
-      </w:r>
-      <w:proofErr w:type="spellStart"/>
-      <w:r>
-        <w:rPr>
-          <w:lang w:val="en-US"/>
-        </w:rPr>
-        <w:t>analyste</w:t>
-      </w:r>
-      <w:proofErr w:type="spellEnd"/>
-      <w:r>
-        <w:rPr>
-          <w:lang w:val="en-US"/>
-        </w:rPr>
-        <w:t>'</w:t>
-      </w:r>
-      <w:r>
-        <w:rPr>
-          <w:lang w:val="en-US"/>
-        </w:rPr>
-        <w:t>@</w:t>
-      </w:r>
-      <w:r>
-        <w:rPr>
-          <w:lang w:val="en-US"/>
-        </w:rPr>
-        <w:t>'</w:t>
-      </w:r>
-      <w:r>
-        <w:rPr>
-          <w:lang w:val="en-US"/>
-        </w:rPr>
-        <w:t>localhost</w:t>
-      </w:r>
-      <w:r>
-        <w:rPr>
-          <w:lang w:val="en-US"/>
-        </w:rPr>
-        <w:t>'</w:t>
-      </w:r>
-      <w:r>
-        <w:rPr>
-          <w:lang w:val="en-US"/>
-        </w:rPr>
-        <w:t xml:space="preserve"> identified by </w:t>
-      </w:r>
-      <w:r>
-        <w:rPr>
-          <w:lang w:val="en-US"/>
-        </w:rPr>
-        <w:t>'</w:t>
-      </w:r>
-      <w:proofErr w:type="spellStart"/>
-      <w:r>
-        <w:rPr>
-          <w:lang w:val="en-US"/>
-        </w:rPr>
-        <w:t>Thanoss_Pizza</w:t>
-      </w:r>
-      <w:proofErr w:type="spellEnd"/>
-      <w:r>
-        <w:rPr>
-          <w:lang w:val="en-US"/>
-        </w:rPr>
-        <w:t xml:space="preserve"> </w:t>
-      </w:r>
-      <w:proofErr w:type="spellStart"/>
-      <w:r>
-        <w:rPr>
-          <w:lang w:val="en-US"/>
-        </w:rPr>
-        <w:t>a</w:t>
-      </w:r>
-      <w:r>
-        <w:rPr>
-          <w:lang w:val="en-US"/>
-        </w:rPr>
-        <w:t>nalyste</w:t>
-      </w:r>
-      <w:proofErr w:type="spellEnd"/>
+      </w:pPr>
+      <w:r>
+        <w:t>-- la commande</w:t>
+      </w:r>
+    </w:p>
+    <w:p>
+      <w:pPr>
+        <w:pStyle w:val="Sansinterligne"/>
+        <w:rPr>
+          <w:lang w:val="en-US"/>
+        </w:rPr>
+      </w:pPr>
+      <w:r>
+        <w:rPr>
+          <w:lang w:val="en-US"/>
+        </w:rPr>
+        <w:t xml:space="preserve">use </w:t>
+      </w:r>
+      <w:proofErr w:type="spellStart"/>
       <w:proofErr w:type="gramStart"/>
       <w:r>
         <w:rPr>
           <w:lang w:val="en-US"/>
         </w:rPr>
-        <w:t>'</w:t>
-      </w:r>
-      <w:r>
-        <w:rPr>
-          <w:lang w:val="en-US"/>
-        </w:rPr>
-        <w:t>;</w:t>
+        <w:t>mysql</w:t>
+      </w:r>
+      <w:proofErr w:type="spellEnd"/>
+      <w:r>
+        <w:rPr>
+          <w:lang w:val="en-US"/>
+        </w:rPr>
+        <w:t> ;</w:t>
       </w:r>
       <w:proofErr w:type="gramEnd"/>
     </w:p>
     <w:p>
-      <w:r>
-        <w:t xml:space="preserve">Vérifions que la </w:t>
-      </w:r>
-      <w:proofErr w:type="spellStart"/>
-      <w:r>
-        <w:t>creation</w:t>
-      </w:r>
-      <w:proofErr w:type="spellEnd"/>
-      <w:r>
-        <w:t xml:space="preserve"> s’est bien déroulée :</w:t>
-      </w:r>
-    </w:p>
-    <w:p>
-      <w:pPr>
-        <w:pStyle w:val="Sansinterligne"/>
-      </w:pPr>
-      <w:r>
-        <w:t>-- la commande</w:t>
-      </w:r>
-    </w:p>
-    <w:p>
-      <w:pPr>
-        <w:pStyle w:val="Sansinterligne"/>
-      </w:pPr>
+      <w:pPr>
+        <w:rPr>
+          <w:lang w:val="en-US"/>
+        </w:rPr>
+      </w:pPr>
+      <w:r>
+        <w:rPr>
+          <w:lang w:val="en-US"/>
+        </w:rPr>
+        <w:t xml:space="preserve">select User, host from </w:t>
+      </w:r>
       <w:proofErr w:type="gramStart"/>
       <w:r>
-        <w:t>use</w:t>
+        <w:rPr>
+          <w:lang w:val="en-US"/>
+        </w:rPr>
+        <w:t>user;</w:t>
       </w:r>
       <w:proofErr w:type="gramEnd"/>
-      <w:r>
-        <w:t xml:space="preserve"> </w:t>
-      </w:r>
-      <w:proofErr w:type="spellStart"/>
-      <w:r>
-        <w:t>mysql</w:t>
-      </w:r>
-      <w:proofErr w:type="spellEnd"/>
-      <w:r>
-        <w:t> ;</w:t>
-      </w:r>
-    </w:p>
-    <w:p>
-      <w:pPr>
-        <w:rPr>
-          <w:lang w:val="en-US"/>
-        </w:rPr>
-      </w:pPr>
-      <w:r>
-        <w:rPr>
-          <w:lang w:val="en-US"/>
-        </w:rPr>
-        <w:t xml:space="preserve">select User, host from </w:t>
-      </w:r>
-      <w:proofErr w:type="gramStart"/>
-      <w:r>
-        <w:rPr>
-          <w:lang w:val="en-US"/>
-        </w:rPr>
-        <w:t>user;</w:t>
-      </w:r>
-      <w:proofErr w:type="gramEnd"/>
-    </w:p>
-    <w:p>
-      <w:pPr>
-        <w:rPr>
-          <w:lang w:val="en-US"/>
-        </w:rPr>
-      </w:pPr>
-      <w:r>
-        <w:rPr>
+    </w:p>
+    <w:p>
+      <w:pPr>
+        <w:rPr>
+          <w:lang w:val="en-US"/>
+        </w:rPr>
+      </w:pPr>
+      <w:r>
+        <w:rPr>
+          <w:noProof/>
           <w:lang w:val="en-US"/>
         </w:rPr>
         <w:drawing>
@@ -4975,6 +4960,7 @@
         </w:numPr>
       </w:pPr>
       <w:r>
+        <w:lastRenderedPageBreak/>
         <w:t>Attribuer les rôles aux u</w:t>
       </w:r>
       <w:r>
@@ -4982,6 +4968,10 @@
       </w:r>
     </w:p>
     <w:p>
+      <w:pPr>
+        <w:keepNext/>
+        <w:keepLines/>
+      </w:pPr>
       <w:r>
         <w:t>Finalement, nous allons donner un rôle à chaque utilisateur, voici les commandes :</w:t>
       </w:r>
@@ -4989,6 +4979,8 @@
     <w:p>
       <w:pPr>
         <w:pStyle w:val="Sansinterligne"/>
+        <w:keepNext/>
+        <w:keepLines/>
       </w:pPr>
       <w:r>
         <w:t>-- administrateur</w:t>
@@ -4997,6 +4989,8 @@
     <w:p>
       <w:pPr>
         <w:pStyle w:val="Sansinterligne"/>
+        <w:keepNext/>
+        <w:keepLines/>
         <w:rPr>
           <w:lang w:val="en-US"/>
         </w:rPr>
@@ -5089,6 +5083,94 @@
     <w:p>
       <w:pPr>
         <w:pStyle w:val="Sansinterligne"/>
+        <w:keepNext/>
+        <w:keepLines/>
+        <w:rPr>
+          <w:lang w:val="en-US"/>
+        </w:rPr>
+      </w:pPr>
+      <w:r>
+        <w:rPr>
+          <w:lang w:val="en-US"/>
+        </w:rPr>
+        <w:t>SET DEFAULT ROLE '</w:t>
+      </w:r>
+      <w:r>
+        <w:rPr>
+          <w:lang w:val="en-US"/>
+        </w:rPr>
+        <w:t>A</w:t>
+      </w:r>
+      <w:r>
+        <w:rPr>
+          <w:lang w:val="en-US"/>
+        </w:rPr>
+        <w:t>dmin</w:t>
+      </w:r>
+      <w:r>
+        <w:rPr>
+          <w:lang w:val="en-US"/>
+        </w:rPr>
+        <w:t>istrateur</w:t>
+      </w:r>
+      <w:proofErr w:type="gramStart"/>
+      <w:r>
+        <w:rPr>
+          <w:lang w:val="en-US"/>
+        </w:rPr>
+        <w:t>'</w:t>
+      </w:r>
+      <w:r>
+        <w:rPr>
+          <w:lang w:val="en-US"/>
+        </w:rPr>
+        <w:t xml:space="preserve"> </w:t>
+      </w:r>
+      <w:r>
+        <w:rPr>
+          <w:lang w:val="en-US"/>
+        </w:rPr>
+        <w:t xml:space="preserve"> TO</w:t>
+      </w:r>
+      <w:proofErr w:type="gramEnd"/>
+      <w:r>
+        <w:rPr>
+          <w:lang w:val="en-US"/>
+        </w:rPr>
+        <w:t xml:space="preserve"> '</w:t>
+      </w:r>
+      <w:proofErr w:type="spellStart"/>
+      <w:r>
+        <w:rPr>
+          <w:lang w:val="en-US"/>
+        </w:rPr>
+        <w:t>admin</w:t>
+      </w:r>
+      <w:r>
+        <w:rPr>
+          <w:lang w:val="en-US"/>
+        </w:rPr>
+        <w:t>'@'</w:t>
+      </w:r>
+      <w:r>
+        <w:rPr>
+          <w:lang w:val="en-US"/>
+        </w:rPr>
+        <w:t>localhost</w:t>
+      </w:r>
+      <w:proofErr w:type="spellEnd"/>
+      <w:r>
+        <w:rPr>
+          <w:lang w:val="en-US"/>
+        </w:rPr>
+        <w:t>';</w:t>
+      </w:r>
+    </w:p>
+    <w:p>
+      <w:pPr>
+        <w:pStyle w:val="Sansinterligne"/>
+        <w:keepNext/>
+        <w:keepLines/>
         <w:rPr>
           <w:lang w:val="en-US"/>
         </w:rPr>
@@ -5103,6 +5185,8 @@
     <w:p>
       <w:pPr>
         <w:pStyle w:val="Sansinterligne"/>
+        <w:keepNext/>
+        <w:keepLines/>
         <w:rPr>
           <w:lang w:val="en-US"/>
         </w:rPr>
@@ -5207,6 +5291,102 @@
     <w:p>
       <w:pPr>
         <w:pStyle w:val="Sansinterligne"/>
+        <w:keepNext/>
+        <w:keepLines/>
+        <w:rPr>
+          <w:lang w:val="en-US"/>
+        </w:rPr>
+      </w:pPr>
+      <w:r>
+        <w:rPr>
+          <w:lang w:val="en-US"/>
+        </w:rPr>
+        <w:t>SET DEFAULT ROLE '</w:t>
+      </w:r>
+      <w:r>
+        <w:rPr>
+          <w:lang w:val="en-US"/>
+        </w:rPr>
+        <w:t>Manager</w:t>
+      </w:r>
+      <w:proofErr w:type="gramStart"/>
+      <w:r>
+        <w:rPr>
+          <w:lang w:val="en-US"/>
+        </w:rPr>
+        <w:t>'</w:t>
+      </w:r>
+      <w:r>
+        <w:rPr>
+          <w:lang w:val="en-US"/>
+        </w:rPr>
+        <w:t xml:space="preserve"> </w:t>
+      </w:r>
+      <w:r>
+        <w:rPr>
+          <w:lang w:val="en-US"/>
+        </w:rPr>
+        <w:t xml:space="preserve"> TO</w:t>
+      </w:r>
+      <w:proofErr w:type="gramEnd"/>
+      <w:r>
+        <w:rPr>
+          <w:lang w:val="en-US"/>
+        </w:rPr>
+        <w:t xml:space="preserve"> '</w:t>
+      </w:r>
+      <w:proofErr w:type="spellStart"/>
+      <w:r>
+        <w:rPr>
+          <w:lang w:val="en-US"/>
+        </w:rPr>
+        <w:t>Thanoss_Pizza</w:t>
+      </w:r>
+      <w:proofErr w:type="spellEnd"/>
+      <w:r>
+        <w:rPr>
+          <w:lang w:val="en-US"/>
+        </w:rPr>
+        <w:t xml:space="preserve"> </w:t>
+      </w:r>
+      <w:proofErr w:type="spellStart"/>
+      <w:r>
+        <w:rPr>
+          <w:lang w:val="en-US"/>
+        </w:rPr>
+        <w:t>manager</w:t>
+      </w:r>
+      <w:r>
+        <w:rPr>
+          <w:lang w:val="en-US"/>
+        </w:rPr>
+        <w:t>'</w:t>
+      </w:r>
+      <w:r>
+        <w:rPr>
+          <w:lang w:val="en-US"/>
+        </w:rPr>
+        <w:t>@'</w:t>
+      </w:r>
+      <w:r>
+        <w:rPr>
+          <w:lang w:val="en-US"/>
+        </w:rPr>
+        <w:t>localhost</w:t>
+      </w:r>
+      <w:proofErr w:type="spellEnd"/>
+      <w:r>
+        <w:rPr>
+          <w:lang w:val="en-US"/>
+        </w:rPr>
+        <w:t>';</w:t>
+      </w:r>
+    </w:p>
+    <w:p>
+      <w:pPr>
+        <w:pStyle w:val="Sansinterligne"/>
+        <w:keepNext/>
+        <w:keepLines/>
         <w:rPr>
           <w:lang w:val="en-US"/>
         </w:rPr>
@@ -5221,6 +5401,8 @@
     <w:p>
       <w:pPr>
         <w:pStyle w:val="Sansinterligne"/>
+        <w:keepNext/>
+        <w:keepLines/>
         <w:rPr>
           <w:lang w:val="en-US"/>
         </w:rPr>
@@ -5325,6 +5507,108 @@
     <w:p>
       <w:pPr>
         <w:pStyle w:val="Sansinterligne"/>
+        <w:keepNext/>
+        <w:keepLines/>
+        <w:rPr>
+          <w:lang w:val="en-US"/>
+        </w:rPr>
+      </w:pPr>
+      <w:r>
+        <w:rPr>
+          <w:lang w:val="en-US"/>
+        </w:rPr>
+        <w:t>SET DEFAULT ROLE '</w:t>
+      </w:r>
+      <w:r>
+        <w:rPr>
+          <w:lang w:val="en-US"/>
+        </w:rPr>
+        <w:t>Pizzaiolo</w:t>
+      </w:r>
+      <w:proofErr w:type="gramStart"/>
+      <w:r>
+        <w:rPr>
+          <w:lang w:val="en-US"/>
+        </w:rPr>
+        <w:t>'</w:t>
+      </w:r>
+      <w:r>
+        <w:rPr>
+          <w:lang w:val="en-US"/>
+        </w:rPr>
+        <w:t xml:space="preserve"> </w:t>
+      </w:r>
+      <w:r>
+        <w:rPr>
+          <w:lang w:val="en-US"/>
+        </w:rPr>
+        <w:t xml:space="preserve"> TO</w:t>
+      </w:r>
+      <w:proofErr w:type="gramEnd"/>
+      <w:r>
+        <w:rPr>
+          <w:lang w:val="en-US"/>
+        </w:rPr>
+        <w:t xml:space="preserve"> </w:t>
+      </w:r>
+      <w:r>
+        <w:rPr>
+          <w:lang w:val="en-US"/>
+        </w:rPr>
+        <w:t>'</w:t>
+      </w:r>
+      <w:proofErr w:type="spellStart"/>
+      <w:r>
+        <w:rPr>
+          <w:lang w:val="en-US"/>
+        </w:rPr>
+        <w:t>Thanoss_Pizza</w:t>
+      </w:r>
+      <w:proofErr w:type="spellEnd"/>
+      <w:r>
+        <w:rPr>
+          <w:lang w:val="en-US"/>
+        </w:rPr>
+        <w:t xml:space="preserve"> </w:t>
+      </w:r>
+      <w:proofErr w:type="spellStart"/>
+      <w:r>
+        <w:rPr>
+          <w:lang w:val="en-US"/>
+        </w:rPr>
+        <w:t>pizzaiolo</w:t>
+      </w:r>
+      <w:r>
+        <w:rPr>
+          <w:lang w:val="en-US"/>
+        </w:rPr>
+        <w:t>'</w:t>
+      </w:r>
+      <w:r>
+        <w:rPr>
+          <w:lang w:val="en-US"/>
+        </w:rPr>
+        <w:t>@'</w:t>
+      </w:r>
+      <w:r>
+        <w:rPr>
+          <w:lang w:val="en-US"/>
+        </w:rPr>
+        <w:t>localhost</w:t>
+      </w:r>
+      <w:proofErr w:type="spellEnd"/>
+      <w:r>
+        <w:rPr>
+          <w:lang w:val="en-US"/>
+        </w:rPr>
+        <w:t>';</w:t>
+      </w:r>
+    </w:p>
+    <w:p>
+      <w:pPr>
+        <w:pStyle w:val="Sansinterligne"/>
+        <w:keepNext/>
+        <w:keepLines/>
         <w:rPr>
           <w:lang w:val="en-US"/>
         </w:rPr>
@@ -5347,6 +5631,8 @@
     <w:p>
       <w:pPr>
         <w:pStyle w:val="Sansinterligne"/>
+        <w:keepNext/>
+        <w:keepLines/>
         <w:rPr>
           <w:lang w:val="en-US"/>
         </w:rPr>
@@ -5453,6 +5739,110 @@
     <w:p>
       <w:pPr>
         <w:pStyle w:val="Sansinterligne"/>
+        <w:keepNext/>
+        <w:keepLines/>
+        <w:rPr>
+          <w:lang w:val="en-US"/>
+        </w:rPr>
+      </w:pPr>
+      <w:r>
+        <w:rPr>
+          <w:lang w:val="en-US"/>
+        </w:rPr>
+        <w:t>SET DEFAULT ROLE '</w:t>
+      </w:r>
+      <w:proofErr w:type="spellStart"/>
+      <w:r>
+        <w:rPr>
+          <w:lang w:val="en-US"/>
+        </w:rPr>
+        <w:t>Livreur</w:t>
+      </w:r>
+      <w:proofErr w:type="spellEnd"/>
+      <w:proofErr w:type="gramStart"/>
+      <w:r>
+        <w:rPr>
+          <w:lang w:val="en-US"/>
+        </w:rPr>
+        <w:t>'</w:t>
+      </w:r>
+      <w:r>
+        <w:rPr>
+          <w:lang w:val="en-US"/>
+        </w:rPr>
+        <w:t xml:space="preserve"> </w:t>
+      </w:r>
+      <w:r>
+        <w:rPr>
+          <w:lang w:val="en-US"/>
+        </w:rPr>
+        <w:t xml:space="preserve"> TO</w:t>
+      </w:r>
+      <w:proofErr w:type="gramEnd"/>
+      <w:r>
+        <w:rPr>
+          <w:lang w:val="en-US"/>
+        </w:rPr>
+        <w:t xml:space="preserve"> </w:t>
+      </w:r>
+      <w:r>
+        <w:rPr>
+          <w:lang w:val="en-US"/>
+        </w:rPr>
+        <w:t>'</w:t>
+      </w:r>
+      <w:proofErr w:type="spellStart"/>
+      <w:r>
+        <w:rPr>
+          <w:lang w:val="en-US"/>
+        </w:rPr>
+        <w:t>Thanoss_Pizza</w:t>
+      </w:r>
+      <w:proofErr w:type="spellEnd"/>
+      <w:r>
+        <w:rPr>
+          <w:lang w:val="en-US"/>
+        </w:rPr>
+        <w:t xml:space="preserve"> </w:t>
+      </w:r>
+      <w:proofErr w:type="spellStart"/>
+      <w:r>
+        <w:rPr>
+          <w:lang w:val="en-US"/>
+        </w:rPr>
+        <w:t>livreur</w:t>
+      </w:r>
+      <w:proofErr w:type="spellEnd"/>
+      <w:r>
+        <w:rPr>
+          <w:lang w:val="en-US"/>
+        </w:rPr>
+        <w:t>'</w:t>
+      </w:r>
+      <w:r>
+        <w:rPr>
+          <w:lang w:val="en-US"/>
+        </w:rPr>
+        <w:t>@'</w:t>
+      </w:r>
+      <w:r>
+        <w:rPr>
+          <w:lang w:val="en-US"/>
+        </w:rPr>
+        <w:t>localhost</w:t>
+      </w:r>
+      <w:r>
+        <w:rPr>
+          <w:lang w:val="en-US"/>
+        </w:rPr>
+        <w:t>';</w:t>
+      </w:r>
+    </w:p>
+    <w:p>
+      <w:pPr>
+        <w:pStyle w:val="Sansinterligne"/>
+        <w:keepNext/>
+        <w:keepLines/>
       </w:pPr>
       <w:r>
         <w:t>-- agent de</w:t>
@@ -5464,6 +5854,8 @@
     <w:p>
       <w:pPr>
         <w:pStyle w:val="Sansinterligne"/>
+        <w:keepNext/>
+        <w:keepLines/>
       </w:pPr>
       <w:proofErr w:type="spellStart"/>
       <w:proofErr w:type="gramStart"/>
@@ -5473,13 +5865,7 @@
       <w:proofErr w:type="spellEnd"/>
       <w:proofErr w:type="gramEnd"/>
       <w:r>
-        <w:t xml:space="preserve"> 'A</w:t>
-      </w:r>
-      <w:r>
-        <w:t>gent de caisse</w:t>
-      </w:r>
-      <w:r>
-        <w:t>' to '</w:t>
+        <w:t xml:space="preserve"> 'Agent de caisse' to '</w:t>
       </w:r>
       <w:proofErr w:type="spellStart"/>
       <w:r>
@@ -5487,35 +5873,178 @@
       </w:r>
       <w:proofErr w:type="spellEnd"/>
       <w:r>
+        <w:t xml:space="preserve"> agent de </w:t>
+      </w:r>
+      <w:proofErr w:type="spellStart"/>
+      <w:r>
+        <w:t>caisse'@'localhost</w:t>
+      </w:r>
+      <w:proofErr w:type="spellEnd"/>
+      <w:r>
+        <w:t>';</w:t>
+      </w:r>
+    </w:p>
+    <w:p>
+      <w:pPr>
+        <w:pStyle w:val="Sansinterligne"/>
+        <w:keepNext/>
+        <w:keepLines/>
+        <w:rPr>
+          <w:lang w:val="en-US"/>
+        </w:rPr>
+      </w:pPr>
+      <w:r>
+        <w:rPr>
+          <w:lang w:val="en-US"/>
+        </w:rPr>
+        <w:t>SET DEFAULT ROLE '</w:t>
+      </w:r>
+      <w:r>
+        <w:rPr>
+          <w:lang w:val="en-US"/>
+        </w:rPr>
+        <w:t xml:space="preserve">Agent de </w:t>
+      </w:r>
+      <w:proofErr w:type="spellStart"/>
+      <w:r>
+        <w:rPr>
+          <w:lang w:val="en-US"/>
+        </w:rPr>
+        <w:t>caisse</w:t>
+      </w:r>
+      <w:proofErr w:type="spellEnd"/>
+      <w:proofErr w:type="gramStart"/>
+      <w:r>
+        <w:rPr>
+          <w:lang w:val="en-US"/>
+        </w:rPr>
+        <w:t>'</w:t>
+      </w:r>
+      <w:r>
+        <w:rPr>
+          <w:lang w:val="en-US"/>
+        </w:rPr>
         <w:t xml:space="preserve"> </w:t>
       </w:r>
       <w:r>
-        <w:t xml:space="preserve">agent de </w:t>
-      </w:r>
-      <w:proofErr w:type="spellStart"/>
-      <w:r>
-        <w:t>caisse</w:t>
-      </w:r>
-      <w:r>
-        <w:t>'@'localhost</w:t>
-      </w:r>
-      <w:proofErr w:type="spellEnd"/>
-      <w:r>
+        <w:rPr>
+          <w:lang w:val="en-US"/>
+        </w:rPr>
+        <w:t xml:space="preserve"> TO</w:t>
+      </w:r>
+      <w:proofErr w:type="gramEnd"/>
+      <w:r>
+        <w:rPr>
+          <w:lang w:val="en-US"/>
+        </w:rPr>
+        <w:t xml:space="preserve"> </w:t>
+      </w:r>
+      <w:r>
+        <w:t>'</w:t>
+      </w:r>
+      <w:proofErr w:type="spellStart"/>
+      <w:r>
+        <w:t>Thanoss_Pizza</w:t>
+      </w:r>
+      <w:proofErr w:type="spellEnd"/>
+      <w:r>
+        <w:t xml:space="preserve"> agent de caisse'</w:t>
+      </w:r>
+      <w:r>
+        <w:rPr>
+          <w:lang w:val="en-US"/>
+        </w:rPr>
+        <w:t>@'</w:t>
+      </w:r>
+      <w:r>
+        <w:rPr>
+          <w:lang w:val="en-US"/>
+        </w:rPr>
+        <w:t>localhost</w:t>
+      </w:r>
+      <w:r>
+        <w:rPr>
+          <w:lang w:val="en-US"/>
+        </w:rPr>
         <w:t>';</w:t>
       </w:r>
     </w:p>
     <w:p>
       <w:pPr>
         <w:pStyle w:val="Sansinterligne"/>
-        <w:rPr>
-          <w:lang w:val="en-US"/>
-        </w:rPr>
-      </w:pPr>
-      <w:r>
-        <w:rPr>
-          <w:lang w:val="en-US"/>
-        </w:rPr>
-        <w:t xml:space="preserve">-- </w:t>
+        <w:keepNext/>
+        <w:keepLines/>
+      </w:pPr>
+      <w:r>
+        <w:t>-- analyste</w:t>
+      </w:r>
+    </w:p>
+    <w:p>
+      <w:pPr>
+        <w:pStyle w:val="Sansinterligne"/>
+        <w:keepNext/>
+        <w:keepLines/>
+        <w:rPr>
+          <w:lang w:val="en-US"/>
+        </w:rPr>
+      </w:pPr>
+      <w:r>
+        <w:rPr>
+          <w:lang w:val="en-US"/>
+        </w:rPr>
+        <w:t xml:space="preserve">grant </w:t>
+      </w:r>
+      <w:r>
+        <w:rPr>
+          <w:lang w:val="en-US"/>
+        </w:rPr>
+        <w:t>'</w:t>
+      </w:r>
+      <w:proofErr w:type="spellStart"/>
+      <w:r>
+        <w:rPr>
+          <w:lang w:val="en-US"/>
+        </w:rPr>
+        <w:t>A</w:t>
+      </w:r>
+      <w:r>
+        <w:rPr>
+          <w:lang w:val="en-US"/>
+        </w:rPr>
+        <w:t>nalyste</w:t>
+      </w:r>
+      <w:proofErr w:type="spellEnd"/>
+      <w:r>
+        <w:rPr>
+          <w:lang w:val="en-US"/>
+        </w:rPr>
+        <w:t>'</w:t>
+      </w:r>
+      <w:r>
+        <w:rPr>
+          <w:lang w:val="en-US"/>
+        </w:rPr>
+        <w:t xml:space="preserve"> to </w:t>
+      </w:r>
+      <w:r>
+        <w:rPr>
+          <w:lang w:val="en-US"/>
+        </w:rPr>
+        <w:t>'</w:t>
+      </w:r>
+      <w:proofErr w:type="spellStart"/>
+      <w:r>
+        <w:rPr>
+          <w:lang w:val="en-US"/>
+        </w:rPr>
+        <w:t>Thanoss_Pizza</w:t>
+      </w:r>
+      <w:proofErr w:type="spellEnd"/>
+      <w:r>
+        <w:rPr>
+          <w:lang w:val="en-US"/>
+        </w:rPr>
+        <w:t xml:space="preserve"> </w:t>
       </w:r>
       <w:proofErr w:type="spellStart"/>
       <w:r>
@@ -5525,51 +6054,93 @@
         <w:t>analyste</w:t>
       </w:r>
       <w:proofErr w:type="spellEnd"/>
+      <w:r>
+        <w:rPr>
+          <w:lang w:val="en-US"/>
+        </w:rPr>
+        <w:t>'</w:t>
+      </w:r>
+      <w:r>
+        <w:rPr>
+          <w:lang w:val="en-US"/>
+        </w:rPr>
+        <w:t>@</w:t>
+      </w:r>
+      <w:r>
+        <w:rPr>
+          <w:lang w:val="en-US"/>
+        </w:rPr>
+        <w:t>'</w:t>
+      </w:r>
+      <w:r>
+        <w:rPr>
+          <w:lang w:val="en-US"/>
+        </w:rPr>
+        <w:t>localhost</w:t>
+      </w:r>
+      <w:proofErr w:type="gramStart"/>
+      <w:r>
+        <w:rPr>
+          <w:lang w:val="en-US"/>
+        </w:rPr>
+        <w:t>'</w:t>
+      </w:r>
+      <w:r>
+        <w:rPr>
+          <w:lang w:val="en-US"/>
+        </w:rPr>
+        <w:t>;</w:t>
+      </w:r>
+      <w:proofErr w:type="gramEnd"/>
     </w:p>
     <w:p>
       <w:pPr>
         <w:pStyle w:val="Sansinterligne"/>
-        <w:rPr>
-          <w:lang w:val="en-US"/>
-        </w:rPr>
-      </w:pPr>
-      <w:r>
-        <w:rPr>
-          <w:lang w:val="en-US"/>
-        </w:rPr>
-        <w:t xml:space="preserve">grant </w:t>
-      </w:r>
-      <w:r>
-        <w:rPr>
-          <w:lang w:val="en-US"/>
-        </w:rPr>
-        <w:t>'</w:t>
-      </w:r>
-      <w:proofErr w:type="spellStart"/>
-      <w:r>
-        <w:rPr>
-          <w:lang w:val="en-US"/>
-        </w:rPr>
-        <w:t>A</w:t>
-      </w:r>
-      <w:r>
-        <w:rPr>
-          <w:lang w:val="en-US"/>
-        </w:rPr>
-        <w:t>nalyste</w:t>
-      </w:r>
-      <w:proofErr w:type="spellEnd"/>
-      <w:r>
-        <w:rPr>
-          <w:lang w:val="en-US"/>
-        </w:rPr>
-        <w:t>'</w:t>
-      </w:r>
-      <w:r>
-        <w:rPr>
-          <w:lang w:val="en-US"/>
-        </w:rPr>
-        <w:t xml:space="preserve"> to </w:t>
+        <w:keepNext/>
+        <w:keepLines/>
+        <w:rPr>
+          <w:lang w:val="en-US"/>
+        </w:rPr>
+      </w:pPr>
+      <w:r>
+        <w:rPr>
+          <w:lang w:val="en-US"/>
+        </w:rPr>
+        <w:t>SET DEFAULT ROLE '</w:t>
+      </w:r>
+      <w:proofErr w:type="spellStart"/>
+      <w:r>
+        <w:rPr>
+          <w:lang w:val="en-US"/>
+        </w:rPr>
+        <w:t>Analyste</w:t>
+      </w:r>
+      <w:proofErr w:type="spellEnd"/>
+      <w:proofErr w:type="gramStart"/>
+      <w:r>
+        <w:rPr>
+          <w:lang w:val="en-US"/>
+        </w:rPr>
+        <w:t>'</w:t>
+      </w:r>
+      <w:r>
+        <w:rPr>
+          <w:lang w:val="en-US"/>
+        </w:rPr>
+        <w:t xml:space="preserve"> </w:t>
+      </w:r>
+      <w:r>
+        <w:rPr>
+          <w:lang w:val="en-US"/>
+        </w:rPr>
+        <w:t xml:space="preserve"> TO</w:t>
+      </w:r>
+      <w:proofErr w:type="gramEnd"/>
+      <w:r>
+        <w:rPr>
+          <w:lang w:val="en-US"/>
+        </w:rPr>
+        <w:t xml:space="preserve"> </w:t>
       </w:r>
       <w:r>
         <w:rPr>
@@ -5609,13 +6180,7 @@
         <w:rPr>
           <w:lang w:val="en-US"/>
         </w:rPr>
-        <w:t>@</w:t>
-      </w:r>
-      <w:r>
-        <w:rPr>
-          <w:lang w:val="en-US"/>
-        </w:rPr>
-        <w:t>'</w:t>
+        <w:t>@'</w:t>
       </w:r>
       <w:r>
         <w:rPr>
@@ -5623,20 +6188,12 @@
         </w:rPr>
         <w:t>localhost</w:t>
       </w:r>
-      <w:proofErr w:type="gramStart"/>
-      <w:r>
-        <w:rPr>
-          <w:lang w:val="en-US"/>
-        </w:rPr>
-        <w:t>'</w:t>
-      </w:r>
-      <w:r>
-        <w:rPr>
-          <w:lang w:val="en-US"/>
-        </w:rPr>
-        <w:t>;</w:t>
-      </w:r>
-      <w:proofErr w:type="gramEnd"/>
+      <w:r>
+        <w:rPr>
+          <w:lang w:val="en-US"/>
+        </w:rPr>
+        <w:t>';</w:t>
+      </w:r>
     </w:p>
     <w:p>
       <w:pPr>
@@ -5657,7 +6214,6 @@
         <w:rPr>
           <w:lang w:val="en-US"/>
         </w:rPr>
-        <w:lastRenderedPageBreak/>
         <w:t>Conclusion</w:t>
       </w:r>
       <w:bookmarkEnd w:id="4"/>

</xml_diff>